<commit_message>
Fix #ERROR! in ДЕТАЛИ: write formulas via setFormulas, convert text numbers in ВВОД
setValues parsed formula strings with the sheet locale (';' separators, decimal
comma), so ROUND(...,...) and 0.5 broke. Formulas now go through setFormulas,
which always uses English syntax. Numbers pasted into ВВОД as text are
converted to real numbers on recalculation so formulas don't read them as 0.

Co-Authored-By: Claude Opus 5.5 <noreply@anthropic.com>
Claude-Session: https://claude.ai/code/session_01GNzaMiF8ytaw7gqL3bRJFQ
</commit_message>
<xml_diff>
--- a/heating-report/Code_otoplenie.docx
+++ b/heating-report/Code_otoplenie.docx
@@ -1309,6 +1309,42 @@
         <w:br/>
         <w:t xml:space="preserve">  var values = sheet.getRange(INPUT_HEADER_ROW + 1, 1, lastRow - INPUT_HEADER_ROW, W).getValues();</w:t>
         <w:br/>
+        <w:t xml:space="preserve">  // Числа, вставленные текстом («134 902,91»), превращаем в настоящие числа — иначе формулы видят их как 0</w:t>
+        <w:br/>
+        <w:t xml:space="preserve">  var numCols = IN.GKAL_METER - IN.BILL + 1;</w:t>
+        <w:br/>
+        <w:t xml:space="preserve">  var changed = false;</w:t>
+        <w:br/>
+        <w:t xml:space="preserve">  var numeric = values.map(function (row) {</w:t>
+        <w:br/>
+        <w:t xml:space="preserve">    return row.slice(IN.BILL, IN.GKAL_METER + 1).map(function (v) {</w:t>
+        <w:br/>
+        <w:t xml:space="preserve">      if (typeof v !== 'string' || v.trim() === '') return v;</w:t>
+        <w:br/>
+        <w:t xml:space="preserve">      var n = parseNum_(v);</w:t>
+        <w:br/>
+        <w:t xml:space="preserve">      if (!n.ok || n.value === null) return v;</w:t>
+        <w:br/>
+        <w:t xml:space="preserve">      changed = true;</w:t>
+        <w:br/>
+        <w:t xml:space="preserve">      return n.value;</w:t>
+        <w:br/>
+        <w:t xml:space="preserve">    });</w:t>
+        <w:br/>
+        <w:t xml:space="preserve">  });</w:t>
+        <w:br/>
+        <w:t xml:space="preserve">  if (changed) {</w:t>
+        <w:br/>
+        <w:t xml:space="preserve">    sheet.getRange(INPUT_HEADER_ROW + 1, IN.BILL + 1, values.length, numCols).setValues(numeric);</w:t>
+        <w:br/>
+        <w:t xml:space="preserve">    values.forEach(function (row, k) {</w:t>
+        <w:br/>
+        <w:t xml:space="preserve">      for (var j = 0; j &lt; numCols; j++) row[IN.BILL + j] = numeric[k][j];</w:t>
+        <w:br/>
+        <w:t xml:space="preserve">    });</w:t>
+        <w:br/>
+        <w:t xml:space="preserve">  }</w:t>
+        <w:br/>
         <w:t xml:space="preserve">  var out = [];</w:t>
         <w:br/>
         <w:t xml:space="preserve">  for (var i = 0; i &lt; values.length; i++) {</w:t>
@@ -2176,6 +2212,8 @@
         <w:br/>
         <w:t xml:space="preserve">  result.overlimit.forEach(function (a, k) { olRowByObj[a.obj.name] = olHeaderRow + 1 + k; });</w:t>
         <w:br/>
+        <w:t xml:space="preserve">  var formulaRows = [];</w:t>
+        <w:br/>
         <w:br/>
         <w:t xml:space="preserve">  result.rows.forEach(function (c, k) {</w:t>
         <w:br/>
@@ -2183,7 +2221,9 @@
         <w:br/>
         <w:t xml:space="preserve">    var f = detailFormulas_(c, cfg, r, olRowByObj[c.objName]);</w:t>
         <w:br/>
-        <w:t xml:space="preserve">    rows.push(fitRow_(f || [</w:t>
+        <w:t xml:space="preserve">    formulaRows.push(f ? fitRow_(f, W).map(asFormula_) : null);</w:t>
+        <w:br/>
+        <w:t xml:space="preserve">    rows.push(fitRow_(f ? [] : [</w:t>
         <w:br/>
         <w:t xml:space="preserve">      c.month, c.objName, blank_(c.olFact), blank_(c.olAdd), blank_(c.base), blank_(c.norm), c.normSrc,</w:t>
         <w:br/>
@@ -2219,7 +2259,7 @@
         <w:br/>
         <w:t xml:space="preserve">    var r = olRowByObj[a.obj.name];</w:t>
         <w:br/>
-        <w:t xml:space="preserve">    rows.push(fitRow_([a.obj.name, a.plan, a.factTotal, a.seasonAmount, '=SUM(F' + r + ':J' + r + ')']</w:t>
+        <w:t xml:space="preserve">    rows.push(fitRow_([a.obj.name, a.plan, a.factTotal, a.seasonAmount, a.allocated]</w:t>
         <w:br/>
         <w:t xml:space="preserve">      .concat(a.adds.map(blank_)).concat([a.complete ? 'Да' : 'Нет', a.target || '', note.join('; ')]), W));</w:t>
         <w:br/>
@@ -2238,6 +2278,16 @@
         <w:br/>
         <w:t xml:space="preserve">  sheet.getRange(1, 1, rows.length, W).setValues(rows);</w:t>
         <w:br/>
+        <w:t xml:space="preserve">  // Формулы пишем через setFormulas: так Google читает их в английском синтаксисе (запятые, точка)</w:t>
+        <w:br/>
+        <w:t xml:space="preserve">  // при любой локали таблицы. Через setValues формула разбиралась бы по правилам локали и ломалась.</w:t>
+        <w:br/>
+        <w:t xml:space="preserve">  formulaRows.forEach(function (fr, k) {</w:t>
+        <w:br/>
+        <w:t xml:space="preserve">    if (fr) sheet.getRange(first + k, 1, 1, W).setFormulas([fr]);</w:t>
+        <w:br/>
+        <w:t xml:space="preserve">  });</w:t>
+        <w:br/>
         <w:t xml:space="preserve">  formatOutputHeader_(sheet, DETAILS_HEADER_ROW, W);</w:t>
         <w:br/>
         <w:br/>
@@ -2284,6 +2334,23 @@
         <w:t>}</w:t>
         <w:br/>
         <w:br/>
+        <w:t>/** Значение ячейки как формула для setFormulas: текст → ="текст", число → =число. */</w:t>
+        <w:br/>
+        <w:t>function asFormula_(v) {</w:t>
+        <w:br/>
+        <w:t xml:space="preserve">  if (v === '' || v === null || v === undefined) return '';</w:t>
+        <w:br/>
+        <w:t xml:space="preserve">  if (typeof v === 'number') return '=' + v;</w:t>
+        <w:br/>
+        <w:t xml:space="preserve">  var s = String(v);</w:t>
+        <w:br/>
+        <w:t xml:space="preserve">  if (s.charAt(0) === '=') return s;</w:t>
+        <w:br/>
+        <w:t xml:space="preserve">  return '="' + s.replace(/"/g, '""') + '"';</w:t>
+        <w:br/>
+        <w:t>}</w:t>
+        <w:br/>
+        <w:br/>
         <w:t>/** Ссылка на ячейку значения параметра на листе НАСТРОЙКИ, или null. */</w:t>
         <w:br/>
         <w:t>function settingRef_(cfg, key) {</w:t>
@@ -2411,7 +2478,7 @@
         <w:br/>
         <w:t xml:space="preserve">    '=P' + r + '-E' + r,</w:t>
         <w:br/>
-        <w:t xml:space="preserve">    '=' + S.tol + '+0.5*10^(-' + S.digitsArea + ')*(' + tolArea + V(IN.AREA_NO) + '+' + V(IN.AREA_SPCH) + ')+0.5*10^(-' +</w:t>
+        <w:t xml:space="preserve">    '=' + S.tol + '+(1/2)*10^(-' + S.digitsArea + ')*(' + tolArea + V(IN.AREA_NO) + '+' + V(IN.AREA_SPCH) + ')+(1/2)*10^(-' +</w:t>
         <w:br/>
         <w:t xml:space="preserve">      S.digitsPrice + ')*' + V(IN.GKAL_METER),</w:t>
         <w:br/>

</xml_diff>

<commit_message>
Use ';' as formula argument separator for decimal-comma locales in ДЕТАЛИ
Co-Authored-By: Claude Opus 5.5 <noreply@anthropic.com>
Claude-Session: https://claude.ai/code/session_01GNzaMiF8ytaw7gqL3bRJFQ
</commit_message>
<xml_diff>
--- a/heating-report/Code_otoplenie.docx
+++ b/heating-report/Code_otoplenie.docx
@@ -1290,6 +1290,8 @@
         <w:br/>
         <w:t xml:space="preserve">  writeReport_(ss.getSheetByName(SHEET_REPORT), cfg, result);</w:t>
         <w:br/>
+        <w:t xml:space="preserve">  cfg.formulaSep = formulaSeparator_(ss);</w:t>
+        <w:br/>
         <w:t xml:space="preserve">  writeDetails_(ss.getSheetByName(SHEET_DETAILS), cfg, result);</w:t>
         <w:br/>
         <w:t xml:space="preserve">  var bad = result.rows.filter(function (c) { return c.errors.length; }).length;</w:t>
@@ -2334,6 +2336,27 @@
         <w:t>}</w:t>
         <w:br/>
         <w:br/>
+        <w:t>/**</w:t>
+        <w:br/>
+        <w:t xml:space="preserve"> * Разделитель аргументов в формулах для локали таблицы: в русской, украинской и других локалях</w:t>
+        <w:br/>
+        <w:t xml:space="preserve"> * с десятичной запятой Google ждёт «;», в английской — «,».</w:t>
+        <w:br/>
+        <w:t xml:space="preserve"> */</w:t>
+        <w:br/>
+        <w:t>function formulaSeparator_(ss) {</w:t>
+        <w:br/>
+        <w:t xml:space="preserve">  var locale = String(ss.getSpreadsheetLocale() || '').toLowerCase();</w:t>
+        <w:br/>
+        <w:t xml:space="preserve">  var dotLocales = ['en', 'ja', 'zh', 'ko', 'th', 'he', 'iw', 'hi', 'ms', 'fil', 'ga', 'sw', 'ur', 'bn', 'ta', 'te'];</w:t>
+        <w:br/>
+        <w:t xml:space="preserve">  var lang = locale.split(/[_-]/)[0];</w:t>
+        <w:br/>
+        <w:t xml:space="preserve">  return dotLocales.indexOf(lang) &gt;= 0 ? ',' : ';';</w:t>
+        <w:br/>
+        <w:t>}</w:t>
+        <w:br/>
+        <w:br/>
         <w:t>/** Значение ячейки как формула для setFormulas: текст → ="текст", число → =число. */</w:t>
         <w:br/>
         <w:t>function asFormula_(v) {</w:t>
@@ -2392,6 +2415,8 @@
         <w:br/>
         <w:t xml:space="preserve">  var common = P.fsoMode === FSO_COMMON;</w:t>
         <w:br/>
+        <w:t xml:space="preserve">  var sep = cfg.formulaSep || ','; // разделитель аргументов: «;» для локалей с десятичной запятой</w:t>
+        <w:br/>
         <w:t xml:space="preserve">  var V = function (idx) { return "N('" + SHEET_INPUT + "'!" + indexToCol_(idx + 1) + c.rowNum + ')'; };</w:t>
         <w:br/>
         <w:t xml:space="preserve">  var share = '(1-' + S.fso + '-' + S.mzk + ')';</w:t>
@@ -2420,23 +2445,23 @@
         <w:br/>
         <w:t xml:space="preserve">  if (obj.type === TYPE_AREA) {</w:t>
         <w:br/>
-        <w:t xml:space="preserve">    tNo = '=ROUND(' + gasAmount + '/' + denom + ',' + S.digitsArea + ')';</w:t>
+        <w:t xml:space="preserve">    tNo = '=ROUND(' + gasAmount + '/' + denom + sep + S.digitsArea + ')';</w:t>
         <w:br/>
         <w:t xml:space="preserve">  } else {</w:t>
         <w:br/>
-        <w:t xml:space="preserve">    price = '=ROUND(' + gasAmount + '/(F' + r + '*' + share + '),' + S.digitsPrice + ')';</w:t>
+        <w:t xml:space="preserve">    price = '=ROUND(' + gasAmount + '/(F' + r + '*' + share + ')' + sep + S.digitsPrice + ')';</w:t>
         <w:br/>
         <w:t xml:space="preserve">    rest = '=F' + r + '*' + share + '-' + V(IN.GKAL_METER);</w:t>
         <w:br/>
         <w:t xml:space="preserve">    tNo = (c.areaNo || 0) + P.kSpch * (c.areaSpch || 0) &gt; 0</w:t>
         <w:br/>
-        <w:t xml:space="preserve">      ? '=ROUND(L' + r + '*' + gasAmount + '/(F' + r + '*' + share + ')/' + denom + ',' + S.digitsArea + ')'</w:t>
+        <w:t xml:space="preserve">      ? '=ROUND(L' + r + '*' + gasAmount + '/(F' + r + '*' + share + ')/' + denom + sep + S.digitsArea + ')'</w:t>
         <w:br/>
         <w:t xml:space="preserve">      : 0;</w:t>
         <w:br/>
         <w:t xml:space="preserve">  }</w:t>
         <w:br/>
-        <w:t xml:space="preserve">  var tCommon = common ? '=ROUND(H' + r + '/' + V(IN.AREA_TOTAL) + ',' + S.digitsArea + ')' : '';</w:t>
+        <w:t xml:space="preserve">  var tCommon = common ? '=ROUND(H' + r + '/' + V(IN.AREA_TOTAL) + sep + S.digitsArea + ')' : '';</w:t>
         <w:br/>
         <w:t xml:space="preserve">  var totalTerm = common ? '+N(I' + r + ')*' + V(IN.AREA_TOTAL) : '';</w:t>
         <w:br/>
@@ -2470,9 +2495,9 @@
         <w:br/>
         <w:t xml:space="preserve">    tNo,</w:t>
         <w:br/>
-        <w:t xml:space="preserve">    '=ROUND(M' + r + '*' + S.kSpch + ',' + S.digitsArea + ')',</w:t>
-        <w:br/>
-        <w:t xml:space="preserve">    '=ROUND(J' + r + '+N(I' + r + '),' + S.digitsArea + ')+M' + r,</w:t>
+        <w:t xml:space="preserve">    '=ROUND(M' + r + '*' + S.kSpch + sep + S.digitsArea + ')',</w:t>
+        <w:br/>
+        <w:t xml:space="preserve">    '=ROUND(J' + r + '+N(I' + r + ')' + sep + S.digitsArea + ')+M' + r,</w:t>
         <w:br/>
         <w:t xml:space="preserve">    '=N(K' + r + ')*' + V(IN.GKAL_METER) + '+M' + r + '*' + V(IN.AREA_NO) + '+N' + r + '*' + V(IN.AREA_SPCH) + totalTerm,</w:t>
         <w:br/>

</xml_diff>

<commit_message>
Split overlimit between metered and unmetered groups
Metered flats get one per-Gcal overlimit surcharge for the whole season, so the
Gcal price no longer spikes in months where meters take most of the norm.
Unmetered and СПЧ flats get their share spread by the receipt profile.
ДЕТАЛИ РАСЧЁТА shows the surcharge, the unmetered share and the base Gcal
price as separate columns; formulas and legend updated, tests extended.

Co-Authored-By: Claude Opus 5.5 <noreply@anthropic.com>
Claude-Session: https://claude.ai/code/session_01GNzaMiF8ytaw7gqL3bRJFQ
</commit_message>
<xml_diff>
--- a/heating-report/Code_otoplenie.docx
+++ b/heating-report/Code_otoplenie.docx
@@ -77,7 +77,11 @@
         <w:br/>
         <w:t>var FSO_COMMON = 'в содержание котельной';</w:t>
         <w:br/>
-        <w:t>var TARGET_RECEIPT = 'квитанции без счётчика';</w:t>
+        <w:t>var TARGET_SPLIT = 'раздельно: цена Гкал ровная, квитанция без счётчика по профилю';</w:t>
+        <w:br/>
+        <w:t>// Прежние значения параметров, которые при чтении заменяются на новые</w:t>
+        <w:br/>
+        <w:t>var LEGACY_PARAM_VALUES = { 'квитанции без счётчика': TARGET_SPLIT };</w:t>
         <w:br/>
         <w:t>var TARGET_BASE = 'базе распределения';</w:t>
         <w:br/>
@@ -173,6 +177,12 @@
         <w:br/>
         <w:t>var DETAILS_HEADER_ROW = 3;</w:t>
         <w:br/>
+        <w:t>// Колонки ДЕТАЛЕЙ, которые пишутся формулами: F (отнесённый сверхлимит) … U (допуск)</w:t>
+        <w:br/>
+        <w:t>var DETAIL_FORMULA_FIRST_COL = 6;</w:t>
+        <w:br/>
+        <w:t>var DETAIL_FORMULA_LAST_COL = 21;</w:t>
+        <w:br/>
         <w:t>var DETAILS_HEADERS = [</w:t>
         <w:br/>
         <w:t xml:space="preserve">  'Месяц потребления',</w:t>
@@ -181,7 +191,11 @@
         <w:br/>
         <w:t xml:space="preserve">  'Сверхлимит факт, грн',</w:t>
         <w:br/>
-        <w:t xml:space="preserve">  'Сверхлимит отнесённый, грн',</w:t>
+        <w:t xml:space="preserve">  'Надбавка сверхлимита к цене Гкал, грн/Гкал',</w:t>
+        <w:br/>
+        <w:t xml:space="preserve">  'Сверхлимит на квартиры без счётчиков и СПЧ, грн',</w:t>
+        <w:br/>
+        <w:t xml:space="preserve">  'Сверхлимит отнесённый на месяц, грн',</w:t>
         <w:br/>
         <w:t xml:space="preserve">  'База, грн',</w:t>
         <w:br/>
@@ -195,6 +209,8 @@
         <w:br/>
         <w:t xml:space="preserve">  'Содержание из сметы, грн/м²',</w:t>
         <w:br/>
+        <w:t xml:space="preserve">  'Цена Гкал без надбавки, грн',</w:t>
+        <w:br/>
         <w:t xml:space="preserve">  'Цена 1 Гкал, грн',</w:t>
         <w:br/>
         <w:t xml:space="preserve">  'Остаток Гкал',</w:t>
@@ -275,9 +291,9 @@
         <w:br/>
         <w:t xml:space="preserve">    note: '«профиль квитанции» · «суммы по месяцам» · «веса добавки»' },</w:t>
         <w:br/>
-        <w:t xml:space="preserve">  { key: 'profileTarget', label: 'Профиль сглаживания применять к', def: TARGET_RECEIPT, list: [TARGET_RECEIPT, TARGET_BASE],</w:t>
-        <w:br/>
-        <w:t xml:space="preserve">    note: '«квитанции без счётчика» — веса задают соотношение квитанций (содержание котельной + газ, грн/м²); «базе распределения» — соотношение сумм к распределению' },</w:t>
+        <w:t xml:space="preserve">  { key: 'profileTarget', label: 'Профиль сглаживания применять к', def: TARGET_SPLIT, list: [TARGET_SPLIT, TARGET_BASE],</w:t>
+        <w:br/>
+        <w:t xml:space="preserve">    note: '«раздельно»: счётчики — одинаковая надбавка на каждую Гкал сезона, без счётчика и СПЧ — квитанция (котельная + газ, грн/м²) по весам; «базе распределения» — веса задают соотношение сумм к распределению (как в ТЗ)' },</w:t>
         <w:br/>
         <w:t xml:space="preserve">  { key: 'kcal', label: 'Коэффициент калорийности газа, Гкал/м³', def: 0.008364,</w:t>
         <w:br/>
@@ -510,7 +526,13 @@
         <w:br/>
         <w:t xml:space="preserve">  for (var i = 0; i &lt; PARAMS.length; i++) {</w:t>
         <w:br/>
-        <w:t xml:space="preserve">    if (!parsed.paramsFound[PARAMS[i].key]) return false;</w:t>
+        <w:t xml:space="preserve">    var p = PARAMS[i];</w:t>
+        <w:br/>
+        <w:t xml:space="preserve">    if (!parsed.paramsFound[p.key]) return false;</w:t>
+        <w:br/>
+        <w:t xml:space="preserve">    // Значение из старого списка — пересобираем лист, чтобы обновился выпадающий список</w:t>
+        <w:br/>
+        <w:t xml:space="preserve">    if (p.list &amp;&amp; p.list.indexOf(String(parsed.paramsRaw[p.key]).trim()) &lt; 0) return false;</w:t>
         <w:br/>
         <w:t xml:space="preserve">  }</w:t>
         <w:br/>
@@ -612,7 +634,7 @@
         <w:br/>
         <w:t xml:space="preserve">    var p = PARAMS[i];</w:t>
         <w:br/>
-        <w:t xml:space="preserve">    var value = old &amp;&amp; old.paramsFound[p.key] ? old.paramsRaw[p.key] : p.def;</w:t>
+        <w:t xml:space="preserve">    var value = old &amp;&amp; old.paramsFound[p.key] ? old.params[p.key] : p.def;</w:t>
         <w:br/>
         <w:t xml:space="preserve">    rows.push(fitRow_([p.label, value, p.note], W));</w:t>
         <w:br/>
@@ -788,7 +810,7 @@
         <w:br/>
         <w:t xml:space="preserve">      res.paramsRow[p.key] = r + 1;</w:t>
         <w:br/>
-        <w:t xml:space="preserve">      res.params[p.key] = row[1];</w:t>
+        <w:t xml:space="preserve">      res.params[p.key] = LEGACY_PARAM_VALUES[String(row[1]).trim()] || row[1];</w:t>
         <w:br/>
         <w:t xml:space="preserve">    }</w:t>
         <w:br/>
@@ -1572,11 +1594,19 @@
         <w:br/>
         <w:t xml:space="preserve">    var alloc = allocateOverlimit_(list.map(function (c) {</w:t>
         <w:br/>
-        <w:t xml:space="preserve">      return { monthIdx: c.monthIdx, bill: c.bill, ol: c.olFact, slope: receiptSlope_(c, obj, cfg.params) };</w:t>
-        <w:br/>
-        <w:t xml:space="preserve">    }), obj.planValue, cfg, boilers);</w:t>
-        <w:br/>
-        <w:t xml:space="preserve">    list.forEach(function (c) { c.olAdd = alloc.adds[c.monthIdx]; });</w:t>
+        <w:t xml:space="preserve">      return { monthIdx: c.monthIdx, bill: c.bill, ol: c.olFact, geom: rowGeom_(c, obj, cfg.params) };</w:t>
+        <w:br/>
+        <w:t xml:space="preserve">    }), obj.planValue, cfg, boilers, obj.type);</w:t>
+        <w:br/>
+        <w:t xml:space="preserve">    list.forEach(function (c) {</w:t>
+        <w:br/>
+        <w:t xml:space="preserve">      c.olAdd = alloc.adds[c.monthIdx];</w:t>
+        <w:br/>
+        <w:t xml:space="preserve">      c.olSurcharge = alloc.surcharge[c.monthIdx];</w:t>
+        <w:br/>
+        <w:t xml:space="preserve">      c.olNoMeter = alloc.addNo[c.monthIdx];</w:t>
+        <w:br/>
+        <w:t xml:space="preserve">    });</w:t>
         <w:br/>
         <w:t xml:space="preserve">    alloc.obj = obj;</w:t>
         <w:br/>
@@ -1619,7 +1649,7 @@
         <w:br/>
         <w:t xml:space="preserve">    rowNum: rowNum, errors: [], month: '', monthIdx: -1, receipt: '', objName: '', obj: null, order: 9999,</w:t>
         <w:br/>
-        <w:t xml:space="preserve">    bill: null, olFact: null, olAdd: null, gas: null, gkalHouse: null, areaTotal: null, areaMeter: null,</w:t>
+        <w:t xml:space="preserve">    bill: null, olFact: null, olAdd: null, olSurcharge: null, olNoMeter: null, priceBase: null, gas: null, gkalHouse: null, areaTotal: null, areaMeter: null,</w:t>
         <w:br/>
         <w:t xml:space="preserve">    areaSpch: null, areaNo: null, gkalMeter: null,</w:t>
         <w:br/>
@@ -1636,27 +1666,39 @@
         <w:br/>
         <w:t xml:space="preserve"> * Разнесение сверхлимита по месяцам одного ЖК.</w:t>
         <w:br/>
-        <w:t xml:space="preserve"> * entries: [{monthIdx, bill, ol}] — только введённые месяцы.</w:t>
-        <w:br/>
-        <w:t xml:space="preserve"> * Возвращает adds[5] (null для невведённых месяцев) и сводку для сверки.</w:t>
+        <w:t xml:space="preserve"> * entries: [{monthIdx, bill, ol, geom}] — только введённые месяцы; geom — из rowGeom_.</w:t>
+        <w:br/>
+        <w:t xml:space="preserve"> * Возвращает по месяцам (null для невведённых):</w:t>
+        <w:br/>
+        <w:t xml:space="preserve"> *   adds      — сверхлимит, отнесённый на месяц, грн (добавка к базе);</w:t>
+        <w:br/>
+        <w:t xml:space="preserve"> *   surcharge — надбавка к цене Гкал для счётчиков, грн/Гкал (для учёта по м² — null);</w:t>
+        <w:br/>
+        <w:t xml:space="preserve"> *   addNo     — часть сверхлимита на квартиры без счётчиков и СПЧ, в деньгах газовой части.</w:t>
         <w:br/>
         <w:t xml:space="preserve"> */</w:t>
         <w:br/>
-        <w:t>function allocateOverlimit_(entries, plan, cfg, boilers) {</w:t>
+        <w:t>function allocateOverlimit_(entries, plan, cfg, boilers, objType) {</w:t>
         <w:br/>
         <w:t xml:space="preserve">  var n = SEASON_MONTHS.length;</w:t>
         <w:br/>
         <w:t xml:space="preserve">  var P = cfg.params;</w:t>
         <w:br/>
+        <w:t xml:space="preserve">  var share = 1 - P.fso - P.mzk;</w:t>
+        <w:br/>
+        <w:t xml:space="preserve">  var common = P.fsoMode === FSO_COMMON;</w:t>
+        <w:br/>
+        <w:t xml:space="preserve">  var g = common ? share : 1; // доля базы, которая идёт в газовые тарифы</w:t>
+        <w:br/>
         <w:t xml:space="preserve">  var base0 = [];</w:t>
         <w:br/>
         <w:t xml:space="preserve">  var fact = [];</w:t>
         <w:br/>
-        <w:t xml:space="preserve">  var slope = [];</w:t>
+        <w:t xml:space="preserve">  var geom = [];</w:t>
         <w:br/>
         <w:t xml:space="preserve">  var i;</w:t>
         <w:br/>
-        <w:t xml:space="preserve">  for (i = 0; i &lt; n; i++) { base0.push(null); fact.push(0); slope.push(null); }</w:t>
+        <w:t xml:space="preserve">  for (i = 0; i &lt; n; i++) { base0.push(null); fact.push(0); geom.push(null); }</w:t>
         <w:br/>
         <w:t xml:space="preserve">  var factTotal = 0;</w:t>
         <w:br/>
@@ -1664,10 +1706,10 @@
         <w:br/>
         <w:t xml:space="preserve">    base0[e.monthIdx] = e.bill - e.ol;</w:t>
         <w:br/>
-        <w:t xml:space="preserve">    slope[e.monthIdx] = e.slope &gt; 0 ? e.slope : null;</w:t>
-        <w:br/>
         <w:t xml:space="preserve">    fact[e.monthIdx] = e.ol;</w:t>
         <w:br/>
+        <w:t xml:space="preserve">    geom[e.monthIdx] = e.geom || null;</w:t>
+        <w:br/>
         <w:t xml:space="preserve">    factTotal += e.ol;</w:t>
         <w:br/>
         <w:t xml:space="preserve">  });</w:t>
@@ -1686,6 +1728,8 @@
         <w:br/>
         <w:t xml:space="preserve">  var fallback = false;</w:t>
         <w:br/>
+        <w:t xml:space="preserve">  var split = null;</w:t>
+        <w:br/>
         <w:br/>
         <w:t xml:space="preserve">  var full = [];</w:t>
         <w:br/>
@@ -1718,817 +1762,1042 @@
         <w:br/>
         <w:t xml:space="preserve">    for (i = 0; i &lt; n; i++) if (b[i] === null) b[i] = 0;</w:t>
         <w:br/>
-        <w:t xml:space="preserve">    var byReceipt = P.profileTarget !== TARGET_BASE &amp;&amp; entered.length &gt; 0;</w:t>
-        <w:br/>
-        <w:t xml:space="preserve">    entered.forEach(function (k) { if (slope[k] === null) byReceipt = false; });</w:t>
-        <w:br/>
-        <w:t xml:space="preserve">    if (byReceipt) {</w:t>
-        <w:br/>
-        <w:t xml:space="preserve">      // Квитанция без счётчика, грн/м² = содержание котельной + slope × база.</w:t>
-        <w:br/>
-        <w:t xml:space="preserve">      // Хотим квитанция(i) = вес(i) × u  =&gt;  добавка(i) = вес(i)/slope(i) × u − (котельная(i)/slope(i) + база0(i))</w:t>
-        <w:br/>
-        <w:t xml:space="preserve">      var avgSlope = 0;</w:t>
-        <w:br/>
-        <w:t xml:space="preserve">      entered.forEach(function (k) { avgSlope += slope[k] / entered.length; });</w:t>
-        <w:br/>
-        <w:t xml:space="preserve">      var a = [];</w:t>
-        <w:br/>
-        <w:t xml:space="preserve">      var c0 = [];</w:t>
-        <w:br/>
-        <w:t xml:space="preserve">      for (i = 0; i &lt; n; i++) {</w:t>
-        <w:br/>
-        <w:t xml:space="preserve">        var m = slope[i] !== null ? slope[i] : avgSlope;</w:t>
-        <w:br/>
-        <w:t xml:space="preserve">        var boil = boilers ? boilers[i] || 0 : 0;</w:t>
-        <w:br/>
-        <w:t xml:space="preserve">        a.push(cfg.weights[i] / m);</w:t>
-        <w:br/>
-        <w:t xml:space="preserve">        c0.push(boil / m + b[i]);</w:t>
+        <w:t xml:space="preserve">    var geomOk = entered.length &gt; 0;</w:t>
+        <w:br/>
+        <w:t xml:space="preserve">    entered.forEach(function (k) { if (!geom[k] || !geom[k].ok) geomOk = false; });</w:t>
+        <w:br/>
+        <w:t xml:space="preserve">    if (P.profileTarget !== TARGET_BASE &amp;&amp; geomOk) {</w:t>
+        <w:br/>
+        <w:t xml:space="preserve">      split = splitAllocation_(b, geom, entered, boilers, cfg, seasonAmount, objType, g);</w:t>
+        <w:br/>
+        <w:t xml:space="preserve">      full = split.adds;</w:t>
+        <w:br/>
+        <w:t xml:space="preserve">      target = TARGET_SPLIT;</w:t>
+        <w:br/>
+        <w:t xml:space="preserve">    } else {</w:t>
+        <w:br/>
+        <w:t xml:space="preserve">      full = profileAdditions_(b, cfg.weights, seasonAmount);</w:t>
+        <w:br/>
+        <w:t xml:space="preserve">      target = TARGET_BASE;</w:t>
+        <w:br/>
+        <w:t xml:space="preserve">      if (P.profileTarget !== TARGET_BASE &amp;&amp; entered.length) fallback = true;</w:t>
+        <w:br/>
+        <w:t xml:space="preserve">    }</w:t>
+        <w:br/>
+        <w:t xml:space="preserve">  } else if (P.mode === MODE_WEIGHTS) {</w:t>
+        <w:br/>
+        <w:t xml:space="preserve">    var swAll = 0;</w:t>
+        <w:br/>
+        <w:t xml:space="preserve">    for (i = 0; i &lt; n; i++) swAll += cfg.weights[i];</w:t>
+        <w:br/>
+        <w:t xml:space="preserve">    for (i = 0; i &lt; n; i++) full[i] = swAll &gt; 0 ? seasonAmount * cfg.weights[i] / swAll : 0;</w:t>
+        <w:br/>
+        <w:t xml:space="preserve">  } else {</w:t>
+        <w:br/>
+        <w:t xml:space="preserve">    for (i = 0; i &lt; n; i++) full[i] = cfg.sums[i] || 0;</w:t>
+        <w:br/>
+        <w:t xml:space="preserve">  }</w:t>
+        <w:br/>
+        <w:br/>
+        <w:t xml:space="preserve">  var adds = [];</w:t>
+        <w:br/>
+        <w:t xml:space="preserve">  var surcharge = [];</w:t>
+        <w:br/>
+        <w:t xml:space="preserve">  var addNo = [];</w:t>
+        <w:br/>
+        <w:t xml:space="preserve">  for (i = 0; i &lt; n; i++) {</w:t>
+        <w:br/>
+        <w:t xml:space="preserve">    adds.push(base0[i] === null ? null : full[i]);</w:t>
+        <w:br/>
+        <w:t xml:space="preserve">    surcharge.push(base0[i] === null ? null : (split ? split.surcharge[i] : null));</w:t>
+        <w:br/>
+        <w:t xml:space="preserve">    addNo.push(base0[i] === null ? null : (split ? split.addNo[i] : null));</w:t>
+        <w:br/>
+        <w:t xml:space="preserve">  }</w:t>
+        <w:br/>
+        <w:br/>
+        <w:t xml:space="preserve">  var trueUp = false;</w:t>
+        <w:br/>
+        <w:t xml:space="preserve">  if (P.trueUp === 'Да' &amp;&amp; complete) {</w:t>
+        <w:br/>
+        <w:t xml:space="preserve">    var before = 0;</w:t>
+        <w:br/>
+        <w:t xml:space="preserve">    for (i = 0; i &lt; n - 1; i++) if (adds[i] !== null) before += adds[i];</w:t>
+        <w:br/>
+        <w:t xml:space="preserve">    var residual = factTotal - before - adds[n - 1];</w:t>
+        <w:br/>
+        <w:t xml:space="preserve">    adds[n - 1] += residual;</w:t>
+        <w:br/>
+        <w:t xml:space="preserve">    if (split) addNo[n - 1] += g * residual; // остаток округлений — на квартиры без счётчиков</w:t>
+        <w:br/>
+        <w:t xml:space="preserve">    trueUp = true;</w:t>
+        <w:br/>
+        <w:t xml:space="preserve">  }</w:t>
+        <w:br/>
+        <w:t xml:space="preserve">  if (!split) {</w:t>
+        <w:br/>
+        <w:t xml:space="preserve">    // Одна цена Гкал на месяц: надбавка = добавка ÷ индивидуальные Гкал, доля без счётчиков — по остатку Гкал</w:t>
+        <w:br/>
+        <w:t xml:space="preserve">    for (i = 0; i &lt; n; i++) {</w:t>
+        <w:br/>
+        <w:t xml:space="preserve">      if (adds[i] === null) continue;</w:t>
+        <w:br/>
+        <w:t xml:space="preserve">      var gm = geom[i];</w:t>
+        <w:br/>
+        <w:t xml:space="preserve">      if (objType !== TYPE_AREA &amp;&amp; gm &amp;&amp; gm.indiv &gt; 0) {</w:t>
+        <w:br/>
+        <w:t xml:space="preserve">        surcharge[i] = g * adds[i] / gm.indiv;</w:t>
+        <w:br/>
+        <w:t xml:space="preserve">        addNo[i] = surcharge[i] * gm.rest;</w:t>
+        <w:br/>
+        <w:t xml:space="preserve">      } else {</w:t>
+        <w:br/>
+        <w:t xml:space="preserve">        surcharge[i] = null;</w:t>
+        <w:br/>
+        <w:t xml:space="preserve">        addNo[i] = g * adds[i];</w:t>
         <w:br/>
         <w:t xml:space="preserve">      }</w:t>
         <w:br/>
-        <w:t xml:space="preserve">      full = fillAdditions_(a, c0, seasonAmount);</w:t>
-        <w:br/>
-        <w:t xml:space="preserve">      target = TARGET_RECEIPT;</w:t>
+        <w:t xml:space="preserve">    }</w:t>
+        <w:br/>
+        <w:t xml:space="preserve">  }</w:t>
+        <w:br/>
+        <w:t xml:space="preserve">  var allocated = 0;</w:t>
+        <w:br/>
+        <w:t xml:space="preserve">  for (i = 0; i &lt; n; i++) if (adds[i] !== null) allocated += adds[i];</w:t>
+        <w:br/>
+        <w:br/>
+        <w:t xml:space="preserve">  return {</w:t>
+        <w:br/>
+        <w:t xml:space="preserve">    adds: adds, surcharge: surcharge, addNo: addNo, fact: fact, factTotal: factTotal, plan: plan || 0,</w:t>
+        <w:br/>
+        <w:t xml:space="preserve">    seasonAmount: seasonAmount, allocated: allocated, complete: complete, estimated: estimated, trueUp: trueUp,</w:t>
+        <w:br/>
+        <w:t xml:space="preserve">    entered: entered.length, target: target, fallback: fallback,</w:t>
+        <w:br/>
+        <w:t xml:space="preserve">    flatSurcharge: split &amp;&amp; objType !== TYPE_AREA ? split.flat : null</w:t>
+        <w:br/>
+        <w:t xml:space="preserve">  };</w:t>
+        <w:br/>
+        <w:t>}</w:t>
+        <w:br/>
+        <w:br/>
+        <w:t>/** Добавки, при которых итоговые базы пропорциональны весам (профиль по базе). */</w:t>
+        <w:br/>
+        <w:t>function profileAdditions_(base0, weights, amount) {</w:t>
+        <w:br/>
+        <w:t xml:space="preserve">  return fillAdditions_(weights, base0, amount);</w:t>
+        <w:br/>
+        <w:t>}</w:t>
+        <w:br/>
+        <w:br/>
+        <w:t>/**</w:t>
+        <w:br/>
+        <w:t xml:space="preserve"> * Общий подбор добавок: добавка(i) = a(i) × u − b(i), сумма добавок = amount, все добавки ≥ 0.</w:t>
+        <w:br/>
+        <w:t xml:space="preserve"> * Месяцы с отрицательной добавкой получают 0 и исключаются; повторяем, пока все добавки ≥ 0.</w:t>
+        <w:br/>
+        <w:t xml:space="preserve"> */</w:t>
+        <w:br/>
+        <w:t>function fillAdditions_(a, b, amount) {</w:t>
+        <w:br/>
+        <w:t xml:space="preserve">  var n = a.length;</w:t>
+        <w:br/>
+        <w:t xml:space="preserve">  var adds = [];</w:t>
+        <w:br/>
+        <w:t xml:space="preserve">  var active = [];</w:t>
+        <w:br/>
+        <w:t xml:space="preserve">  var i;</w:t>
+        <w:br/>
+        <w:t xml:space="preserve">  for (i = 0; i &lt; n; i++) { adds.push(0); active.push(a[i] &gt; 0); }</w:t>
+        <w:br/>
+        <w:t xml:space="preserve">  for (var iter = 0; iter &lt;= n; iter++) {</w:t>
+        <w:br/>
+        <w:t xml:space="preserve">    var sa = 0;</w:t>
+        <w:br/>
+        <w:t xml:space="preserve">    var sb = 0;</w:t>
+        <w:br/>
+        <w:t xml:space="preserve">    for (i = 0; i &lt; n; i++) if (active[i]) { sa += a[i]; sb += b[i]; }</w:t>
+        <w:br/>
+        <w:t xml:space="preserve">    if (sa &lt;= 0) break;</w:t>
+        <w:br/>
+        <w:t xml:space="preserve">    var u = (sb + amount) / sa;</w:t>
+        <w:br/>
+        <w:t xml:space="preserve">    var excluded = false;</w:t>
+        <w:br/>
+        <w:t xml:space="preserve">    for (i = 0; i &lt; n; i++) {</w:t>
+        <w:br/>
+        <w:t xml:space="preserve">      if (active[i] &amp;&amp; a[i] * u - b[i] &lt; 0) { active[i] = false; excluded = true; }</w:t>
+        <w:br/>
+        <w:t xml:space="preserve">    }</w:t>
+        <w:br/>
+        <w:t xml:space="preserve">    if (!excluded) {</w:t>
+        <w:br/>
+        <w:t xml:space="preserve">      for (i = 0; i &lt; n; i++) adds[i] = active[i] ? a[i] * u - b[i] : 0;</w:t>
+        <w:br/>
+        <w:t xml:space="preserve">      break;</w:t>
+        <w:br/>
+        <w:t xml:space="preserve">    }</w:t>
+        <w:br/>
+        <w:t xml:space="preserve">  }</w:t>
+        <w:br/>
+        <w:t xml:space="preserve">  return adds;</w:t>
+        <w:br/>
+        <w:t>}</w:t>
+        <w:br/>
+        <w:br/>
+        <w:t>/**</w:t>
+        <w:br/>
+        <w:t xml:space="preserve"> * Раздельное сглаживание (профиль квитанции).</w:t>
+        <w:br/>
+        <w:t xml:space="preserve"> * Счётчики: весь сезон одна надбавка на Гкал = сверхлимит × доля газа ÷ все индивидуальные Гкал сезона.</w:t>
+        <w:br/>
+        <w:t xml:space="preserve"> * Без счётчиков и СПЧ: их доля сверхлимита (надбавка × остаток Гкал сезона) раскладывается так, чтобы</w:t>
+        <w:br/>
+        <w:t xml:space="preserve"> * квитанция без счётчика (котельная + газ, грн/м²) шла по весам профиля. Для учёта по м² — только второе.</w:t>
+        <w:br/>
+        <w:t xml:space="preserve"> * Невведённые месяцы оцениваются по средним введённых.</w:t>
+        <w:br/>
+        <w:t xml:space="preserve"> */</w:t>
+        <w:br/>
+        <w:t>function splitAllocation_(b0, geom, entered, boilers, cfg, amount, objType, g) {</w:t>
+        <w:br/>
+        <w:t xml:space="preserve">  var n = b0.length;</w:t>
+        <w:br/>
+        <w:t xml:space="preserve">  var P = cfg.params;</w:t>
+        <w:br/>
+        <w:t xml:space="preserve">  var common = P.fsoMode === FSO_COMMON;</w:t>
+        <w:br/>
+        <w:t xml:space="preserve">  var fm = P.fso + P.mzk;</w:t>
+        <w:br/>
+        <w:t xml:space="preserve">  var i;</w:t>
+        <w:br/>
+        <w:t xml:space="preserve">  var avg = { indivPerW: 0, restShare: 0, denom: 0, total: 0, p0: 0 };</w:t>
+        <w:br/>
+        <w:t xml:space="preserve">  entered.forEach(function (k) {</w:t>
+        <w:br/>
+        <w:t xml:space="preserve">    var gm = geom[k];</w:t>
+        <w:br/>
+        <w:t xml:space="preserve">    var e = entered.length;</w:t>
+        <w:br/>
+        <w:t xml:space="preserve">    if (objType !== TYPE_AREA) {</w:t>
+        <w:br/>
+        <w:t xml:space="preserve">      avg.indivPerW += (cfg.weights[k] &gt; 0 ? gm.indiv / cfg.weights[k] : gm.indiv) / e;</w:t>
+        <w:br/>
+        <w:t xml:space="preserve">      avg.restShare += gm.rest / gm.indiv / e;</w:t>
+        <w:br/>
+        <w:t xml:space="preserve">      avg.p0 += g * b0[k] / gm.indiv / e;</w:t>
+        <w:br/>
+        <w:t xml:space="preserve">    }</w:t>
+        <w:br/>
+        <w:t xml:space="preserve">    avg.denom += gm.denom / e;</w:t>
+        <w:br/>
+        <w:t xml:space="preserve">    avg.total += gm.total / e;</w:t>
+        <w:br/>
+        <w:t xml:space="preserve">  });</w:t>
+        <w:br/>
+        <w:t xml:space="preserve">  var G = [];</w:t>
+        <w:br/>
+        <w:t xml:space="preserve">  for (i = 0; i &lt; n; i++) {</w:t>
+        <w:br/>
+        <w:t xml:space="preserve">    if (geom[i] &amp;&amp; geom[i].ok) {</w:t>
+        <w:br/>
+        <w:t xml:space="preserve">      G.push(geom[i]);</w:t>
         <w:br/>
         <w:t xml:space="preserve">    } else {</w:t>
         <w:br/>
-        <w:t xml:space="preserve">      full = profileAdditions_(b, cfg.weights, seasonAmount);</w:t>
-        <w:br/>
-        <w:t xml:space="preserve">      target = TARGET_BASE;</w:t>
-        <w:br/>
-        <w:t xml:space="preserve">      if (P.profileTarget !== TARGET_BASE &amp;&amp; entered.length) fallback = true;</w:t>
+        <w:t xml:space="preserve">      var indiv = cfg.weights[i] * avg.indivPerW;</w:t>
+        <w:br/>
+        <w:t xml:space="preserve">      G.push({ ok: true, indiv: indiv, rest: indiv * avg.restShare, gk: indiv * (1 - avg.restShare),</w:t>
+        <w:br/>
+        <w:t xml:space="preserve">        denom: avg.denom, total: avg.total });</w:t>
         <w:br/>
         <w:t xml:space="preserve">    }</w:t>
         <w:br/>
-        <w:t xml:space="preserve">  } else if (P.mode === MODE_WEIGHTS) {</w:t>
-        <w:br/>
-        <w:t xml:space="preserve">    var swAll = 0;</w:t>
-        <w:br/>
-        <w:t xml:space="preserve">    for (i = 0; i &lt; n; i++) swAll += cfg.weights[i];</w:t>
-        <w:br/>
-        <w:t xml:space="preserve">    for (i = 0; i &lt; n; i++) full[i] = swAll &gt; 0 ? seasonAmount * cfg.weights[i] / swAll : 0;</w:t>
+        <w:t xml:space="preserve">  }</w:t>
+        <w:br/>
+        <w:t xml:space="preserve">  var boil = function (k) { return boilers ? boilers[k] || 0 : 0; };</w:t>
+        <w:br/>
+        <w:br/>
+        <w:t xml:space="preserve">  var flat = 0;</w:t>
+        <w:br/>
+        <w:t xml:space="preserve">  var noAmount = g * amount;</w:t>
+        <w:br/>
+        <w:t xml:space="preserve">  var p0 = [];</w:t>
+        <w:br/>
+        <w:t xml:space="preserve">  if (objType !== TYPE_AREA) {</w:t>
+        <w:br/>
+        <w:t xml:space="preserve">    var sumIndiv = 0;</w:t>
+        <w:br/>
+        <w:t xml:space="preserve">    var sumRest = 0;</w:t>
+        <w:br/>
+        <w:t xml:space="preserve">    for (i = 0; i &lt; n; i++) { sumIndiv += G[i].indiv; sumRest += G[i].rest; }</w:t>
+        <w:br/>
+        <w:t xml:space="preserve">    flat = sumIndiv &gt; 0 ? g * amount / sumIndiv : 0;</w:t>
+        <w:br/>
+        <w:t xml:space="preserve">    noAmount = flat * sumRest;</w:t>
+        <w:br/>
+        <w:t xml:space="preserve">    for (i = 0; i &lt; n; i++) p0.push(G[i].indiv &gt; 0 ? g * b0[i] / G[i].indiv : avg.p0);</w:t>
+        <w:br/>
+        <w:t xml:space="preserve">  }</w:t>
+        <w:br/>
+        <w:t xml:space="preserve">  // Квитанция без счётчика = c(i) + m(i) × добавка_без_счётчиков(i)</w:t>
+        <w:br/>
+        <w:t xml:space="preserve">  var a = [];</w:t>
+        <w:br/>
+        <w:t xml:space="preserve">  var c0 = [];</w:t>
+        <w:br/>
+        <w:t xml:space="preserve">  for (i = 0; i &lt; n; i++) {</w:t>
+        <w:br/>
+        <w:t xml:space="preserve">    var gm2 = G[i];</w:t>
+        <w:br/>
+        <w:t xml:space="preserve">    var m = 1 / gm2.denom + (common ? fm / (g * gm2.total) : 0);</w:t>
+        <w:br/>
+        <w:t xml:space="preserve">    var gasNoMeter;</w:t>
+        <w:br/>
+        <w:t xml:space="preserve">    var gasAll;</w:t>
+        <w:br/>
+        <w:t xml:space="preserve">    if (objType === TYPE_AREA) {</w:t>
+        <w:br/>
+        <w:t xml:space="preserve">      gasNoMeter = g * b0[i];</w:t>
+        <w:br/>
+        <w:t xml:space="preserve">      gasAll = gasNoMeter;</w:t>
+        <w:br/>
+        <w:t xml:space="preserve">    } else {</w:t>
+        <w:br/>
+        <w:t xml:space="preserve">      gasNoMeter = p0[i] * gm2.rest;</w:t>
+        <w:br/>
+        <w:t xml:space="preserve">      gasAll = (p0[i] + flat) * gm2.gk + gasNoMeter;</w:t>
+        <w:br/>
+        <w:t xml:space="preserve">    }</w:t>
+        <w:br/>
+        <w:t xml:space="preserve">    var c = boil(i) + gasNoMeter / gm2.denom + (common ? gasAll / g * fm / gm2.total : 0);</w:t>
+        <w:br/>
+        <w:t xml:space="preserve">    a.push(cfg.weights[i] / m);</w:t>
+        <w:br/>
+        <w:t xml:space="preserve">    c0.push(c / m);</w:t>
+        <w:br/>
+        <w:t xml:space="preserve">  }</w:t>
+        <w:br/>
+        <w:t xml:space="preserve">  var addNo = fillAdditions_(a, c0, noAmount);</w:t>
+        <w:br/>
+        <w:t xml:space="preserve">  var adds = [];</w:t>
+        <w:br/>
+        <w:t xml:space="preserve">  var surcharge = [];</w:t>
+        <w:br/>
+        <w:t xml:space="preserve">  for (i = 0; i &lt; n; i++) {</w:t>
+        <w:br/>
+        <w:t xml:space="preserve">    surcharge.push(objType === TYPE_AREA ? null : flat);</w:t>
+        <w:br/>
+        <w:t xml:space="preserve">    adds.push(((objType === TYPE_AREA ? 0 : flat * G[i].gk) + addNo[i]) / g);</w:t>
+        <w:br/>
+        <w:t xml:space="preserve">  }</w:t>
+        <w:br/>
+        <w:t xml:space="preserve">  return { adds: adds, surcharge: surcharge, addNo: addNo, flat: flat };</w:t>
+        <w:br/>
+        <w:t>}</w:t>
+        <w:br/>
+        <w:br/>
+        <w:t>/**</w:t>
+        <w:br/>
+        <w:t xml:space="preserve"> * Геометрия строки для разнесения сверхлимита: индивидуальные Гкал, Гкал по счётчикам, остаток,</w:t>
+        <w:br/>
+        <w:t xml:space="preserve"> * знаменатель тарифа без счётчика, площадь итого. ok=false, если по строке считать нельзя.</w:t>
+        <w:br/>
+        <w:t xml:space="preserve"> */</w:t>
+        <w:br/>
+        <w:t>function rowGeom_(c, obj, P) {</w:t>
+        <w:br/>
+        <w:t xml:space="preserve">  var share = 1 - P.fso - P.mzk;</w:t>
+        <w:br/>
+        <w:t xml:space="preserve">  var spch = c.areaSpch || 0;</w:t>
+        <w:br/>
+        <w:t xml:space="preserve">  var no = c.areaNo || 0;</w:t>
+        <w:br/>
+        <w:t xml:space="preserve">  var denom = no + P.kSpch * spch;</w:t>
+        <w:br/>
+        <w:t xml:space="preserve">  var res = { ok: false, indiv: 0, rest: 0, gk: c.gkalMeter || 0, denom: denom, total: c.areaTotal || 0 };</w:t>
+        <w:br/>
+        <w:t xml:space="preserve">  if (!(denom &gt; 0) || !(res.total &gt; 0)) return res;</w:t>
+        <w:br/>
+        <w:t xml:space="preserve">  if (obj.type === TYPE_AREA) {</w:t>
+        <w:br/>
+        <w:t xml:space="preserve">    res.ok = true;</w:t>
+        <w:br/>
+        <w:t xml:space="preserve">    return res;</w:t>
+        <w:br/>
+        <w:t xml:space="preserve">  }</w:t>
+        <w:br/>
+        <w:t xml:space="preserve">  var norm = c.gas &gt; 0 ? c.gas * P.kcal : (c.gkalHouse &gt; 0 ? c.gkalHouse : 0);</w:t>
+        <w:br/>
+        <w:t xml:space="preserve">  if (!(norm &gt; 0)) return res;</w:t>
+        <w:br/>
+        <w:t xml:space="preserve">  res.indiv = norm * share;</w:t>
+        <w:br/>
+        <w:t xml:space="preserve">  res.rest = res.indiv - res.gk;</w:t>
+        <w:br/>
+        <w:t xml:space="preserve">  res.ok = res.rest &gt;= 0;</w:t>
+        <w:br/>
+        <w:t xml:space="preserve">  return res;</w:t>
+        <w:br/>
+        <w:t>}</w:t>
+        <w:br/>
+        <w:br/>
+        <w:t>/** Тарифы одной строки ЖК × месяц. Ошибки складываются в c.errors. */</w:t>
+        <w:br/>
+        <w:t>function calcTariffs_(c, obj, cfg, boilerFn) {</w:t>
+        <w:br/>
+        <w:t xml:space="preserve">  var P = cfg.params;</w:t>
+        <w:br/>
+        <w:t xml:space="preserve">  var dA = P.digitsArea;</w:t>
+        <w:br/>
+        <w:t xml:space="preserve">  var dP = P.digitsPrice;</w:t>
+        <w:br/>
+        <w:t xml:space="preserve">  var share = 1 - P.fso - P.mzk;</w:t>
+        <w:br/>
+        <w:br/>
+        <w:t xml:space="preserve">  var baseNoOl = c.bill - c.olFact; // счёт без сверхлимита</w:t>
+        <w:br/>
+        <w:t xml:space="preserve">  c.base = baseNoOl + (c.olAdd || 0);</w:t>
+        <w:br/>
+        <w:t xml:space="preserve">  if (!(c.base &gt; 0)) c.errors.push('база распределения ≤ 0');</w:t>
+        <w:br/>
+        <w:br/>
+        <w:t xml:space="preserve">  var total = c.areaTotal;</w:t>
+        <w:br/>
+        <w:t xml:space="preserve">  var meter = c.areaMeter || 0;</w:t>
+        <w:br/>
+        <w:t xml:space="preserve">  var spch = c.areaSpch || 0;</w:t>
+        <w:br/>
+        <w:t xml:space="preserve">  var no = c.areaNo || 0;</w:t>
+        <w:br/>
+        <w:t xml:space="preserve">  var gkalMeter = c.gkalMeter || 0;</w:t>
+        <w:br/>
+        <w:t xml:space="preserve">  if (!(total &gt; 0)) {</w:t>
+        <w:br/>
+        <w:t xml:space="preserve">    c.errors.push('не указана площадь отапливаемая итого');</w:t>
+        <w:br/>
+        <w:t xml:space="preserve">  } else if (Math.abs(meter + spch + no - total) &gt; P.tolArea) {</w:t>
+        <w:br/>
+        <w:t xml:space="preserve">    c.errors.push('площади не сходятся: со счётчиками + СПЧ + без счётчиков = ' + fmt_(meter + spch + no, 2) +</w:t>
+        <w:br/>
+        <w:t xml:space="preserve">      ', итого = ' + fmt_(total, 2));</w:t>
+        <w:br/>
+        <w:t xml:space="preserve">  }</w:t>
+        <w:br/>
+        <w:t xml:space="preserve">  if (meter &lt; 0 || spch &lt; 0 || no &lt; 0 || gkalMeter &lt; 0) c.errors.push('отрицательные площади или Гкал');</w:t>
+        <w:br/>
+        <w:br/>
+        <w:t xml:space="preserve">  if (c.gas &gt; 0) {</w:t>
+        <w:br/>
+        <w:t xml:space="preserve">    c.norm = c.gas * P.kcal;</w:t>
+        <w:br/>
+        <w:t xml:space="preserve">    c.normSrc = 'газ × ' + P.kcal;</w:t>
+        <w:br/>
+        <w:t xml:space="preserve">  } else if (c.gkalHouse &gt; 0) {</w:t>
+        <w:br/>
+        <w:t xml:space="preserve">    c.norm = c.gkalHouse;</w:t>
+        <w:br/>
+        <w:t xml:space="preserve">    c.normSrc = 'Гкал общедомовой';</w:t>
+        <w:br/>
+        <w:t xml:space="preserve">  }</w:t>
+        <w:br/>
+        <w:br/>
+        <w:t xml:space="preserve">  var b = boilerFn(obj, c.monthIdx);</w:t>
+        <w:br/>
+        <w:t xml:space="preserve">  if (b.error) c.errors.push(b.error);</w:t>
+        <w:br/>
+        <w:t xml:space="preserve">  else c.boiler = b.value;</w:t>
+        <w:br/>
+        <w:br/>
+        <w:t xml:space="preserve">  if (c.errors.length) return;</w:t>
+        <w:br/>
+        <w:br/>
+        <w:t xml:space="preserve">  // ФСО+МЗК либо идёт на все м² вместе с содержанием котельной,</w:t>
+        <w:br/>
+        <w:t xml:space="preserve">  // либо входит в газовые тарифы в той же пропорции, что и газ (тогда распределяется вся база)</w:t>
+        <w:br/>
+        <w:t xml:space="preserve">  var common = P.fsoMode === FSO_COMMON;</w:t>
+        <w:br/>
+        <w:t xml:space="preserve">  c.fsoMzk = c.base * (P.fso + P.mzk);</w:t>
+        <w:br/>
+        <w:t xml:space="preserve">  c.tCommon = common ? round_(c.fsoMzk / total, dA) : null;</w:t>
+        <w:br/>
+        <w:t xml:space="preserve">  c.boilerTotal = round_(c.boiler + (c.tCommon || 0), dA);</w:t>
+        <w:br/>
+        <w:t xml:space="preserve">  var g = common ? share : 1; // доля базы, которая идёт в газовые тарифы</w:t>
+        <w:br/>
+        <w:t xml:space="preserve">  var addNo = c.olNoMeter || 0;</w:t>
+        <w:br/>
+        <w:br/>
+        <w:t xml:space="preserve">  var denom = no + P.kSpch * spch;</w:t>
+        <w:br/>
+        <w:t xml:space="preserve">  var priceExact = 0;</w:t>
+        <w:br/>
+        <w:br/>
+        <w:t xml:space="preserve">  if (obj.type === TYPE_AREA) {</w:t>
+        <w:br/>
+        <w:t xml:space="preserve">    if (gkalMeter &gt; 0 || meter &gt; 0) {</w:t>
+        <w:br/>
+        <w:t xml:space="preserve">      c.errors.push('учёт по м²: «Площадь со счётчиками» и «Гкал по квартирным счётчикам» должны быть пустыми');</w:t>
+        <w:br/>
+        <w:t xml:space="preserve">      return;</w:t>
+        <w:br/>
+        <w:t xml:space="preserve">    }</w:t>
+        <w:br/>
+        <w:t xml:space="preserve">    if (!(denom &gt; 0)) {</w:t>
+        <w:br/>
+        <w:t xml:space="preserve">      c.errors.push('нет площади без счётчиков / СПЧ для распределения');</w:t>
+        <w:br/>
+        <w:t xml:space="preserve">      return;</w:t>
+        <w:br/>
+        <w:t xml:space="preserve">    }</w:t>
+        <w:br/>
+        <w:t xml:space="preserve">    c.tNo = round_((g * baseNoOl + addNo) / denom, dA);</w:t>
         <w:br/>
         <w:t xml:space="preserve">  } else {</w:t>
         <w:br/>
-        <w:t xml:space="preserve">    for (i = 0; i &lt; n; i++) full[i] = cfg.sums[i] || 0;</w:t>
+        <w:t xml:space="preserve">    if (!(c.norm &gt; 0)) {</w:t>
+        <w:br/>
+        <w:t xml:space="preserve">      c.errors.push('нет объёма газа (или Гкал по общедомовому счётчику) для норматива');</w:t>
+        <w:br/>
+        <w:t xml:space="preserve">      return;</w:t>
+        <w:br/>
+        <w:t xml:space="preserve">    }</w:t>
+        <w:br/>
+        <w:t xml:space="preserve">    if (gkalMeter &gt; 0 &amp;&amp; !(meter &gt; 0)) {</w:t>
+        <w:br/>
+        <w:t xml:space="preserve">      c.errors.push('есть Гкал по квартирным счётчикам, но площадь со счётчиками пустая');</w:t>
+        <w:br/>
+        <w:t xml:space="preserve">      return;</w:t>
+        <w:br/>
+        <w:t xml:space="preserve">    }</w:t>
+        <w:br/>
+        <w:t xml:space="preserve">    var indiv = c.norm * share;</w:t>
+        <w:br/>
+        <w:t xml:space="preserve">    // Цена Гкал = цена счёта без сверхлимита + надбавка сверхлимита (одинаковая на весь сезон)</w:t>
+        <w:br/>
+        <w:t xml:space="preserve">    c.priceBase = g * baseNoOl / indiv;</w:t>
+        <w:br/>
+        <w:t xml:space="preserve">    priceExact = c.priceBase + (c.olSurcharge || 0);</w:t>
+        <w:br/>
+        <w:t xml:space="preserve">    c.price = round_(priceExact, dP);</w:t>
+        <w:br/>
+        <w:t xml:space="preserve">    c.restGkal = indiv - gkalMeter;</w:t>
+        <w:br/>
+        <w:t xml:space="preserve">    if (c.restGkal &lt; 0) {</w:t>
+        <w:br/>
+        <w:t xml:space="preserve">      c.errors.push('Гкал по квартирным счётчикам (' + fmt_(gkalMeter, 2) + ') больше индивидуальной части норматива (' +</w:t>
+        <w:br/>
+        <w:t xml:space="preserve">        fmt_(indiv, 2) + ')');</w:t>
+        <w:br/>
+        <w:t xml:space="preserve">      return;</w:t>
+        <w:br/>
+        <w:t xml:space="preserve">    }</w:t>
+        <w:br/>
+        <w:t xml:space="preserve">    var noMeterAmount = c.restGkal * c.priceBase + addNo;</w:t>
+        <w:br/>
+        <w:t xml:space="preserve">    if (denom &gt; 0) {</w:t>
+        <w:br/>
+        <w:t xml:space="preserve">      c.tNo = round_(noMeterAmount / denom, dA);</w:t>
+        <w:br/>
+        <w:t xml:space="preserve">    } else if (Math.abs(noMeterAmount) &gt; P.tol) {</w:t>
+        <w:br/>
+        <w:t xml:space="preserve">      c.errors.push('остаток Гкал некому распределить: нет площади без счётчиков и СПЧ');</w:t>
+        <w:br/>
+        <w:t xml:space="preserve">      return;</w:t>
+        <w:br/>
+        <w:t xml:space="preserve">    } else {</w:t>
+        <w:br/>
+        <w:t xml:space="preserve">      c.tNo = 0;</w:t>
+        <w:br/>
+        <w:t xml:space="preserve">    }</w:t>
         <w:br/>
         <w:t xml:space="preserve">  }</w:t>
         <w:br/>
-        <w:br/>
-        <w:t xml:space="preserve">  var adds = [];</w:t>
-        <w:br/>
-        <w:t xml:space="preserve">  for (i = 0; i &lt; n; i++) adds.push(base0[i] === null ? null : full[i]);</w:t>
-        <w:br/>
-        <w:br/>
-        <w:t xml:space="preserve">  var trueUp = false;</w:t>
-        <w:br/>
-        <w:t xml:space="preserve">  if (P.trueUp === 'Да' &amp;&amp; complete) {</w:t>
-        <w:br/>
-        <w:t xml:space="preserve">    var before = 0;</w:t>
-        <w:br/>
-        <w:t xml:space="preserve">    for (i = 0; i &lt; n - 1; i++) if (adds[i] !== null) before += adds[i];</w:t>
-        <w:br/>
-        <w:t xml:space="preserve">    adds[n - 1] = factTotal - before;</w:t>
-        <w:br/>
-        <w:t xml:space="preserve">    trueUp = true;</w:t>
+        <w:t xml:space="preserve">  c.tSpch = round_(c.tNo * P.kSpch, dA);</w:t>
+        <w:br/>
+        <w:br/>
+        <w:t xml:space="preserve">  c.charged = (c.price || 0) * gkalMeter + c.tNo * no + c.tSpch * spch + (c.tCommon || 0) * total;</w:t>
+        <w:br/>
+        <w:t xml:space="preserve">  c.diff = c.charged - c.base;</w:t>
+        <w:br/>
+        <w:t xml:space="preserve">  c.tol = P.tol + 0.5 * Math.pow(10, -dA) * ((common ? total : 0) + no + spch) + 0.5 * Math.pow(10, -dP) * gkalMeter;</w:t>
+        <w:br/>
+        <w:t xml:space="preserve">  if (Math.abs(c.diff) &gt; c.tol) {</w:t>
+        <w:br/>
+        <w:t xml:space="preserve">    c.errors.push('расхождение ' + fmt_(c.diff, 2) + ' грн больше допуска ' + fmt_(c.tol, 2) + ' грн');</w:t>
         <w:br/>
         <w:t xml:space="preserve">  }</w:t>
         <w:br/>
-        <w:t xml:space="preserve">  var allocated = 0;</w:t>
-        <w:br/>
-        <w:t xml:space="preserve">  for (i = 0; i &lt; n; i++) if (adds[i] !== null) allocated += adds[i];</w:t>
-        <w:br/>
-        <w:br/>
-        <w:t xml:space="preserve">  return {</w:t>
-        <w:br/>
-        <w:t xml:space="preserve">    adds: adds, fact: fact, factTotal: factTotal, plan: plan || 0, seasonAmount: seasonAmount,</w:t>
-        <w:br/>
-        <w:t xml:space="preserve">    allocated: allocated, complete: complete, estimated: estimated, trueUp: trueUp, entered: entered.length,</w:t>
-        <w:br/>
-        <w:t xml:space="preserve">    target: target, fallback: fallback</w:t>
-        <w:br/>
-        <w:t xml:space="preserve">  };</w:t>
-        <w:br/>
         <w:t>}</w:t>
         <w:br/>
         <w:br/>
-        <w:t>/** Добавки, при которых итоговые базы пропорциональны весам (профиль по базе). */</w:t>
-        <w:br/>
-        <w:t>function profileAdditions_(base0, weights, amount) {</w:t>
-        <w:br/>
-        <w:t xml:space="preserve">  return fillAdditions_(weights, base0, amount);</w:t>
+        <w:t>// ---------- Запись результатов ----------</w:t>
+        <w:br/>
+        <w:br/>
+        <w:t>function writeReport_(sheet, cfg, result) {</w:t>
+        <w:br/>
+        <w:t xml:space="preserve">  var W = REPORT_HEADERS.length;</w:t>
+        <w:br/>
+        <w:t xml:space="preserve">  var P = cfg.params;</w:t>
+        <w:br/>
+        <w:t xml:space="preserve">  resetOutput_(sheet);</w:t>
+        <w:br/>
+        <w:t xml:space="preserve">  var info = 'Пересчитано ' + Utilities.formatDate(new Date(), Session.getScriptTimeZone(), 'dd.MM.yyyy HH:mm') +</w:t>
+        <w:br/>
+        <w:t xml:space="preserve">    '. ФСО ' + fmt_(P.fso * 100, 1) + '% + МЗК ' + fmt_(P.mzk * 100, 1) + '% ' +</w:t>
+        <w:br/>
+        <w:t xml:space="preserve">    (P.fsoMode === FSO_COMMON ? 'включены в «Содержание котельной» (на все м²)' :</w:t>
+        <w:br/>
+        <w:t xml:space="preserve">      'включены в газовые тарифы пропорционально газу; «Содержание котельной» = смета') + '. Коэф. СПЧ ' + P.kSpch + '; сглаживание сверхлимита — «' + P.mode + '».';</w:t>
+        <w:br/>
+        <w:t xml:space="preserve">  var rows = [fitRow_([SHEET_REPORT + ': ТАРИФЫ НА ОТОПЛЕНИЕ'], W), fitRow_([info], W), fitRow_(REPORT_HEADERS, W)];</w:t>
+        <w:br/>
+        <w:t xml:space="preserve">  sheet.getRange(1, 1, rows.length, W).setValues(rows);</w:t>
+        <w:br/>
+        <w:t xml:space="preserve">  formatOutputHeader_(sheet, REPORT_HEADER_ROW, W);</w:t>
+        <w:br/>
+        <w:br/>
+        <w:t xml:space="preserve">  var data = result.rows.map(function (c) {</w:t>
+        <w:br/>
+        <w:t xml:space="preserve">    return fitRow_([</w:t>
+        <w:br/>
+        <w:t xml:space="preserve">      c.month, c.receipt, c.objName, blank_(c.bill), blank_(c.boilerTotal), blank_(c.price),</w:t>
+        <w:br/>
+        <w:t xml:space="preserve">      blank_(c.tNo), blank_(c.tSpch), blank_(c.charged), blank_(c.diff), c.status</w:t>
+        <w:br/>
+        <w:t xml:space="preserve">    ], W);</w:t>
+        <w:br/>
+        <w:t xml:space="preserve">  });</w:t>
+        <w:br/>
+        <w:t xml:space="preserve">  if (!data.length) return;</w:t>
+        <w:br/>
+        <w:t xml:space="preserve">  var first = REPORT_HEADER_ROW + 1;</w:t>
+        <w:br/>
+        <w:t xml:space="preserve">  var range = sheet.getRange(first, 1, data.length, W);</w:t>
+        <w:br/>
+        <w:t xml:space="preserve">  range.setValues(data);</w:t>
+        <w:br/>
+        <w:t xml:space="preserve">  sheet.getRange(first, 4, data.length, 1).setNumberFormat('#,##0.00');</w:t>
+        <w:br/>
+        <w:t xml:space="preserve">  sheet.getRange(first, 5, data.length, 4).setNumberFormat('0.00');</w:t>
+        <w:br/>
+        <w:t xml:space="preserve">  sheet.getRange(first, 9, data.length, 2).setNumberFormat('#,##0.00');</w:t>
+        <w:br/>
+        <w:t xml:space="preserve">  paintStatus_(sheet, first, result.rows, W);</w:t>
+        <w:br/>
+        <w:t xml:space="preserve">  sheet.setColumnWidths(1, 3, 110);</w:t>
+        <w:br/>
+        <w:t xml:space="preserve">  sheet.setColumnWidths(4, W - 4, 130);</w:t>
+        <w:br/>
+        <w:t xml:space="preserve">  sheet.setColumnWidth(W, 360);</w:t>
+        <w:br/>
+        <w:t xml:space="preserve">  sheet.getRange(first, W, data.length, 1).setWrap(true);</w:t>
         <w:br/>
         <w:t>}</w:t>
         <w:br/>
         <w:br/>
+        <w:t>function writeDetails_(sheet, cfg, result) {</w:t>
+        <w:br/>
+        <w:t xml:space="preserve">  var W = DETAILS_HEADERS.length;</w:t>
+        <w:br/>
+        <w:t xml:space="preserve">  var P = cfg.params;</w:t>
+        <w:br/>
+        <w:t xml:space="preserve">  resetOutput_(sheet);</w:t>
+        <w:br/>
+        <w:t xml:space="preserve">  var rows = [</w:t>
+        <w:br/>
+        <w:t xml:space="preserve">    fitRow_([SHEET_DETAILS], W),</w:t>
+        <w:br/>
+        <w:t xml:space="preserve">    fitRow_(['Техника расчёта для проверки. В ячейках — формулы: щёлкните по числу, чтобы увидеть, откуда оно берётся. ' +</w:t>
+        <w:br/>
+        <w:t xml:space="preserve">      'Режим сглаживания: «' + P.mode + '», профиль применяется к «' + P.profileTarget + '»; ФСО+МЗК — «' + P.fsoMode + '».'], W),</w:t>
+        <w:br/>
+        <w:t xml:space="preserve">    fitRow_(DETAILS_HEADERS, W)</w:t>
+        <w:br/>
+        <w:t xml:space="preserve">  ];</w:t>
+        <w:br/>
+        <w:t xml:space="preserve">  var first = DETAILS_HEADER_ROW + 1;</w:t>
+        <w:br/>
+        <w:t xml:space="preserve">  var detailCount = result.rows.length;</w:t>
+        <w:br/>
+        <w:t xml:space="preserve">  // Блок сверки сверхлимита идёт после строк расчёта: пустая строка, заголовок блока, шапка, строки ЖК</w:t>
+        <w:br/>
+        <w:t xml:space="preserve">  var olTitleRow = first + detailCount + 1;</w:t>
+        <w:br/>
+        <w:t xml:space="preserve">  var olHeaderRow = olTitleRow + 1;</w:t>
+        <w:br/>
+        <w:t xml:space="preserve">  var olRowByObj = {};</w:t>
+        <w:br/>
+        <w:t xml:space="preserve">  result.overlimit.forEach(function (a, k) { olRowByObj[a.obj.name] = olHeaderRow + 1 + k; });</w:t>
+        <w:br/>
+        <w:t xml:space="preserve">  var formulaRows = [];</w:t>
+        <w:br/>
+        <w:br/>
+        <w:t xml:space="preserve">  result.rows.forEach(function (c, k) {</w:t>
+        <w:br/>
+        <w:t xml:space="preserve">    var r = first + k;</w:t>
+        <w:br/>
+        <w:t xml:space="preserve">    var values = [</w:t>
+        <w:br/>
+        <w:t xml:space="preserve">      c.month, c.objName, blank_(c.olFact), blank_(c.olSurcharge), blank_(c.olNoMeter), blank_(c.olAdd), blank_(c.base),</w:t>
+        <w:br/>
+        <w:t xml:space="preserve">      blank_(c.norm), c.normSrc, blank_(c.fsoMzk), blank_(c.tCommon), blank_(c.boiler), blank_(c.priceBase),</w:t>
+        <w:br/>
+        <w:t xml:space="preserve">      blank_(c.price), blank_(c.restGkal), blank_(c.tNo), blank_(c.tSpch),</w:t>
+        <w:br/>
+        <w:t xml:space="preserve">      c.tNo === null ? '' : round_((c.boilerTotal || 0) + c.tNo, P.digitsArea),</w:t>
+        <w:br/>
+        <w:t xml:space="preserve">      blank_(c.charged), blank_(c.diff), blank_(c.tol), c.status</w:t>
+        <w:br/>
+        <w:t xml:space="preserve">    ];</w:t>
+        <w:br/>
+        <w:t xml:space="preserve">    var f = detailFormulas_(c, cfg, r);</w:t>
+        <w:br/>
+        <w:t xml:space="preserve">    if (f) {</w:t>
+        <w:br/>
+        <w:t xml:space="preserve">      // Колонки F…U — формулами (пишутся отдельно через setFormulas), остальные — значениями</w:t>
+        <w:br/>
+        <w:t xml:space="preserve">      for (var j = DETAIL_FORMULA_FIRST_COL - 1; j &lt;= DETAIL_FORMULA_LAST_COL - 1; j++) values[j] = '';</w:t>
+        <w:br/>
+        <w:t xml:space="preserve">      formulaRows.push(f.slice(DETAIL_FORMULA_FIRST_COL - 1, DETAIL_FORMULA_LAST_COL).map(asFormula_));</w:t>
+        <w:br/>
+        <w:t xml:space="preserve">    } else {</w:t>
+        <w:br/>
+        <w:t xml:space="preserve">      formulaRows.push(null);</w:t>
+        <w:br/>
+        <w:t xml:space="preserve">    }</w:t>
+        <w:br/>
+        <w:t xml:space="preserve">    rows.push(fitRow_(values, W));</w:t>
+        <w:br/>
+        <w:t xml:space="preserve">  });</w:t>
+        <w:br/>
+        <w:t xml:space="preserve">  rows.push(fitRow_([], W));</w:t>
+        <w:br/>
+        <w:t xml:space="preserve">  rows.push(fitRow_(['СВЕРКА СВЕРХЛИМИТА ЗА СЕЗОН'], W));</w:t>
+        <w:br/>
+        <w:t xml:space="preserve">  rows.push(fitRow_(['ЖК', 'План на сезон, грн', 'Факт в счетах, грн', 'Сумма к разнесению, грн', 'Разнесено всего, грн']</w:t>
+        <w:br/>
+        <w:t xml:space="preserve">    .concat(SEASON_MONTHS).concat(['Март введён (сезон закрыт)', 'Надбавка к цене Гкал на сезон, грн/Гкал',</w:t>
+        <w:br/>
+        <w:t xml:space="preserve">      'Профиль применён к', 'Примечание']), W));</w:t>
+        <w:br/>
+        <w:t xml:space="preserve">  result.overlimit.forEach(function (a) {</w:t>
+        <w:br/>
+        <w:t xml:space="preserve">    var note = [];</w:t>
+        <w:br/>
+        <w:t xml:space="preserve">    if (a.estimated) note.push('невведённые месяцы оценены по профилю — добавки уточнятся с новыми счетами');</w:t>
+        <w:br/>
+        <w:t xml:space="preserve">    if (a.fallback) note.push('квитанцию посчитать нельзя (нет площадей / норматива), профиль взят по базе');</w:t>
+        <w:br/>
+        <w:t xml:space="preserve">    if (a.trueUp) note.push('март доведён до факта сезона');</w:t>
+        <w:br/>
+        <w:t xml:space="preserve">    if (!a.entered) note.push('нет введённых месяцев');</w:t>
+        <w:br/>
+        <w:t xml:space="preserve">    var r = olRowByObj[a.obj.name];</w:t>
+        <w:br/>
+        <w:t xml:space="preserve">    rows.push(fitRow_([a.obj.name, a.plan, a.factTotal, a.seasonAmount, a.allocated]</w:t>
+        <w:br/>
+        <w:t xml:space="preserve">      .concat(a.adds.map(blank_)).concat([a.complete ? 'Да' : 'Нет', blank_(a.flatSurcharge), a.target || '',</w:t>
+        <w:br/>
+        <w:t xml:space="preserve">        note.join('; ')]), W));</w:t>
+        <w:br/>
+        <w:t xml:space="preserve">  });</w:t>
+        <w:br/>
+        <w:t xml:space="preserve">  var lastRow = rows.length;</w:t>
+        <w:br/>
+        <w:t xml:space="preserve">  rows.push(fitRow_([], W));</w:t>
+        <w:br/>
+        <w:t xml:space="preserve">  var legendRow = rows.length + 1;</w:t>
+        <w:br/>
+        <w:t xml:space="preserve">  rows.push(fitRow_(['КАК СЧИТАЕТСЯ'], W));</w:t>
+        <w:br/>
+        <w:t xml:space="preserve">  detailLegend_(P).forEach(function (line) { rows.push(fitRow_(line, W)); });</w:t>
+        <w:br/>
+        <w:br/>
+        <w:t xml:space="preserve">  sheet.getRange(1, 1, rows.length, W).setValues(rows);</w:t>
+        <w:br/>
+        <w:t xml:space="preserve">  // Формулы пишем через setFormulas: так Google читает их в английском синтаксисе (запятые, точка)</w:t>
+        <w:br/>
+        <w:t xml:space="preserve">  // при любой локали таблицы. Через setValues формула разбиралась бы по правилам локали и ломалась.</w:t>
+        <w:br/>
+        <w:t xml:space="preserve">  formulaRows.forEach(function (fr, k) {</w:t>
+        <w:br/>
+        <w:t xml:space="preserve">    if (fr) sheet.getRange(first + k, DETAIL_FORMULA_FIRST_COL, 1, fr.length).setFormulas([fr]);</w:t>
+        <w:br/>
+        <w:t xml:space="preserve">  });</w:t>
+        <w:br/>
+        <w:t xml:space="preserve">  formatOutputHeader_(sheet, DETAILS_HEADER_ROW, W);</w:t>
+        <w:br/>
+        <w:br/>
+        <w:t xml:space="preserve">  if (detailCount) {</w:t>
+        <w:br/>
+        <w:t xml:space="preserve">    sheet.getRange(first, 3, detailCount, 1).setNumberFormat('#,##0.00');</w:t>
+        <w:br/>
+        <w:t xml:space="preserve">    sheet.getRange(first, 4, detailCount, 1).setNumberFormat('#,##0.00');</w:t>
+        <w:br/>
+        <w:t xml:space="preserve">    sheet.getRange(first, 5, detailCount, 3).setNumberFormat('#,##0.00');</w:t>
+        <w:br/>
+        <w:t xml:space="preserve">    sheet.getRange(first, 8, detailCount, 1).setNumberFormat('#,##0.0000');</w:t>
+        <w:br/>
+        <w:t xml:space="preserve">    sheet.getRange(first, 10, detailCount, 1).setNumberFormat('#,##0.00');</w:t>
+        <w:br/>
+        <w:t xml:space="preserve">    sheet.getRange(first, 11, detailCount, 2).setNumberFormat('0.0000');</w:t>
+        <w:br/>
+        <w:t xml:space="preserve">    sheet.getRange(first, 13, detailCount, 2).setNumberFormat('#,##0.00');</w:t>
+        <w:br/>
+        <w:t xml:space="preserve">    sheet.getRange(first, 15, detailCount, 1).setNumberFormat('#,##0.0000');</w:t>
+        <w:br/>
+        <w:t xml:space="preserve">    sheet.getRange(first, 16, detailCount, 3).setNumberFormat('0.00');</w:t>
+        <w:br/>
+        <w:t xml:space="preserve">    sheet.getRange(first, 19, detailCount, 3).setNumberFormat('#,##0.00');</w:t>
+        <w:br/>
+        <w:t xml:space="preserve">    paintStatus_(sheet, first, result.rows, W);</w:t>
+        <w:br/>
+        <w:t xml:space="preserve">  }</w:t>
+        <w:br/>
+        <w:t xml:space="preserve">  sheet.getRange(olTitleRow, 1).setFontWeight('bold').setFontSize(11);</w:t>
+        <w:br/>
+        <w:t xml:space="preserve">  sheet.getRange(olHeaderRow, 1, 1, 14).setFontWeight('bold').setBackground(COLOR_HEADER_BG).setWrap(true);</w:t>
+        <w:br/>
+        <w:t xml:space="preserve">  if (result.overlimit.length) {</w:t>
+        <w:br/>
+        <w:t xml:space="preserve">    sheet.getRange(olHeaderRow + 1, 2, result.overlimit.length, 9).setNumberFormat('#,##0.00');</w:t>
+        <w:br/>
+        <w:t xml:space="preserve">    sheet.getRange(olHeaderRow + 1, 12, result.overlimit.length, 1).setNumberFormat('#,##0.00');</w:t>
+        <w:br/>
+        <w:t xml:space="preserve">  }</w:t>
+        <w:br/>
+        <w:t xml:space="preserve">  sheet.getRange(legendRow, 1).setFontWeight('bold').setFontSize(11);</w:t>
+        <w:br/>
+        <w:t xml:space="preserve">  sheet.getRange(legendRow + 1, 1, rows.length - legendRow, 1).setFontWeight('bold');</w:t>
+        <w:br/>
+        <w:t xml:space="preserve">  sheet.setColumnWidths(1, W, 115);</w:t>
+        <w:br/>
+        <w:t xml:space="preserve">  sheet.setColumnWidth(W, 360);</w:t>
+        <w:br/>
+        <w:t>}</w:t>
+        <w:br/>
+        <w:br/>
         <w:t>/**</w:t>
         <w:br/>
-        <w:t xml:space="preserve"> * Общий подбор добавок: добавка(i) = a(i) × u − b(i), сумма добавок = amount, все добавки ≥ 0.</w:t>
-        <w:br/>
-        <w:t xml:space="preserve"> * Месяцы с отрицательной добавкой получают 0 и исключаются; повторяем, пока все добавки ≥ 0.</w:t>
+        <w:t xml:space="preserve"> * Разделитель аргументов в формулах для локали таблицы: в русской, украинской и других локалях</w:t>
+        <w:br/>
+        <w:t xml:space="preserve"> * с десятичной запятой Google ждёт «;», в английской — «,».</w:t>
         <w:br/>
         <w:t xml:space="preserve"> */</w:t>
         <w:br/>
-        <w:t>function fillAdditions_(a, b, amount) {</w:t>
-        <w:br/>
-        <w:t xml:space="preserve">  var n = a.length;</w:t>
-        <w:br/>
-        <w:t xml:space="preserve">  var adds = [];</w:t>
-        <w:br/>
-        <w:t xml:space="preserve">  var active = [];</w:t>
-        <w:br/>
-        <w:t xml:space="preserve">  var i;</w:t>
-        <w:br/>
-        <w:t xml:space="preserve">  for (i = 0; i &lt; n; i++) { adds.push(0); active.push(a[i] &gt; 0); }</w:t>
-        <w:br/>
-        <w:t xml:space="preserve">  for (var iter = 0; iter &lt;= n; iter++) {</w:t>
-        <w:br/>
-        <w:t xml:space="preserve">    var sa = 0;</w:t>
-        <w:br/>
-        <w:t xml:space="preserve">    var sb = 0;</w:t>
-        <w:br/>
-        <w:t xml:space="preserve">    for (i = 0; i &lt; n; i++) if (active[i]) { sa += a[i]; sb += b[i]; }</w:t>
-        <w:br/>
-        <w:t xml:space="preserve">    if (sa &lt;= 0) break;</w:t>
-        <w:br/>
-        <w:t xml:space="preserve">    var u = (sb + amount) / sa;</w:t>
-        <w:br/>
-        <w:t xml:space="preserve">    var excluded = false;</w:t>
-        <w:br/>
-        <w:t xml:space="preserve">    for (i = 0; i &lt; n; i++) {</w:t>
-        <w:br/>
-        <w:t xml:space="preserve">      if (active[i] &amp;&amp; a[i] * u - b[i] &lt; 0) { active[i] = false; excluded = true; }</w:t>
-        <w:br/>
-        <w:t xml:space="preserve">    }</w:t>
-        <w:br/>
-        <w:t xml:space="preserve">    if (!excluded) {</w:t>
-        <w:br/>
-        <w:t xml:space="preserve">      for (i = 0; i &lt; n; i++) adds[i] = active[i] ? a[i] * u - b[i] : 0;</w:t>
-        <w:br/>
-        <w:t xml:space="preserve">      break;</w:t>
-        <w:br/>
-        <w:t xml:space="preserve">    }</w:t>
+        <w:t>function formulaSeparator_(ss) {</w:t>
+        <w:br/>
+        <w:t xml:space="preserve">  var locale = String(ss.getSpreadsheetLocale() || '').toLowerCase();</w:t>
+        <w:br/>
+        <w:t xml:space="preserve">  var dotLocales = ['en', 'ja', 'zh', 'ko', 'th', 'he', 'iw', 'hi', 'ms', 'fil', 'ga', 'sw', 'ur', 'bn', 'ta', 'te'];</w:t>
+        <w:br/>
+        <w:t xml:space="preserve">  var lang = locale.split(/[_-]/)[0];</w:t>
+        <w:br/>
+        <w:t xml:space="preserve">  return dotLocales.indexOf(lang) &gt;= 0 ? ',' : ';';</w:t>
+        <w:br/>
+        <w:t>}</w:t>
+        <w:br/>
+        <w:br/>
+        <w:t>/** Значение ячейки как формула для setFormulas: текст → ="текст", число → =число. */</w:t>
+        <w:br/>
+        <w:t>function asFormula_(v) {</w:t>
+        <w:br/>
+        <w:t xml:space="preserve">  if (v === '' || v === null || v === undefined) return '';</w:t>
+        <w:br/>
+        <w:t xml:space="preserve">  if (typeof v === 'number') return '=' + v;</w:t>
+        <w:br/>
+        <w:t xml:space="preserve">  var s = String(v);</w:t>
+        <w:br/>
+        <w:t xml:space="preserve">  if (s.charAt(0) === '=') return s;</w:t>
+        <w:br/>
+        <w:t xml:space="preserve">  return '="' + s.replace(/"/g, '""') + '"';</w:t>
+        <w:br/>
+        <w:t>}</w:t>
+        <w:br/>
+        <w:br/>
+        <w:t>/** Ссылка на ячейку значения параметра на листе НАСТРОЙКИ, или null. */</w:t>
+        <w:br/>
+        <w:t>function settingRef_(cfg, key) {</w:t>
+        <w:br/>
+        <w:t xml:space="preserve">  var r = cfg.paramRow &amp;&amp; cfg.paramRow[key];</w:t>
+        <w:br/>
+        <w:t xml:space="preserve">  return r ? "'" + SHEET_SETTINGS + "'!$B$" + r : null;</w:t>
+        <w:br/>
+        <w:t>}</w:t>
+        <w:br/>
+        <w:br/>
+        <w:t>/**</w:t>
+        <w:br/>
+        <w:t xml:space="preserve"> * Строка ДЕТАЛЕЙ формулами: ссылки на ВВОД, НАСТРОЙКИ, смету и блок сверки сверхлимита.</w:t>
+        <w:br/>
+        <w:t xml:space="preserve"> * Для строк с ошибкой и когда адреса настроек неизвестны возвращает null — тогда пишутся числа.</w:t>
+        <w:br/>
+        <w:t xml:space="preserve"> */</w:t>
+        <w:br/>
+        <w:t>function detailFormulas_(c, cfg, r) {</w:t>
+        <w:br/>
+        <w:t xml:space="preserve">  if (c.errors.length || c.tNo === null) return null;</w:t>
+        <w:br/>
+        <w:t xml:space="preserve">  var keys = ['kcal', 'fso', 'mzk', 'kSpch', 'digitsArea', 'digitsPrice', 'tol'];</w:t>
+        <w:br/>
+        <w:t xml:space="preserve">  var S = {};</w:t>
+        <w:br/>
+        <w:t xml:space="preserve">  for (var k = 0; k &lt; keys.length; k++) {</w:t>
+        <w:br/>
+        <w:t xml:space="preserve">    S[keys[k]] = settingRef_(cfg, keys[k]);</w:t>
+        <w:br/>
+        <w:t xml:space="preserve">    if (!S[keys[k]]) return null;</w:t>
         <w:br/>
         <w:t xml:space="preserve">  }</w:t>
         <w:br/>
-        <w:t xml:space="preserve">  return adds;</w:t>
+        <w:t xml:space="preserve">  var P = cfg.params;</w:t>
+        <w:br/>
+        <w:t xml:space="preserve">  var obj = c.obj;</w:t>
+        <w:br/>
+        <w:t xml:space="preserve">  var common = P.fsoMode === FSO_COMMON;</w:t>
+        <w:br/>
+        <w:t xml:space="preserve">  var sep = cfg.formulaSep || ','; // разделитель аргументов: «;» для локалей с десятичной запятой</w:t>
+        <w:br/>
+        <w:t xml:space="preserve">  var V = function (idx) { return "N('" + SHEET_INPUT + "'!" + indexToCol_(idx + 1) + c.rowNum + ')'; };</w:t>
+        <w:br/>
+        <w:t xml:space="preserve">  var share = '(1-' + S.fso + '-' + S.mzk + ')';</w:t>
+        <w:br/>
+        <w:t xml:space="preserve">  var gMul = common ? share + '*' : ''; // доля базы, идущая в газ</w:t>
+        <w:br/>
+        <w:t xml:space="preserve">  var billNoOl = "(N('" + SHEET_INPUT + "'!C" + c.rowNum + ')-C' + r + ')';</w:t>
+        <w:br/>
+        <w:t xml:space="preserve">  var denom = '(' + V(IN.AREA_NO) + '+' + S.kSpch + '*' + V(IN.AREA_SPCH) + ')';</w:t>
+        <w:br/>
+        <w:t xml:space="preserve">  var src = "='" + obj.sheetName.replace(/'/g, "''") + "'!" + indexToCol_(obj.novColIndex + c.monthIdx) + obj.rowValue;</w:t>
+        <w:br/>
+        <w:t xml:space="preserve">  var isArea = obj.type === TYPE_AREA;</w:t>
+        <w:br/>
+        <w:br/>
+        <w:t xml:space="preserve">  var norm = '';</w:t>
+        <w:br/>
+        <w:t xml:space="preserve">  if (c.gas &gt; 0) norm = '=' + V(IN.GAS) + '*' + S.kcal;</w:t>
+        <w:br/>
+        <w:t xml:space="preserve">  else if (c.gkalHouse &gt; 0) norm = '=' + V(IN.GKAL_HOUSE);</w:t>
+        <w:br/>
+        <w:br/>
+        <w:t xml:space="preserve">  var olAdd = isArea ? '=E' + r : '=N(D' + r + ')*' + V(IN.GKAL_METER) + '+E' + r;</w:t>
+        <w:br/>
+        <w:t xml:space="preserve">  if (common) olAdd = '=(' + olAdd.substring(1) + ')/' + share;</w:t>
+        <w:br/>
+        <w:br/>
+        <w:t xml:space="preserve">  var priceBase = '';</w:t>
+        <w:br/>
+        <w:t xml:space="preserve">  var price = '';</w:t>
+        <w:br/>
+        <w:t xml:space="preserve">  var rest = '';</w:t>
+        <w:br/>
+        <w:t xml:space="preserve">  var tNo;</w:t>
+        <w:br/>
+        <w:t xml:space="preserve">  if (isArea) {</w:t>
+        <w:br/>
+        <w:t xml:space="preserve">    tNo = '=ROUND((' + gMul + billNoOl + '+E' + r + ')/' + denom + sep + S.digitsArea + ')';</w:t>
+        <w:br/>
+        <w:t xml:space="preserve">  } else {</w:t>
+        <w:br/>
+        <w:t xml:space="preserve">    priceBase = '=' + gMul + billNoOl + '/(H' + r + '*' + share + ')';</w:t>
+        <w:br/>
+        <w:t xml:space="preserve">    price = '=ROUND(M' + r + '+N(D' + r + ')' + sep + S.digitsPrice + ')';</w:t>
+        <w:br/>
+        <w:t xml:space="preserve">    rest = '=H' + r + '*' + share + '-' + V(IN.GKAL_METER);</w:t>
+        <w:br/>
+        <w:t xml:space="preserve">    tNo = (c.areaNo || 0) + P.kSpch * (c.areaSpch || 0) &gt; 0</w:t>
+        <w:br/>
+        <w:t xml:space="preserve">      ? '=ROUND((O' + r + '*M' + r + '+E' + r + ')/' + denom + sep + S.digitsArea + ')'</w:t>
+        <w:br/>
+        <w:t xml:space="preserve">      : 0;</w:t>
+        <w:br/>
+        <w:t xml:space="preserve">  }</w:t>
+        <w:br/>
+        <w:t xml:space="preserve">  var tCommon = common ? '=ROUND(J' + r + '/' + V(IN.AREA_TOTAL) + sep + S.digitsArea + ')' : '';</w:t>
+        <w:br/>
+        <w:t xml:space="preserve">  var totalTerm = common ? '+N(K' + r + ')*' + V(IN.AREA_TOTAL) : '';</w:t>
+        <w:br/>
+        <w:t xml:space="preserve">  var tolArea = common ? V(IN.AREA_TOTAL) + '+' : '';</w:t>
+        <w:br/>
+        <w:t xml:space="preserve">  return [</w:t>
+        <w:br/>
+        <w:t xml:space="preserve">    c.month,                                                            // A</w:t>
+        <w:br/>
+        <w:t xml:space="preserve">    c.objName,                                                          // B</w:t>
+        <w:br/>
+        <w:t xml:space="preserve">    '=' + V(IN.OL),                                                     // C сверхлимит факт</w:t>
+        <w:br/>
+        <w:t xml:space="preserve">    blank_(c.olSurcharge),                                              // D надбавка, грн/Гкал (из расчёта)</w:t>
+        <w:br/>
+        <w:t xml:space="preserve">    blank_(c.olNoMeter),                                                // E на квартиры без счётчиков (из расчёта)</w:t>
+        <w:br/>
+        <w:t xml:space="preserve">    olAdd,                                                              // F отнесённый сверхлимит</w:t>
+        <w:br/>
+        <w:t xml:space="preserve">    "=N('" + SHEET_INPUT + "'!C" + c.rowNum + ')-C' + r + '+F' + r,    // G база</w:t>
+        <w:br/>
+        <w:t xml:space="preserve">    norm,                                                               // H норматив</w:t>
+        <w:br/>
+        <w:t xml:space="preserve">    c.normSrc,                                                          // I</w:t>
+        <w:br/>
+        <w:t xml:space="preserve">    '=G' + r + '*(' + S.fso + '+' + S.mzk + ')',                        // J ФСО+МЗК, грн</w:t>
+        <w:br/>
+        <w:t xml:space="preserve">    tCommon,                                                            // K ФСО+МЗК, грн/м²</w:t>
+        <w:br/>
+        <w:t xml:space="preserve">    src,                                                                // L содержание из сметы</w:t>
+        <w:br/>
+        <w:t xml:space="preserve">    priceBase,                                                          // M цена Гкал без надбавки</w:t>
+        <w:br/>
+        <w:t xml:space="preserve">    price,                                                              // N цена Гкал</w:t>
+        <w:br/>
+        <w:t xml:space="preserve">    rest,                                                               // O остаток Гкал</w:t>
+        <w:br/>
+        <w:t xml:space="preserve">    tNo,                                                                // P тариф без счётчика</w:t>
+        <w:br/>
+        <w:t xml:space="preserve">    '=ROUND(P' + r + '*' + S.kSpch + sep + S.digitsArea + ')',          // Q тариф СПЧ</w:t>
+        <w:br/>
+        <w:t xml:space="preserve">    '=ROUND(L' + r + '+N(K' + r + ')' + sep + S.digitsArea + ')+P' + r, // R квитанция без счётчика</w:t>
+        <w:br/>
+        <w:t xml:space="preserve">    '=N(N' + r + ')*' + V(IN.GKAL_METER) + '+P' + r + '*' + V(IN.AREA_NO) + '+Q' + r + '*' + V(IN.AREA_SPCH) + totalTerm, // S</w:t>
+        <w:br/>
+        <w:t xml:space="preserve">    '=S' + r + '-G' + r,                                                // T расхождение</w:t>
+        <w:br/>
+        <w:t xml:space="preserve">    '=' + S.tol + '+(1/2)*10^(-' + S.digitsArea + ')*(' + tolArea + V(IN.AREA_NO) + '+' + V(IN.AREA_SPCH) + ')+(1/2)*10^(-' +</w:t>
+        <w:br/>
+        <w:t xml:space="preserve">      S.digitsPrice + ')*' + V(IN.GKAL_METER),                          // U допуск</w:t>
+        <w:br/>
+        <w:t xml:space="preserve">    c.status                                                            // V</w:t>
+        <w:br/>
+        <w:t xml:space="preserve">  ];</w:t>
         <w:br/>
         <w:t>}</w:t>
         <w:br/>
         <w:br/>
-        <w:t>/**</w:t>
-        <w:br/>
-        <w:t xml:space="preserve"> * На сколько грн/м² растёт квитанция без счётчика (газ + ФСО/МЗК, если он на все м²) при росте базы на 1 грн.</w:t>
-        <w:br/>
-        <w:t xml:space="preserve"> * null — если по строке это посчитать нельзя (нет площадей, норматива и т.п.).</w:t>
-        <w:br/>
-        <w:t xml:space="preserve"> */</w:t>
-        <w:br/>
-        <w:t>function receiptSlope_(c, obj, P) {</w:t>
-        <w:br/>
-        <w:t xml:space="preserve">  var share = 1 - P.fso - P.mzk;</w:t>
+        <w:t>/** Пояснения к колонкам ДЕТАЛЕЙ словами. */</w:t>
+        <w:br/>
+        <w:t>function detailLegend_(P) {</w:t>
         <w:br/>
         <w:t xml:space="preserve">  var common = P.fsoMode === FSO_COMMON;</w:t>
         <w:br/>
-        <w:t xml:space="preserve">  var spch = c.areaSpch || 0;</w:t>
-        <w:br/>
-        <w:t xml:space="preserve">  var no = c.areaNo || 0;</w:t>
-        <w:br/>
-        <w:t xml:space="preserve">  var denom = no + P.kSpch * spch;</w:t>
-        <w:br/>
-        <w:t xml:space="preserve">  if (!(denom &gt; 0)) return null;</w:t>
-        <w:br/>
-        <w:t xml:space="preserve">  var gasPerBase = common ? share : 1;</w:t>
-        <w:br/>
-        <w:t xml:space="preserve">  var m;</w:t>
-        <w:br/>
-        <w:t xml:space="preserve">  if (obj.type === TYPE_AREA) {</w:t>
-        <w:br/>
-        <w:t xml:space="preserve">    m = gasPerBase / denom;</w:t>
-        <w:br/>
-        <w:t xml:space="preserve">  } else {</w:t>
-        <w:br/>
-        <w:t xml:space="preserve">    var norm = c.gas &gt; 0 ? c.gas * P.kcal : (c.gkalHouse &gt; 0 ? c.gkalHouse : 0);</w:t>
-        <w:br/>
-        <w:t xml:space="preserve">    if (!(norm &gt; 0)) return null;</w:t>
-        <w:br/>
-        <w:t xml:space="preserve">    var rest = norm * share - (c.gkalMeter || 0);</w:t>
-        <w:br/>
-        <w:t xml:space="preserve">    if (!(rest &gt; 0)) return null;</w:t>
-        <w:br/>
-        <w:t xml:space="preserve">    m = gasPerBase * rest / (norm * share * denom);</w:t>
-        <w:br/>
-        <w:t xml:space="preserve">  }</w:t>
-        <w:br/>
-        <w:t xml:space="preserve">  if (common) {</w:t>
-        <w:br/>
-        <w:t xml:space="preserve">    if (!(c.areaTotal &gt; 0)) return null;</w:t>
-        <w:br/>
-        <w:t xml:space="preserve">    m += (P.fso + P.mzk) / c.areaTotal;</w:t>
-        <w:br/>
-        <w:t xml:space="preserve">  }</w:t>
-        <w:br/>
-        <w:t xml:space="preserve">  return m;</w:t>
-        <w:br/>
-        <w:t>}</w:t>
-        <w:br/>
-        <w:br/>
-        <w:t>/** Тарифы одной строки ЖК × месяц. Ошибки складываются в c.errors. */</w:t>
-        <w:br/>
-        <w:t>function calcTariffs_(c, obj, cfg, boilerFn) {</w:t>
-        <w:br/>
-        <w:t xml:space="preserve">  var P = cfg.params;</w:t>
-        <w:br/>
-        <w:t xml:space="preserve">  var dA = P.digitsArea;</w:t>
-        <w:br/>
-        <w:t xml:space="preserve">  var dP = P.digitsPrice;</w:t>
-        <w:br/>
-        <w:t xml:space="preserve">  var share = 1 - P.fso - P.mzk;</w:t>
-        <w:br/>
-        <w:br/>
-        <w:t xml:space="preserve">  c.base = c.bill - c.olFact + (c.olAdd || 0);</w:t>
-        <w:br/>
-        <w:t xml:space="preserve">  if (!(c.base &gt; 0)) c.errors.push('база распределения ≤ 0');</w:t>
-        <w:br/>
-        <w:br/>
-        <w:t xml:space="preserve">  var total = c.areaTotal;</w:t>
-        <w:br/>
-        <w:t xml:space="preserve">  var meter = c.areaMeter || 0;</w:t>
-        <w:br/>
-        <w:t xml:space="preserve">  var spch = c.areaSpch || 0;</w:t>
-        <w:br/>
-        <w:t xml:space="preserve">  var no = c.areaNo || 0;</w:t>
-        <w:br/>
-        <w:t xml:space="preserve">  var gkalMeter = c.gkalMeter || 0;</w:t>
-        <w:br/>
-        <w:t xml:space="preserve">  if (!(total &gt; 0)) {</w:t>
-        <w:br/>
-        <w:t xml:space="preserve">    c.errors.push('не указана площадь отапливаемая итого');</w:t>
-        <w:br/>
-        <w:t xml:space="preserve">  } else if (Math.abs(meter + spch + no - total) &gt; P.tolArea) {</w:t>
-        <w:br/>
-        <w:t xml:space="preserve">    c.errors.push('площади не сходятся: со счётчиками + СПЧ + без счётчиков = ' + fmt_(meter + spch + no, 2) +</w:t>
-        <w:br/>
-        <w:t xml:space="preserve">      ', итого = ' + fmt_(total, 2));</w:t>
-        <w:br/>
-        <w:t xml:space="preserve">  }</w:t>
-        <w:br/>
-        <w:t xml:space="preserve">  if (meter &lt; 0 || spch &lt; 0 || no &lt; 0 || gkalMeter &lt; 0) c.errors.push('отрицательные площади или Гкал');</w:t>
-        <w:br/>
-        <w:br/>
-        <w:t xml:space="preserve">  if (c.gas &gt; 0) {</w:t>
-        <w:br/>
-        <w:t xml:space="preserve">    c.norm = c.gas * P.kcal;</w:t>
-        <w:br/>
-        <w:t xml:space="preserve">    c.normSrc = 'газ × ' + P.kcal;</w:t>
-        <w:br/>
-        <w:t xml:space="preserve">  } else if (c.gkalHouse &gt; 0) {</w:t>
-        <w:br/>
-        <w:t xml:space="preserve">    c.norm = c.gkalHouse;</w:t>
-        <w:br/>
-        <w:t xml:space="preserve">    c.normSrc = 'Гкал общедомовой';</w:t>
-        <w:br/>
-        <w:t xml:space="preserve">  }</w:t>
-        <w:br/>
-        <w:br/>
-        <w:t xml:space="preserve">  var b = boilerFn(obj, c.monthIdx);</w:t>
-        <w:br/>
-        <w:t xml:space="preserve">  if (b.error) c.errors.push(b.error);</w:t>
-        <w:br/>
-        <w:t xml:space="preserve">  else c.boiler = b.value;</w:t>
-        <w:br/>
-        <w:br/>
-        <w:t xml:space="preserve">  if (c.errors.length) return;</w:t>
-        <w:br/>
-        <w:br/>
-        <w:t xml:space="preserve">  // ФСО+МЗК либо идёт на все м² вместе с содержанием котельной,</w:t>
-        <w:br/>
-        <w:t xml:space="preserve">  // либо входит в газовые тарифы в той же пропорции, что и газ (тогда распределяется вся база)</w:t>
-        <w:br/>
-        <w:t xml:space="preserve">  var common = P.fsoMode === FSO_COMMON;</w:t>
-        <w:br/>
-        <w:t xml:space="preserve">  c.fsoMzk = c.base * (P.fso + P.mzk);</w:t>
-        <w:br/>
-        <w:t xml:space="preserve">  c.tCommon = common ? round_(c.fsoMzk / total, dA) : null;</w:t>
-        <w:br/>
-        <w:t xml:space="preserve">  c.boilerTotal = round_(c.boiler + (c.tCommon || 0), dA);</w:t>
-        <w:br/>
-        <w:t xml:space="preserve">  var gasAmount = common ? c.base - c.fsoMzk : c.base;</w:t>
-        <w:br/>
-        <w:br/>
-        <w:t xml:space="preserve">  var denom = no + P.kSpch * spch;</w:t>
-        <w:br/>
-        <w:t xml:space="preserve">  var priceExact = 0;</w:t>
-        <w:br/>
-        <w:br/>
-        <w:t xml:space="preserve">  if (obj.type === TYPE_AREA) {</w:t>
-        <w:br/>
-        <w:t xml:space="preserve">    if (gkalMeter &gt; 0 || meter &gt; 0) {</w:t>
-        <w:br/>
-        <w:t xml:space="preserve">      c.errors.push('учёт по м²: «Площадь со счётчиками» и «Гкал по квартирным счётчикам» должны быть пустыми');</w:t>
-        <w:br/>
-        <w:t xml:space="preserve">      return;</w:t>
-        <w:br/>
-        <w:t xml:space="preserve">    }</w:t>
-        <w:br/>
-        <w:t xml:space="preserve">    if (!(denom &gt; 0)) {</w:t>
-        <w:br/>
-        <w:t xml:space="preserve">      c.errors.push('нет площади без счётчиков / СПЧ для распределения');</w:t>
-        <w:br/>
-        <w:t xml:space="preserve">      return;</w:t>
-        <w:br/>
-        <w:t xml:space="preserve">    }</w:t>
-        <w:br/>
-        <w:t xml:space="preserve">    c.tNo = round_(gasAmount / denom, dA);</w:t>
-        <w:br/>
-        <w:t xml:space="preserve">  } else {</w:t>
-        <w:br/>
-        <w:t xml:space="preserve">    if (!(c.norm &gt; 0)) {</w:t>
-        <w:br/>
-        <w:t xml:space="preserve">      c.errors.push('нет объёма газа (или Гкал по общедомовому счётчику) для норматива');</w:t>
-        <w:br/>
-        <w:t xml:space="preserve">      return;</w:t>
-        <w:br/>
-        <w:t xml:space="preserve">    }</w:t>
-        <w:br/>
-        <w:t xml:space="preserve">    if (gkalMeter &gt; 0 &amp;&amp; !(meter &gt; 0)) {</w:t>
-        <w:br/>
-        <w:t xml:space="preserve">      c.errors.push('есть Гкал по квартирным счётчикам, но площадь со счётчиками пустая');</w:t>
-        <w:br/>
-        <w:t xml:space="preserve">      return;</w:t>
-        <w:br/>
-        <w:t xml:space="preserve">    }</w:t>
-        <w:br/>
-        <w:t xml:space="preserve">    priceExact = gasAmount / (c.norm * share);</w:t>
-        <w:br/>
-        <w:t xml:space="preserve">    c.price = round_(priceExact, dP);</w:t>
-        <w:br/>
-        <w:t xml:space="preserve">    var indiv = c.norm * share;</w:t>
-        <w:br/>
-        <w:t xml:space="preserve">    c.restGkal = indiv - gkalMeter;</w:t>
-        <w:br/>
-        <w:t xml:space="preserve">    if (c.restGkal &lt; 0) {</w:t>
-        <w:br/>
-        <w:t xml:space="preserve">      c.errors.push('Гкал по квартирным счётчикам (' + fmt_(gkalMeter, 2) + ') больше индивидуальной части норматива (' +</w:t>
-        <w:br/>
-        <w:t xml:space="preserve">        fmt_(indiv, 2) + ')');</w:t>
-        <w:br/>
-        <w:t xml:space="preserve">      return;</w:t>
-        <w:br/>
-        <w:t xml:space="preserve">    }</w:t>
-        <w:br/>
-        <w:t xml:space="preserve">    if (denom &gt; 0) {</w:t>
-        <w:br/>
-        <w:t xml:space="preserve">      c.tNo = round_(c.restGkal * priceExact / denom, dA);</w:t>
-        <w:br/>
-        <w:t xml:space="preserve">    } else if (c.restGkal * priceExact &gt; P.tol) {</w:t>
-        <w:br/>
-        <w:t xml:space="preserve">      c.errors.push('остаток Гкал некому распределить: нет площади без счётчиков и СПЧ');</w:t>
-        <w:br/>
-        <w:t xml:space="preserve">      return;</w:t>
-        <w:br/>
-        <w:t xml:space="preserve">    } else {</w:t>
-        <w:br/>
-        <w:t xml:space="preserve">      c.tNo = 0;</w:t>
-        <w:br/>
-        <w:t xml:space="preserve">    }</w:t>
-        <w:br/>
-        <w:t xml:space="preserve">  }</w:t>
-        <w:br/>
-        <w:t xml:space="preserve">  c.tSpch = round_(c.tNo * P.kSpch, dA);</w:t>
-        <w:br/>
-        <w:br/>
-        <w:t xml:space="preserve">  c.charged = (c.price || 0) * gkalMeter + c.tNo * no + c.tSpch * spch + (c.tCommon || 0) * total;</w:t>
-        <w:br/>
-        <w:t xml:space="preserve">  c.diff = c.charged - c.base;</w:t>
-        <w:br/>
-        <w:t xml:space="preserve">  c.tol = P.tol + 0.5 * Math.pow(10, -dA) * ((common ? total : 0) + no + spch) + 0.5 * Math.pow(10, -dP) * gkalMeter;</w:t>
-        <w:br/>
-        <w:t xml:space="preserve">  if (Math.abs(c.diff) &gt; c.tol) {</w:t>
-        <w:br/>
-        <w:t xml:space="preserve">    c.errors.push('расхождение ' + fmt_(c.diff, 2) + ' грн больше допуска ' + fmt_(c.tol, 2) + ' грн');</w:t>
-        <w:br/>
-        <w:t xml:space="preserve">  }</w:t>
-        <w:br/>
-        <w:t>}</w:t>
-        <w:br/>
-        <w:br/>
-        <w:t>// ---------- Запись результатов ----------</w:t>
-        <w:br/>
-        <w:br/>
-        <w:t>function writeReport_(sheet, cfg, result) {</w:t>
-        <w:br/>
-        <w:t xml:space="preserve">  var W = REPORT_HEADERS.length;</w:t>
-        <w:br/>
-        <w:t xml:space="preserve">  var P = cfg.params;</w:t>
-        <w:br/>
-        <w:t xml:space="preserve">  resetOutput_(sheet);</w:t>
-        <w:br/>
-        <w:t xml:space="preserve">  var info = 'Пересчитано ' + Utilities.formatDate(new Date(), Session.getScriptTimeZone(), 'dd.MM.yyyy HH:mm') +</w:t>
-        <w:br/>
-        <w:t xml:space="preserve">    '. ФСО ' + fmt_(P.fso * 100, 1) + '% + МЗК ' + fmt_(P.mzk * 100, 1) + '% ' +</w:t>
-        <w:br/>
-        <w:t xml:space="preserve">    (P.fsoMode === FSO_COMMON ? 'включены в «Содержание котельной» (на все м²)' :</w:t>
-        <w:br/>
-        <w:t xml:space="preserve">      'включены в газовые тарифы пропорционально газу; «Содержание котельной» = смета') + '. Коэф. СПЧ ' + P.kSpch + '; сглаживание сверхлимита — «' + P.mode + '».';</w:t>
-        <w:br/>
-        <w:t xml:space="preserve">  var rows = [fitRow_([SHEET_REPORT + ': ТАРИФЫ НА ОТОПЛЕНИЕ'], W), fitRow_([info], W), fitRow_(REPORT_HEADERS, W)];</w:t>
-        <w:br/>
-        <w:t xml:space="preserve">  sheet.getRange(1, 1, rows.length, W).setValues(rows);</w:t>
-        <w:br/>
-        <w:t xml:space="preserve">  formatOutputHeader_(sheet, REPORT_HEADER_ROW, W);</w:t>
-        <w:br/>
-        <w:br/>
-        <w:t xml:space="preserve">  var data = result.rows.map(function (c) {</w:t>
-        <w:br/>
-        <w:t xml:space="preserve">    return fitRow_([</w:t>
-        <w:br/>
-        <w:t xml:space="preserve">      c.month, c.receipt, c.objName, blank_(c.bill), blank_(c.boilerTotal), blank_(c.price),</w:t>
-        <w:br/>
-        <w:t xml:space="preserve">      blank_(c.tNo), blank_(c.tSpch), blank_(c.charged), blank_(c.diff), c.status</w:t>
-        <w:br/>
-        <w:t xml:space="preserve">    ], W);</w:t>
-        <w:br/>
-        <w:t xml:space="preserve">  });</w:t>
-        <w:br/>
-        <w:t xml:space="preserve">  if (!data.length) return;</w:t>
-        <w:br/>
-        <w:t xml:space="preserve">  var first = REPORT_HEADER_ROW + 1;</w:t>
-        <w:br/>
-        <w:t xml:space="preserve">  var range = sheet.getRange(first, 1, data.length, W);</w:t>
-        <w:br/>
-        <w:t xml:space="preserve">  range.setValues(data);</w:t>
-        <w:br/>
-        <w:t xml:space="preserve">  sheet.getRange(first, 4, data.length, 1).setNumberFormat('#,##0.00');</w:t>
-        <w:br/>
-        <w:t xml:space="preserve">  sheet.getRange(first, 5, data.length, 4).setNumberFormat('0.00');</w:t>
-        <w:br/>
-        <w:t xml:space="preserve">  sheet.getRange(first, 9, data.length, 2).setNumberFormat('#,##0.00');</w:t>
-        <w:br/>
-        <w:t xml:space="preserve">  paintStatus_(sheet, first, result.rows, W);</w:t>
-        <w:br/>
-        <w:t xml:space="preserve">  sheet.setColumnWidths(1, 3, 110);</w:t>
-        <w:br/>
-        <w:t xml:space="preserve">  sheet.setColumnWidths(4, W - 4, 130);</w:t>
-        <w:br/>
-        <w:t xml:space="preserve">  sheet.setColumnWidth(W, 360);</w:t>
-        <w:br/>
-        <w:t xml:space="preserve">  sheet.getRange(first, W, data.length, 1).setWrap(true);</w:t>
-        <w:br/>
-        <w:t>}</w:t>
-        <w:br/>
-        <w:br/>
-        <w:t>function writeDetails_(sheet, cfg, result) {</w:t>
-        <w:br/>
-        <w:t xml:space="preserve">  var W = DETAILS_HEADERS.length;</w:t>
-        <w:br/>
-        <w:t xml:space="preserve">  var P = cfg.params;</w:t>
-        <w:br/>
-        <w:t xml:space="preserve">  resetOutput_(sheet);</w:t>
-        <w:br/>
-        <w:t xml:space="preserve">  var rows = [</w:t>
-        <w:br/>
-        <w:t xml:space="preserve">    fitRow_([SHEET_DETAILS], W),</w:t>
-        <w:br/>
-        <w:t xml:space="preserve">    fitRow_(['Техника расчёта для проверки. В ячейках — формулы: щёлкните по числу, чтобы увидеть, откуда оно берётся. ' +</w:t>
-        <w:br/>
-        <w:t xml:space="preserve">      'Режим сглаживания: «' + P.mode + '», профиль применяется к «' + P.profileTarget + '»; ФСО+МЗК — «' + P.fsoMode + '».'], W),</w:t>
-        <w:br/>
-        <w:t xml:space="preserve">    fitRow_(DETAILS_HEADERS, W)</w:t>
-        <w:br/>
-        <w:t xml:space="preserve">  ];</w:t>
-        <w:br/>
-        <w:t xml:space="preserve">  var first = DETAILS_HEADER_ROW + 1;</w:t>
-        <w:br/>
-        <w:t xml:space="preserve">  var detailCount = result.rows.length;</w:t>
-        <w:br/>
-        <w:t xml:space="preserve">  // Блок сверки сверхлимита идёт после строк расчёта: пустая строка, заголовок блока, шапка, строки ЖК</w:t>
-        <w:br/>
-        <w:t xml:space="preserve">  var olTitleRow = first + detailCount + 1;</w:t>
-        <w:br/>
-        <w:t xml:space="preserve">  var olHeaderRow = olTitleRow + 1;</w:t>
-        <w:br/>
-        <w:t xml:space="preserve">  var olRowByObj = {};</w:t>
-        <w:br/>
-        <w:t xml:space="preserve">  result.overlimit.forEach(function (a, k) { olRowByObj[a.obj.name] = olHeaderRow + 1 + k; });</w:t>
-        <w:br/>
-        <w:t xml:space="preserve">  var formulaRows = [];</w:t>
-        <w:br/>
-        <w:br/>
-        <w:t xml:space="preserve">  result.rows.forEach(function (c, k) {</w:t>
-        <w:br/>
-        <w:t xml:space="preserve">    var r = first + k;</w:t>
-        <w:br/>
-        <w:t xml:space="preserve">    var f = detailFormulas_(c, cfg, r, olRowByObj[c.objName]);</w:t>
-        <w:br/>
-        <w:t xml:space="preserve">    formulaRows.push(f ? fitRow_(f, W).map(asFormula_) : null);</w:t>
-        <w:br/>
-        <w:t xml:space="preserve">    rows.push(fitRow_(f ? [] : [</w:t>
-        <w:br/>
-        <w:t xml:space="preserve">      c.month, c.objName, blank_(c.olFact), blank_(c.olAdd), blank_(c.base), blank_(c.norm), c.normSrc,</w:t>
-        <w:br/>
-        <w:t xml:space="preserve">      blank_(c.fsoMzk), blank_(c.tCommon), blank_(c.boiler), blank_(c.price), blank_(c.restGkal),</w:t>
-        <w:br/>
-        <w:t xml:space="preserve">      blank_(c.tNo), blank_(c.tSpch), c.tNo === null ? '' : round_((c.boilerTotal || 0) + c.tNo, P.digitsArea),</w:t>
-        <w:br/>
-        <w:t xml:space="preserve">      blank_(c.charged), blank_(c.diff), blank_(c.tol), c.status</w:t>
-        <w:br/>
-        <w:t xml:space="preserve">    ], W));</w:t>
-        <w:br/>
-        <w:t xml:space="preserve">  });</w:t>
-        <w:br/>
-        <w:t xml:space="preserve">  rows.push(fitRow_([], W));</w:t>
-        <w:br/>
-        <w:t xml:space="preserve">  rows.push(fitRow_(['СВЕРКА СВЕРХЛИМИТА ЗА СЕЗОН'], W));</w:t>
-        <w:br/>
-        <w:t xml:space="preserve">  rows.push(fitRow_(['ЖК', 'План на сезон, грн', 'Факт в счетах, грн', 'Сумма к разнесению, грн', 'Разнесено всего, грн']</w:t>
-        <w:br/>
-        <w:t xml:space="preserve">    .concat(SEASON_MONTHS).concat(['Март введён (сезон закрыт)', 'Профиль применён к', 'Примечание']), W));</w:t>
-        <w:br/>
-        <w:t xml:space="preserve">  result.overlimit.forEach(function (a) {</w:t>
-        <w:br/>
-        <w:t xml:space="preserve">    var note = [];</w:t>
-        <w:br/>
-        <w:t xml:space="preserve">    if (a.estimated) note.push('невведённые месяцы оценены по профилю — добавки уточнятся с новыми счетами');</w:t>
-        <w:br/>
-        <w:t xml:space="preserve">    if (a.fallback) note.push('квитанцию посчитать нельзя (нет площадей / норматива), профиль взят по базе');</w:t>
-        <w:br/>
-        <w:t xml:space="preserve">    if (a.trueUp) note.push('март доведён до факта сезона');</w:t>
-        <w:br/>
-        <w:t xml:space="preserve">    if (!a.entered) note.push('нет введённых месяцев');</w:t>
-        <w:br/>
-        <w:t xml:space="preserve">    var r = olRowByObj[a.obj.name];</w:t>
-        <w:br/>
-        <w:t xml:space="preserve">    rows.push(fitRow_([a.obj.name, a.plan, a.factTotal, a.seasonAmount, a.allocated]</w:t>
-        <w:br/>
-        <w:t xml:space="preserve">      .concat(a.adds.map(blank_)).concat([a.complete ? 'Да' : 'Нет', a.target || '', note.join('; ')]), W));</w:t>
-        <w:br/>
-        <w:t xml:space="preserve">  });</w:t>
-        <w:br/>
-        <w:t xml:space="preserve">  var lastRow = rows.length;</w:t>
-        <w:br/>
-        <w:t xml:space="preserve">  rows.push(fitRow_([], W));</w:t>
-        <w:br/>
-        <w:t xml:space="preserve">  var legendRow = rows.length + 1;</w:t>
-        <w:br/>
-        <w:t xml:space="preserve">  rows.push(fitRow_(['КАК СЧИТАЕТСЯ'], W));</w:t>
-        <w:br/>
-        <w:t xml:space="preserve">  detailLegend_(P).forEach(function (line) { rows.push(fitRow_(line, W)); });</w:t>
-        <w:br/>
-        <w:br/>
-        <w:t xml:space="preserve">  sheet.getRange(1, 1, rows.length, W).setValues(rows);</w:t>
-        <w:br/>
-        <w:t xml:space="preserve">  // Формулы пишем через setFormulas: так Google читает их в английском синтаксисе (запятые, точка)</w:t>
-        <w:br/>
-        <w:t xml:space="preserve">  // при любой локали таблицы. Через setValues формула разбиралась бы по правилам локали и ломалась.</w:t>
-        <w:br/>
-        <w:t xml:space="preserve">  formulaRows.forEach(function (fr, k) {</w:t>
-        <w:br/>
-        <w:t xml:space="preserve">    if (fr) sheet.getRange(first + k, 1, 1, W).setFormulas([fr]);</w:t>
-        <w:br/>
-        <w:t xml:space="preserve">  });</w:t>
-        <w:br/>
-        <w:t xml:space="preserve">  formatOutputHeader_(sheet, DETAILS_HEADER_ROW, W);</w:t>
-        <w:br/>
-        <w:br/>
-        <w:t xml:space="preserve">  if (detailCount) {</w:t>
-        <w:br/>
-        <w:t xml:space="preserve">    sheet.getRange(first, 3, detailCount, 3).setNumberFormat('#,##0.00');</w:t>
-        <w:br/>
-        <w:t xml:space="preserve">    sheet.getRange(first, 6, detailCount, 1).setNumberFormat('#,##0.0000');</w:t>
-        <w:br/>
-        <w:t xml:space="preserve">    sheet.getRange(first, 8, detailCount, 1).setNumberFormat('#,##0.00');</w:t>
-        <w:br/>
-        <w:t xml:space="preserve">    sheet.getRange(first, 9, detailCount, 2).setNumberFormat('0.0000');</w:t>
-        <w:br/>
-        <w:t xml:space="preserve">    sheet.getRange(first, 11, detailCount, 1).setNumberFormat('#,##0.00');</w:t>
-        <w:br/>
-        <w:t xml:space="preserve">    sheet.getRange(first, 12, detailCount, 1).setNumberFormat('#,##0.0000');</w:t>
-        <w:br/>
-        <w:t xml:space="preserve">    sheet.getRange(first, 13, detailCount, 3).setNumberFormat('0.00');</w:t>
-        <w:br/>
-        <w:t xml:space="preserve">    sheet.getRange(first, 16, detailCount, 3).setNumberFormat('#,##0.00');</w:t>
-        <w:br/>
-        <w:t xml:space="preserve">    paintStatus_(sheet, first, result.rows, W);</w:t>
-        <w:br/>
-        <w:t xml:space="preserve">  }</w:t>
-        <w:br/>
-        <w:t xml:space="preserve">  sheet.getRange(olTitleRow, 1).setFontWeight('bold').setFontSize(11);</w:t>
-        <w:br/>
-        <w:t xml:space="preserve">  sheet.getRange(olHeaderRow, 1, 1, 13).setFontWeight('bold').setBackground(COLOR_HEADER_BG).setWrap(true);</w:t>
-        <w:br/>
-        <w:t xml:space="preserve">  if (result.overlimit.length) {</w:t>
-        <w:br/>
-        <w:t xml:space="preserve">    sheet.getRange(olHeaderRow + 1, 2, result.overlimit.length, 9).setNumberFormat('#,##0.00');</w:t>
-        <w:br/>
-        <w:t xml:space="preserve">  }</w:t>
-        <w:br/>
-        <w:t xml:space="preserve">  sheet.getRange(legendRow, 1).setFontWeight('bold').setFontSize(11);</w:t>
-        <w:br/>
-        <w:t xml:space="preserve">  sheet.getRange(legendRow + 1, 1, rows.length - legendRow, 1).setFontWeight('bold');</w:t>
-        <w:br/>
-        <w:t xml:space="preserve">  sheet.setColumnWidths(1, W, 115);</w:t>
-        <w:br/>
-        <w:t xml:space="preserve">  sheet.setColumnWidth(W, 360);</w:t>
-        <w:br/>
-        <w:t>}</w:t>
-        <w:br/>
-        <w:br/>
-        <w:t>/**</w:t>
-        <w:br/>
-        <w:t xml:space="preserve"> * Разделитель аргументов в формулах для локали таблицы: в русской, украинской и других локалях</w:t>
-        <w:br/>
-        <w:t xml:space="preserve"> * с десятичной запятой Google ждёт «;», в английской — «,».</w:t>
-        <w:br/>
-        <w:t xml:space="preserve"> */</w:t>
-        <w:br/>
-        <w:t>function formulaSeparator_(ss) {</w:t>
-        <w:br/>
-        <w:t xml:space="preserve">  var locale = String(ss.getSpreadsheetLocale() || '').toLowerCase();</w:t>
-        <w:br/>
-        <w:t xml:space="preserve">  var dotLocales = ['en', 'ja', 'zh', 'ko', 'th', 'he', 'iw', 'hi', 'ms', 'fil', 'ga', 'sw', 'ur', 'bn', 'ta', 'te'];</w:t>
-        <w:br/>
-        <w:t xml:space="preserve">  var lang = locale.split(/[_-]/)[0];</w:t>
-        <w:br/>
-        <w:t xml:space="preserve">  return dotLocales.indexOf(lang) &gt;= 0 ? ',' : ';';</w:t>
-        <w:br/>
-        <w:t>}</w:t>
-        <w:br/>
-        <w:br/>
-        <w:t>/** Значение ячейки как формула для setFormulas: текст → ="текст", число → =число. */</w:t>
-        <w:br/>
-        <w:t>function asFormula_(v) {</w:t>
-        <w:br/>
-        <w:t xml:space="preserve">  if (v === '' || v === null || v === undefined) return '';</w:t>
-        <w:br/>
-        <w:t xml:space="preserve">  if (typeof v === 'number') return '=' + v;</w:t>
-        <w:br/>
-        <w:t xml:space="preserve">  var s = String(v);</w:t>
-        <w:br/>
-        <w:t xml:space="preserve">  if (s.charAt(0) === '=') return s;</w:t>
-        <w:br/>
-        <w:t xml:space="preserve">  return '="' + s.replace(/"/g, '""') + '"';</w:t>
-        <w:br/>
-        <w:t>}</w:t>
-        <w:br/>
-        <w:br/>
-        <w:t>/** Ссылка на ячейку значения параметра на листе НАСТРОЙКИ, или null. */</w:t>
-        <w:br/>
-        <w:t>function settingRef_(cfg, key) {</w:t>
-        <w:br/>
-        <w:t xml:space="preserve">  var r = cfg.paramRow &amp;&amp; cfg.paramRow[key];</w:t>
-        <w:br/>
-        <w:t xml:space="preserve">  return r ? "'" + SHEET_SETTINGS + "'!$B$" + r : null;</w:t>
-        <w:br/>
-        <w:t>}</w:t>
-        <w:br/>
-        <w:br/>
-        <w:t>/**</w:t>
-        <w:br/>
-        <w:t xml:space="preserve"> * Строка ДЕТАЛЕЙ формулами: ссылки на ВВОД, НАСТРОЙКИ, смету и блок сверки сверхлимита.</w:t>
-        <w:br/>
-        <w:t xml:space="preserve"> * Для строк с ошибкой и когда адреса настроек неизвестны возвращает null — тогда пишутся числа.</w:t>
-        <w:br/>
-        <w:t xml:space="preserve"> */</w:t>
-        <w:br/>
-        <w:t>function detailFormulas_(c, cfg, r, olRow) {</w:t>
-        <w:br/>
-        <w:t xml:space="preserve">  if (c.errors.length || !olRow || c.tNo === null) return null;</w:t>
-        <w:br/>
-        <w:t xml:space="preserve">  var keys = ['kcal', 'fso', 'mzk', 'kSpch', 'digitsArea', 'digitsPrice', 'tol'];</w:t>
-        <w:br/>
-        <w:t xml:space="preserve">  var S = {};</w:t>
-        <w:br/>
-        <w:t xml:space="preserve">  for (var k = 0; k &lt; keys.length; k++) {</w:t>
-        <w:br/>
-        <w:t xml:space="preserve">    S[keys[k]] = settingRef_(cfg, keys[k]);</w:t>
-        <w:br/>
-        <w:t xml:space="preserve">    if (!S[keys[k]]) return null;</w:t>
-        <w:br/>
-        <w:t xml:space="preserve">  }</w:t>
-        <w:br/>
-        <w:t xml:space="preserve">  var P = cfg.params;</w:t>
-        <w:br/>
-        <w:t xml:space="preserve">  var obj = c.obj;</w:t>
-        <w:br/>
-        <w:t xml:space="preserve">  var common = P.fsoMode === FSO_COMMON;</w:t>
-        <w:br/>
-        <w:t xml:space="preserve">  var sep = cfg.formulaSep || ','; // разделитель аргументов: «;» для локалей с десятичной запятой</w:t>
-        <w:br/>
-        <w:t xml:space="preserve">  var V = function (idx) { return "N('" + SHEET_INPUT + "'!" + indexToCol_(idx + 1) + c.rowNum + ')'; };</w:t>
-        <w:br/>
-        <w:t xml:space="preserve">  var share = '(1-' + S.fso + '-' + S.mzk + ')';</w:t>
-        <w:br/>
-        <w:t xml:space="preserve">  var gasAmount = common ? '(E' + r + '-H' + r + ')' : 'E' + r;</w:t>
-        <w:br/>
-        <w:t xml:space="preserve">  var denom = '(' + V(IN.AREA_NO) + '+' + S.kSpch + '*' + V(IN.AREA_SPCH) + ')';</w:t>
-        <w:br/>
-        <w:t xml:space="preserve">  var monthCol = indexToCol_(6 + c.monthIdx); // F…J в блоке сверки</w:t>
-        <w:br/>
-        <w:t xml:space="preserve">  var src = "='" + obj.sheetName.replace(/'/g, "''") + "'!" + indexToCol_(obj.novColIndex + c.monthIdx) + obj.rowValue;</w:t>
-        <w:br/>
-        <w:br/>
-        <w:t xml:space="preserve">  var norm = '';</w:t>
-        <w:br/>
-        <w:t xml:space="preserve">  if (c.gas &gt; 0) norm = '=' + V(IN.GAS) + '*' + S.kcal;</w:t>
-        <w:br/>
-        <w:t xml:space="preserve">  else if (c.gkalHouse &gt; 0) norm = '=' + V(IN.GKAL_HOUSE);</w:t>
-        <w:br/>
-        <w:br/>
-        <w:t xml:space="preserve">  var price = '';</w:t>
-        <w:br/>
-        <w:t xml:space="preserve">  var rest = '';</w:t>
-        <w:br/>
-        <w:t xml:space="preserve">  var tNo;</w:t>
-        <w:br/>
-        <w:t xml:space="preserve">  if (obj.type === TYPE_AREA) {</w:t>
-        <w:br/>
-        <w:t xml:space="preserve">    tNo = '=ROUND(' + gasAmount + '/' + denom + sep + S.digitsArea + ')';</w:t>
-        <w:br/>
-        <w:t xml:space="preserve">  } else {</w:t>
-        <w:br/>
-        <w:t xml:space="preserve">    price = '=ROUND(' + gasAmount + '/(F' + r + '*' + share + ')' + sep + S.digitsPrice + ')';</w:t>
-        <w:br/>
-        <w:t xml:space="preserve">    rest = '=F' + r + '*' + share + '-' + V(IN.GKAL_METER);</w:t>
-        <w:br/>
-        <w:t xml:space="preserve">    tNo = (c.areaNo || 0) + P.kSpch * (c.areaSpch || 0) &gt; 0</w:t>
-        <w:br/>
-        <w:t xml:space="preserve">      ? '=ROUND(L' + r + '*' + gasAmount + '/(F' + r + '*' + share + ')/' + denom + sep + S.digitsArea + ')'</w:t>
-        <w:br/>
-        <w:t xml:space="preserve">      : 0;</w:t>
-        <w:br/>
-        <w:t xml:space="preserve">  }</w:t>
-        <w:br/>
-        <w:t xml:space="preserve">  var tCommon = common ? '=ROUND(H' + r + '/' + V(IN.AREA_TOTAL) + sep + S.digitsArea + ')' : '';</w:t>
-        <w:br/>
-        <w:t xml:space="preserve">  var totalTerm = common ? '+N(I' + r + ')*' + V(IN.AREA_TOTAL) : '';</w:t>
-        <w:br/>
-        <w:t xml:space="preserve">  var tolArea = common ? V(IN.AREA_TOTAL) + '+' : '';</w:t>
+        <w:t xml:space="preserve">  var g = common ? ' × (1 − ФСО − МЗК)' : '';</w:t>
         <w:br/>
         <w:t xml:space="preserve">  return [</w:t>
         <w:br/>
-        <w:t xml:space="preserve">    c.month,</w:t>
-        <w:br/>
-        <w:t xml:space="preserve">    c.objName,</w:t>
-        <w:br/>
-        <w:t xml:space="preserve">    '=' + V(IN.OL),</w:t>
-        <w:br/>
-        <w:t xml:space="preserve">    '=' + monthCol + olRow,</w:t>
-        <w:br/>
-        <w:t xml:space="preserve">    "=N('" + SHEET_INPUT + "'!C" + c.rowNum + ')-C' + r + '+D' + r,</w:t>
-        <w:br/>
-        <w:t xml:space="preserve">    norm,</w:t>
-        <w:br/>
-        <w:t xml:space="preserve">    c.normSrc,</w:t>
-        <w:br/>
-        <w:t xml:space="preserve">    '=E' + r + '*(' + S.fso + '+' + S.mzk + ')',</w:t>
-        <w:br/>
-        <w:t xml:space="preserve">    tCommon,</w:t>
-        <w:br/>
-        <w:t xml:space="preserve">    src,</w:t>
-        <w:br/>
-        <w:t xml:space="preserve">    price,</w:t>
-        <w:br/>
-        <w:t xml:space="preserve">    rest,</w:t>
-        <w:br/>
-        <w:t xml:space="preserve">    tNo,</w:t>
-        <w:br/>
-        <w:t xml:space="preserve">    '=ROUND(M' + r + '*' + S.kSpch + sep + S.digitsArea + ')',</w:t>
-        <w:br/>
-        <w:t xml:space="preserve">    '=ROUND(J' + r + '+N(I' + r + ')' + sep + S.digitsArea + ')+M' + r,</w:t>
-        <w:br/>
-        <w:t xml:space="preserve">    '=N(K' + r + ')*' + V(IN.GKAL_METER) + '+M' + r + '*' + V(IN.AREA_NO) + '+N' + r + '*' + V(IN.AREA_SPCH) + totalTerm,</w:t>
-        <w:br/>
-        <w:t xml:space="preserve">    '=P' + r + '-E' + r,</w:t>
-        <w:br/>
-        <w:t xml:space="preserve">    '=' + S.tol + '+(1/2)*10^(-' + S.digitsArea + ')*(' + tolArea + V(IN.AREA_NO) + '+' + V(IN.AREA_SPCH) + ')+(1/2)*10^(-' +</w:t>
-        <w:br/>
-        <w:t xml:space="preserve">      S.digitsPrice + ')*' + V(IN.GKAL_METER),</w:t>
-        <w:br/>
-        <w:t xml:space="preserve">    c.status</w:t>
-        <w:br/>
-        <w:t xml:space="preserve">  ];</w:t>
-        <w:br/>
-        <w:t>}</w:t>
-        <w:br/>
-        <w:br/>
-        <w:t>/** Пояснения к колонкам ДЕТАЛЕЙ словами. */</w:t>
-        <w:br/>
-        <w:t>function detailLegend_(P) {</w:t>
-        <w:br/>
-        <w:t xml:space="preserve">  var common = P.fsoMode === FSO_COMMON;</w:t>
-        <w:br/>
-        <w:t xml:space="preserve">  var gas = common ? '(База − ФСО+МЗК)' : 'База';</w:t>
-        <w:br/>
-        <w:t xml:space="preserve">  return [</w:t>
-        <w:br/>
         <w:t xml:space="preserve">    ['Сверхлимит факт', 'из ВВОДа, колонка «в т.ч. сверхлимит в счёте»'],</w:t>
         <w:br/>
-        <w:t xml:space="preserve">    ['Сверхлимит отнесённый', 'из блока «Сверка сверхлимита» выше: сезонный сверхлимит, разложенный по месяцам по профилю (' +</w:t>
-        <w:br/>
-        <w:t xml:space="preserve">      P.profileTarget + ')'],</w:t>
+        <w:t xml:space="preserve">    ['Надбавка к цене Гкал', 'сверхлимит сезона' + g + ' ÷ все индивидуальные Гкал сезона — одинаковая во всех месяцах ' +</w:t>
+        <w:br/>
+        <w:t xml:space="preserve">      '(в режиме «базе распределения» — добавка месяца ÷ индивидуальные Гкал месяца)'],</w:t>
+        <w:br/>
+        <w:t xml:space="preserve">    ['Сверхлимит на квартиры без счётчиков', 'надбавка × остаток Гкал за сезон, разложенный по месяцам так, чтобы квитанция ' +</w:t>
+        <w:br/>
+        <w:t xml:space="preserve">      'без счётчика шла по весам профиля'],</w:t>
+        <w:br/>
+        <w:t xml:space="preserve">    ['Сверхлимит отнесённый', '(Надбавка × Гкал по квартирным счётчикам + Сверхлимит на квартиры без счётчиков)' +</w:t>
+        <w:br/>
+        <w:t xml:space="preserve">      (common ? ' ÷ (1 − ФСО − МЗК)' : '')],</w:t>
         <w:br/>
         <w:t xml:space="preserve">    ['База', 'Счёт поставщика − Сверхлимит факт + Сверхлимит отнесённый'],</w:t>
         <w:br/>
@@ -2542,17 +2811,21 @@
         <w:br/>
         <w:t xml:space="preserve">    ['Содержание из сметы', 'сезонный лист ЖК, строка «Содержание котельной», колонка месяца'],</w:t>
         <w:br/>
-        <w:t xml:space="preserve">    ['Цена 1 Гкал', gas + ' ÷ (Норматив × (1 − ФСО − МЗК))'],</w:t>
+        <w:t xml:space="preserve">    ['Цена Гкал без надбавки', '(Счёт − Сверхлимит факт)' + g + ' ÷ (Норматив × (1 − ФСО − МЗК))'],</w:t>
+        <w:br/>
+        <w:t xml:space="preserve">    ['Цена 1 Гкал', 'Цена Гкал без надбавки + Надбавка к цене Гкал — платят квартиры со счётчиками за свои Гкал'],</w:t>
         <w:br/>
         <w:t xml:space="preserve">    ['Остаток Гкал', 'Норматив × (1 − ФСО − МЗК) − Гкал по квартирным счётчикам'],</w:t>
         <w:br/>
-        <w:t xml:space="preserve">    ['Тариф без счётчика', 'Остаток Гкал × Цена 1 Гкал ÷ (Площадь без счётчиков + коэф. СПЧ × Площадь СПЧ); ' +</w:t>
-        <w:br/>
-        <w:t xml:space="preserve">      'для учёта по м²: ' + gas + ' ÷ (Площадь без счётчиков + коэф. СПЧ × Площадь СПЧ)'],</w:t>
+        <w:t xml:space="preserve">    ['Тариф без счётчика', '(Остаток Гкал × Цена Гкал без надбавки + Сверхлимит на квартиры без счётчиков) ÷ ' +</w:t>
+        <w:br/>
+        <w:t xml:space="preserve">      '(Площадь без счётчиков + коэф. СПЧ × Площадь СПЧ); для учёта по м²: ((Счёт − Сверхлимит факт)' + g +</w:t>
+        <w:br/>
+        <w:t xml:space="preserve">      ' + Сверхлимит на квартиры без счётчиков) ÷ (Площадь без счётчиков + коэф. СПЧ × Площадь СПЧ)'],</w:t>
         <w:br/>
         <w:t xml:space="preserve">    ['Тариф СПЧ', 'Тариф без счётчика × коэф. СПЧ'],</w:t>
         <w:br/>
-        <w:t xml:space="preserve">    ['Квитанция без счётчика', 'Содержание котельной (+ ФСО+МЗК, грн/м²) + Тариф без счётчика — именно она сглаживается по профилю'],</w:t>
+        <w:t xml:space="preserve">    ['Квитанция без счётчика', 'Содержание котельной (+ ФСО+МЗК, грн/м²) + Тариф без счётчика — идёт по весам профиля'],</w:t>
         <w:br/>
         <w:t xml:space="preserve">    ['Начислено', 'Цена Гкал × Гкал по счётчикам + Тариф без счётчика × Площадь без счётчиков + Тариф СПЧ × Площадь СПЧ' +</w:t>
         <w:br/>

</xml_diff>

<commit_message>
Handle meters above norm, gas-free months, and flag suspicious overlimit
- If apartment meters exceed the individual part of the norm, unmetered flats
  are charged at the metered average per m² instead of failing.
- A month with no gas and a zero bill yields zero gas tariffs and is left out
  of overlimit smoothing.
- Status warns (orange) when bill minus overlimit per m³ is far from the
  ЖК's usual gas price, and on the meters-above-norm fallback.
- Clearer messages for ЛП areas and missing gas / Gcal.

Co-Authored-By: Claude Opus 5.5 <noreply@anthropic.com>
Claude-Session: https://claude.ai/code/session_01GNzaMiF8ytaw7gqL3bRJFQ
</commit_message>
<xml_diff>
--- a/heating-report/Code_otoplenie.docx
+++ b/heating-report/Code_otoplenie.docx
@@ -87,6 +87,10 @@
         <w:br/>
         <w:t>var STATUS_OK = '✓ сходится';</w:t>
         <w:br/>
+        <w:t>var COLOR_WARN_BG = '#fff2cc';</w:t>
+        <w:br/>
+        <w:t>var COLOR_WARN_FONT = '#b45f06';</w:t>
+        <w:br/>
         <w:br/>
         <w:t>var COLOR_INPUT_BG = '#fff2cc';</w:t>
         <w:br/>
@@ -1615,13 +1619,54 @@
         <w:t xml:space="preserve">  });</w:t>
         <w:br/>
         <w:br/>
+        <w:t xml:space="preserve">  // Проверка сверхлимита: счёт без сверхлимита ÷ м³ газа должен быть близок к обычной цене газа этого ЖК</w:t>
+        <w:br/>
+        <w:t xml:space="preserve">  Object.keys(groups).forEach(function (name) {</w:t>
+        <w:br/>
+        <w:t xml:space="preserve">    var prices = [];</w:t>
+        <w:br/>
+        <w:t xml:space="preserve">    groups[name].forEach(function (c) { if (c.gas &gt; 0 &amp;&amp; c.bill &gt; 0) prices.push((c.bill - c.olFact) / c.gas); });</w:t>
+        <w:br/>
+        <w:t xml:space="preserve">    if (prices.length &lt; 3) return;</w:t>
+        <w:br/>
+        <w:t xml:space="preserve">    var sorted = prices.slice().sort(function (x, y) { return x - y; });</w:t>
+        <w:br/>
+        <w:t xml:space="preserve">    var median = sorted[Math.floor(sorted.length / 2)];</w:t>
+        <w:br/>
+        <w:t xml:space="preserve">    groups[name].forEach(function (c) {</w:t>
+        <w:br/>
+        <w:t xml:space="preserve">      if (!(c.gas &gt; 0 &amp;&amp; c.bill &gt; 0) || !(median &gt; 0)) return;</w:t>
+        <w:br/>
+        <w:t xml:space="preserve">      var pr = (c.bill - c.olFact) / c.gas;</w:t>
+        <w:br/>
+        <w:t xml:space="preserve">      if (c.olFact &gt; 0 &amp;&amp; pr &lt; 0.6 * median) {</w:t>
+        <w:br/>
+        <w:t xml:space="preserve">        c.warnings.push('без сверхлимита газ выходит ' + fmt_(pr, 2) + ' грн/м³ при обычных ~' + fmt_(median, 2) +</w:t>
+        <w:br/>
+        <w:t xml:space="preserve">          ' — похоже, сверхлимита в этом счёте меньше, чем указано');</w:t>
+        <w:br/>
+        <w:t xml:space="preserve">      } else if (pr &gt; 1.6 * median) {</w:t>
+        <w:br/>
+        <w:t xml:space="preserve">        c.warnings.push('без сверхлимита газ выходит ' + fmt_(pr, 2) + ' грн/м³ при обычных ~' + fmt_(median, 2) +</w:t>
+        <w:br/>
+        <w:t xml:space="preserve">          ' — похоже, в счёте есть сверхлимит, не указанный в ВВОДе');</w:t>
+        <w:br/>
+        <w:t xml:space="preserve">      }</w:t>
+        <w:br/>
+        <w:t xml:space="preserve">    });</w:t>
+        <w:br/>
+        <w:t xml:space="preserve">  });</w:t>
+        <w:br/>
+        <w:br/>
         <w:t xml:space="preserve">  // Тарифы</w:t>
         <w:br/>
         <w:t xml:space="preserve">  rows.forEach(function (c) {</w:t>
         <w:br/>
         <w:t xml:space="preserve">    if (!c.errors.length) calcTariffs_(c, c.obj, cfg, boilerFn);</w:t>
         <w:br/>
-        <w:t xml:space="preserve">    c.status = c.errors.length ? '⚠ ' + c.errors.join('; ') : STATUS_OK;</w:t>
+        <w:t xml:space="preserve">    c.status = c.errors.length ? '⚠ ' + c.errors.join('; ') :</w:t>
+        <w:br/>
+        <w:t xml:space="preserve">      STATUS_OK + (c.warnings.length ? ' · проверьте: ' + c.warnings.join('; ') : '');</w:t>
         <w:br/>
         <w:t xml:space="preserve">  });</w:t>
         <w:br/>
@@ -1647,7 +1692,7 @@
         <w:br/>
         <w:t xml:space="preserve">  return {</w:t>
         <w:br/>
-        <w:t xml:space="preserve">    rowNum: rowNum, errors: [], month: '', monthIdx: -1, receipt: '', objName: '', obj: null, order: 9999,</w:t>
+        <w:t xml:space="preserve">    rowNum: rowNum, errors: [], warnings: [], month: '', monthIdx: -1, receipt: '', objName: '', obj: null, order: 9999,</w:t>
         <w:br/>
         <w:t xml:space="preserve">    bill: null, olFact: null, olAdd: null, olSurcharge: null, olNoMeter: null, priceBase: null, gas: null, gkalHouse: null, areaTotal: null, areaMeter: null,</w:t>
         <w:br/>
@@ -1720,6 +1765,12 @@
         <w:br/>
         <w:t xml:space="preserve">  var complete = base0[n - 1] !== null; // март введён — сезон закрыт</w:t>
         <w:br/>
+        <w:t xml:space="preserve">  // Месяцы без газа и без счёта в сглаживании не участвуют: их вес 0</w:t>
+        <w:br/>
+        <w:t xml:space="preserve">  var weights = cfg.weights.map(function (w, k) { return geom[k] &amp;&amp; geom[k].zero ? 0 : w; });</w:t>
+        <w:br/>
+        <w:t xml:space="preserve">  cfg = { params: cfg.params, weights: weights, sums: cfg.sums };</w:t>
+        <w:br/>
         <w:t xml:space="preserve">  var seasonAmount = complete ? factTotal : Math.max(plan || 0, factTotal);</w:t>
         <w:br/>
         <w:t xml:space="preserve">  var estimated = false;</w:t>
@@ -1766,6 +1817,8 @@
         <w:br/>
         <w:t xml:space="preserve">    entered.forEach(function (k) { if (!geom[k] || !geom[k].ok) geomOk = false; });</w:t>
         <w:br/>
+        <w:t xml:space="preserve">    if (geomOk &amp;&amp; !entered.some(function (k) { return !geom[k].zero; })) geomOk = false;</w:t>
+        <w:br/>
         <w:t xml:space="preserve">    if (P.profileTarget !== TARGET_BASE &amp;&amp; geomOk) {</w:t>
         <w:br/>
         <w:t xml:space="preserve">      split = splitAllocation_(b, geom, entered, boilers, cfg, seasonAmount, objType, g);</w:t>
@@ -1974,11 +2027,13 @@
         <w:br/>
         <w:t xml:space="preserve">  var avg = { indivPerW: 0, restShare: 0, denom: 0, total: 0, p0: 0 };</w:t>
         <w:br/>
-        <w:t xml:space="preserve">  entered.forEach(function (k) {</w:t>
+        <w:t xml:space="preserve">  var real = entered.filter(function (k) { return !geom[k].zero; });</w:t>
+        <w:br/>
+        <w:t xml:space="preserve">  real.forEach(function (k) {</w:t>
         <w:br/>
         <w:t xml:space="preserve">    var gm = geom[k];</w:t>
         <w:br/>
-        <w:t xml:space="preserve">    var e = entered.length;</w:t>
+        <w:t xml:space="preserve">    var e = real.length;</w:t>
         <w:br/>
         <w:t xml:space="preserve">    if (objType !== TYPE_AREA) {</w:t>
         <w:br/>
@@ -2000,7 +2055,11 @@
         <w:br/>
         <w:t xml:space="preserve">  for (i = 0; i &lt; n; i++) {</w:t>
         <w:br/>
-        <w:t xml:space="preserve">    if (geom[i] &amp;&amp; geom[i].ok) {</w:t>
+        <w:t xml:space="preserve">    if (geom[i] &amp;&amp; geom[i].ok &amp;&amp; geom[i].zero) {</w:t>
+        <w:br/>
+        <w:t xml:space="preserve">      G.push({ ok: true, zero: true, indiv: 0, rest: 0, gk: 0, denom: avg.denom || 1, total: avg.total || 1 });</w:t>
+        <w:br/>
+        <w:t xml:space="preserve">    } else if (geom[i] &amp;&amp; geom[i].ok) {</w:t>
         <w:br/>
         <w:t xml:space="preserve">      G.push(geom[i]);</w:t>
         <w:br/>
@@ -2037,7 +2096,7 @@
         <w:br/>
         <w:t xml:space="preserve">    noAmount = flat * sumRest;</w:t>
         <w:br/>
-        <w:t xml:space="preserve">    for (i = 0; i &lt; n; i++) p0.push(G[i].indiv &gt; 0 ? g * b0[i] / G[i].indiv : avg.p0);</w:t>
+        <w:t xml:space="preserve">    for (i = 0; i &lt; n; i++) p0.push(G[i].indiv &gt; 0 ? g * b0[i] / G[i].indiv : (G[i].zero ? 0 : avg.p0));</w:t>
         <w:br/>
         <w:t xml:space="preserve">  }</w:t>
         <w:br/>
@@ -2073,9 +2132,9 @@
         <w:br/>
         <w:t xml:space="preserve">    var c = boil(i) + gasNoMeter / gm2.denom + (common ? gasAll / g * fm / gm2.total : 0);</w:t>
         <w:br/>
-        <w:t xml:space="preserve">    a.push(cfg.weights[i] / m);</w:t>
-        <w:br/>
-        <w:t xml:space="preserve">    c0.push(c / m);</w:t>
+        <w:t xml:space="preserve">    a.push(G[i].zero ? 0 : cfg.weights[i] / m);</w:t>
+        <w:br/>
+        <w:t xml:space="preserve">    c0.push(G[i].zero ? 0 : c / m);</w:t>
         <w:br/>
         <w:t xml:space="preserve">  }</w:t>
         <w:br/>
@@ -2116,7 +2175,19 @@
         <w:br/>
         <w:t xml:space="preserve">  var denom = no + P.kSpch * spch;</w:t>
         <w:br/>
-        <w:t xml:space="preserve">  var res = { ok: false, indiv: 0, rest: 0, gk: c.gkalMeter || 0, denom: denom, total: c.areaTotal || 0 };</w:t>
+        <w:t xml:space="preserve">  var res = { ok: false, zero: false, indiv: 0, rest: 0, gk: c.gkalMeter || 0, denom: denom, total: c.areaTotal || 0 };</w:t>
+        <w:br/>
+        <w:t xml:space="preserve">  // Месяц без газа и без счёта: в сглаживании не участвует (вес 0)</w:t>
+        <w:br/>
+        <w:t xml:space="preserve">  if (Math.abs((c.bill || 0) - (c.olFact || 0)) &lt; 0.005 &amp;&amp; !(c.gas &gt; 0) &amp;&amp; !(c.gkalHouse &gt; 0)) {</w:t>
+        <w:br/>
+        <w:t xml:space="preserve">    res.ok = true;</w:t>
+        <w:br/>
+        <w:t xml:space="preserve">    res.zero = true;</w:t>
+        <w:br/>
+        <w:t xml:space="preserve">    return res;</w:t>
+        <w:br/>
+        <w:t xml:space="preserve">  }</w:t>
         <w:br/>
         <w:t xml:space="preserve">  if (!(denom &gt; 0) || !(res.total &gt; 0)) return res;</w:t>
         <w:br/>
@@ -2132,17 +2203,42 @@
         <w:br/>
         <w:t xml:space="preserve">  if (!(norm &gt; 0)) return res;</w:t>
         <w:br/>
-        <w:t xml:space="preserve">  res.indiv = norm * share;</w:t>
-        <w:br/>
-        <w:t xml:space="preserve">  res.rest = res.indiv - res.gk;</w:t>
-        <w:br/>
-        <w:t xml:space="preserve">  res.ok = res.rest &gt;= 0;</w:t>
+        <w:t xml:space="preserve">  var r = effectiveRest_(norm * share, res.gk, c.areaMeter || 0, denom);</w:t>
+        <w:br/>
+        <w:t xml:space="preserve">  res.rest = r.rest;</w:t>
+        <w:br/>
+        <w:t xml:space="preserve">  res.indiv = res.gk + r.rest;</w:t>
+        <w:br/>
+        <w:t xml:space="preserve">  res.ok = res.indiv &gt; 0;</w:t>
         <w:br/>
         <w:t xml:space="preserve">  return res;</w:t>
         <w:br/>
         <w:t>}</w:t>
         <w:br/>
         <w:br/>
+        <w:t>/**</w:t>
+        <w:br/>
+        <w:t xml:space="preserve"> * Остаток Гкал на квартиры без счётчиков и СПЧ. Обычно = индивидуальная часть норматива − Гкал по счётчикам.</w:t>
+        <w:br/>
+        <w:t xml:space="preserve"> * Если счётчики показали больше индивидуальной части норматива, остаток отрицательный — тогда квартиры без</w:t>
+        <w:br/>
+        <w:t xml:space="preserve"> * счётчиков считаем по среднему потреблению квартир со счётчиками на м² (с коэффициентом для СПЧ).</w:t>
+        <w:br/>
+        <w:t xml:space="preserve"> */</w:t>
+        <w:br/>
+        <w:t>function effectiveRest_(indiv, gkMeter, meterArea, denom) {</w:t>
+        <w:br/>
+        <w:t xml:space="preserve">  var rest = indiv - gkMeter;</w:t>
+        <w:br/>
+        <w:t xml:space="preserve">  if (rest &gt;= 0) return { rest: rest, byMeters: false };</w:t>
+        <w:br/>
+        <w:t xml:space="preserve">  var perM2 = meterArea &gt; 0 ? gkMeter / meterArea : 0;</w:t>
+        <w:br/>
+        <w:t xml:space="preserve">  return { rest: perM2 * denom, byMeters: true };</w:t>
+        <w:br/>
+        <w:t>}</w:t>
+        <w:br/>
+        <w:br/>
         <w:t>/** Тарифы одной строки ЖК × месяц. Ошибки складываются в c.errors. */</w:t>
         <w:br/>
         <w:t>function calcTariffs_(c, obj, cfg, boilerFn) {</w:t>
@@ -2160,7 +2256,7 @@
         <w:br/>
         <w:t xml:space="preserve">  c.base = baseNoOl + (c.olAdd || 0);</w:t>
         <w:br/>
-        <w:t xml:space="preserve">  if (!(c.base &gt; 0)) c.errors.push('база распределения ≤ 0');</w:t>
+        <w:t xml:space="preserve">  if (c.base &lt; -0.005) c.errors.push('база распределения меньше 0');</w:t>
         <w:br/>
         <w:br/>
         <w:t xml:space="preserve">  var total = c.areaTotal;</w:t>
@@ -2239,7 +2335,9 @@
         <w:br/>
         <w:t xml:space="preserve">    if (gkalMeter &gt; 0 || meter &gt; 0) {</w:t>
         <w:br/>
-        <w:t xml:space="preserve">      c.errors.push('учёт по м²: «Площадь со счётчиками» и «Гкал по квартирным счётчикам» должны быть пустыми');</w:t>
+        <w:t xml:space="preserve">      c.errors.push('учёт по м²: счётчиков нет — площадь ' + fmt_(meter, 2) + ' перенесите из «Площадь со счётчиками» ' +</w:t>
+        <w:br/>
+        <w:t xml:space="preserve">        'в «Площадь без счётчиков», «Гкал по квартирным счётчикам» оставьте пустыми');</w:t>
         <w:br/>
         <w:t xml:space="preserve">      return;</w:t>
         <w:br/>
@@ -2259,600 +2357,626 @@
         <w:br/>
         <w:t xml:space="preserve">    if (!(c.norm &gt; 0)) {</w:t>
         <w:br/>
-        <w:t xml:space="preserve">      c.errors.push('нет объёма газа (или Гкал по общедомовому счётчику) для норматива');</w:t>
+        <w:t xml:space="preserve">      if (Math.abs(baseNoOl) &lt; 0.005 &amp;&amp; !(c.olAdd &gt; 0)) {</w:t>
+        <w:br/>
+        <w:t xml:space="preserve">        // Газа в месяце не было и счёта нет — газовые тарифы нулевые, содержание котельной платят как обычно</w:t>
+        <w:br/>
+        <w:t xml:space="preserve">        c.normSrc = 'газа не было';</w:t>
+        <w:br/>
+        <w:t xml:space="preserve">        c.tNo = 0;</w:t>
+        <w:br/>
+        <w:t xml:space="preserve">      } else {</w:t>
+        <w:br/>
+        <w:t xml:space="preserve">        c.errors.push('есть счёт ' + fmt_(c.bill, 2) + ' грн, но нет норматива: внесите «Объём газа, м³»' +</w:t>
+        <w:br/>
+        <w:t xml:space="preserve">          ' (для тепла по Гкал — «Гкал по общедомовому счётчику»). Если газа в месяце не было, счёт должен быть 0');</w:t>
+        <w:br/>
+        <w:t xml:space="preserve">        return;</w:t>
+        <w:br/>
+        <w:t xml:space="preserve">      }</w:t>
+        <w:br/>
+        <w:t xml:space="preserve">    }</w:t>
+        <w:br/>
+        <w:t xml:space="preserve">    if (gkalMeter &gt; 0 &amp;&amp; !(meter &gt; 0)) {</w:t>
+        <w:br/>
+        <w:t xml:space="preserve">      c.errors.push('есть Гкал по квартирным счётчикам, но площадь со счётчиками пустая');</w:t>
         <w:br/>
         <w:t xml:space="preserve">      return;</w:t>
         <w:br/>
         <w:t xml:space="preserve">    }</w:t>
         <w:br/>
-        <w:t xml:space="preserve">    if (gkalMeter &gt; 0 &amp;&amp; !(meter &gt; 0)) {</w:t>
-        <w:br/>
-        <w:t xml:space="preserve">      c.errors.push('есть Гкал по квартирным счётчикам, но площадь со счётчиками пустая');</w:t>
+        <w:t xml:space="preserve">  }</w:t>
+        <w:br/>
+        <w:t xml:space="preserve">  if (obj.type !== TYPE_AREA &amp;&amp; c.norm &gt; 0) {</w:t>
+        <w:br/>
+        <w:t xml:space="preserve">    var r = effectiveRest_(c.norm * share, gkalMeter, meter, denom);</w:t>
+        <w:br/>
+        <w:t xml:space="preserve">    c.restGkal = r.rest;</w:t>
+        <w:br/>
+        <w:t xml:space="preserve">    if (r.byMeters) {</w:t>
+        <w:br/>
+        <w:t xml:space="preserve">      c.warnings.push('Гкал по счётчикам (' + fmt_(gkalMeter, 2) + ') больше индивидуальной части норматива (' +</w:t>
+        <w:br/>
+        <w:t xml:space="preserve">        fmt_(c.norm * share, 2) + ') — квартиры без счётчиков посчитаны по среднему потреблению квартир со счётчиками');</w:t>
+        <w:br/>
+        <w:t xml:space="preserve">    }</w:t>
+        <w:br/>
+        <w:t xml:space="preserve">    var indivEff = gkalMeter + c.restGkal;</w:t>
+        <w:br/>
+        <w:t xml:space="preserve">    // Цена Гкал = цена счёта без сверхлимита + надбавка сверхлимита (одинаковая на весь сезон)</w:t>
+        <w:br/>
+        <w:t xml:space="preserve">    c.priceBase = g * baseNoOl / indivEff;</w:t>
+        <w:br/>
+        <w:t xml:space="preserve">    priceExact = c.priceBase + (c.olSurcharge || 0);</w:t>
+        <w:br/>
+        <w:t xml:space="preserve">    c.price = round_(priceExact, dP);</w:t>
+        <w:br/>
+        <w:t xml:space="preserve">    var noMeterAmount = c.restGkal * c.priceBase + addNo;</w:t>
+        <w:br/>
+        <w:t xml:space="preserve">    if (denom &gt; 0) {</w:t>
+        <w:br/>
+        <w:t xml:space="preserve">      c.tNo = round_(noMeterAmount / denom, dA);</w:t>
+        <w:br/>
+        <w:t xml:space="preserve">    } else if (Math.abs(noMeterAmount) &gt; P.tol) {</w:t>
+        <w:br/>
+        <w:t xml:space="preserve">      c.errors.push('остаток Гкал некому распределить: нет площади без счётчиков и СПЧ');</w:t>
         <w:br/>
         <w:t xml:space="preserve">      return;</w:t>
         <w:br/>
+        <w:t xml:space="preserve">    } else {</w:t>
+        <w:br/>
+        <w:t xml:space="preserve">      c.tNo = 0;</w:t>
+        <w:br/>
         <w:t xml:space="preserve">    }</w:t>
         <w:br/>
-        <w:t xml:space="preserve">    var indiv = c.norm * share;</w:t>
-        <w:br/>
-        <w:t xml:space="preserve">    // Цена Гкал = цена счёта без сверхлимита + надбавка сверхлимита (одинаковая на весь сезон)</w:t>
-        <w:br/>
-        <w:t xml:space="preserve">    c.priceBase = g * baseNoOl / indiv;</w:t>
-        <w:br/>
-        <w:t xml:space="preserve">    priceExact = c.priceBase + (c.olSurcharge || 0);</w:t>
-        <w:br/>
-        <w:t xml:space="preserve">    c.price = round_(priceExact, dP);</w:t>
-        <w:br/>
-        <w:t xml:space="preserve">    c.restGkal = indiv - gkalMeter;</w:t>
-        <w:br/>
-        <w:t xml:space="preserve">    if (c.restGkal &lt; 0) {</w:t>
-        <w:br/>
-        <w:t xml:space="preserve">      c.errors.push('Гкал по квартирным счётчикам (' + fmt_(gkalMeter, 2) + ') больше индивидуальной части норматива (' +</w:t>
-        <w:br/>
-        <w:t xml:space="preserve">        fmt_(indiv, 2) + ')');</w:t>
-        <w:br/>
-        <w:t xml:space="preserve">      return;</w:t>
+        <w:t xml:space="preserve">  }</w:t>
+        <w:br/>
+        <w:t xml:space="preserve">  c.tSpch = round_(c.tNo * P.kSpch, dA);</w:t>
+        <w:br/>
+        <w:br/>
+        <w:t xml:space="preserve">  c.charged = (c.price || 0) * gkalMeter + c.tNo * no + c.tSpch * spch + (c.tCommon || 0) * total;</w:t>
+        <w:br/>
+        <w:t xml:space="preserve">  c.diff = c.charged - c.base;</w:t>
+        <w:br/>
+        <w:t xml:space="preserve">  c.tol = P.tol + 0.5 * Math.pow(10, -dA) * ((common ? total : 0) + no + spch) + 0.5 * Math.pow(10, -dP) * gkalMeter;</w:t>
+        <w:br/>
+        <w:t xml:space="preserve">  if (Math.abs(c.diff) &gt; c.tol) {</w:t>
+        <w:br/>
+        <w:t xml:space="preserve">    c.errors.push('расхождение ' + fmt_(c.diff, 2) + ' грн больше допуска ' + fmt_(c.tol, 2) + ' грн');</w:t>
+        <w:br/>
+        <w:t xml:space="preserve">  }</w:t>
+        <w:br/>
+        <w:t>}</w:t>
+        <w:br/>
+        <w:br/>
+        <w:t>// ---------- Запись результатов ----------</w:t>
+        <w:br/>
+        <w:br/>
+        <w:t>function writeReport_(sheet, cfg, result) {</w:t>
+        <w:br/>
+        <w:t xml:space="preserve">  var W = REPORT_HEADERS.length;</w:t>
+        <w:br/>
+        <w:t xml:space="preserve">  var P = cfg.params;</w:t>
+        <w:br/>
+        <w:t xml:space="preserve">  resetOutput_(sheet);</w:t>
+        <w:br/>
+        <w:t xml:space="preserve">  var info = 'Пересчитано ' + Utilities.formatDate(new Date(), Session.getScriptTimeZone(), 'dd.MM.yyyy HH:mm') +</w:t>
+        <w:br/>
+        <w:t xml:space="preserve">    '. ФСО ' + fmt_(P.fso * 100, 1) + '% + МЗК ' + fmt_(P.mzk * 100, 1) + '% ' +</w:t>
+        <w:br/>
+        <w:t xml:space="preserve">    (P.fsoMode === FSO_COMMON ? 'включены в «Содержание котельной» (на все м²)' :</w:t>
+        <w:br/>
+        <w:t xml:space="preserve">      'включены в газовые тарифы пропорционально газу; «Содержание котельной» = смета') + '. Коэф. СПЧ ' + P.kSpch + '; сглаживание сверхлимита — «' + P.mode + '».';</w:t>
+        <w:br/>
+        <w:t xml:space="preserve">  var rows = [fitRow_([SHEET_REPORT + ': ТАРИФЫ НА ОТОПЛЕНИЕ'], W), fitRow_([info], W), fitRow_(REPORT_HEADERS, W)];</w:t>
+        <w:br/>
+        <w:t xml:space="preserve">  sheet.getRange(1, 1, rows.length, W).setValues(rows);</w:t>
+        <w:br/>
+        <w:t xml:space="preserve">  formatOutputHeader_(sheet, REPORT_HEADER_ROW, W);</w:t>
+        <w:br/>
+        <w:br/>
+        <w:t xml:space="preserve">  var data = result.rows.map(function (c) {</w:t>
+        <w:br/>
+        <w:t xml:space="preserve">    return fitRow_([</w:t>
+        <w:br/>
+        <w:t xml:space="preserve">      c.month, c.receipt, c.objName, blank_(c.bill), blank_(c.boilerTotal), blank_(c.price),</w:t>
+        <w:br/>
+        <w:t xml:space="preserve">      blank_(c.tNo), blank_(c.tSpch), blank_(c.charged), blank_(c.diff), c.status</w:t>
+        <w:br/>
+        <w:t xml:space="preserve">    ], W);</w:t>
+        <w:br/>
+        <w:t xml:space="preserve">  });</w:t>
+        <w:br/>
+        <w:t xml:space="preserve">  if (!data.length) return;</w:t>
+        <w:br/>
+        <w:t xml:space="preserve">  var first = REPORT_HEADER_ROW + 1;</w:t>
+        <w:br/>
+        <w:t xml:space="preserve">  var range = sheet.getRange(first, 1, data.length, W);</w:t>
+        <w:br/>
+        <w:t xml:space="preserve">  range.setValues(data);</w:t>
+        <w:br/>
+        <w:t xml:space="preserve">  sheet.getRange(first, 4, data.length, 1).setNumberFormat('#,##0.00');</w:t>
+        <w:br/>
+        <w:t xml:space="preserve">  sheet.getRange(first, 5, data.length, 4).setNumberFormat('0.00');</w:t>
+        <w:br/>
+        <w:t xml:space="preserve">  sheet.getRange(first, 9, data.length, 2).setNumberFormat('#,##0.00');</w:t>
+        <w:br/>
+        <w:t xml:space="preserve">  paintStatus_(sheet, first, result.rows, W);</w:t>
+        <w:br/>
+        <w:t xml:space="preserve">  sheet.setColumnWidths(1, 3, 110);</w:t>
+        <w:br/>
+        <w:t xml:space="preserve">  sheet.setColumnWidths(4, W - 4, 130);</w:t>
+        <w:br/>
+        <w:t xml:space="preserve">  sheet.setColumnWidth(W, 360);</w:t>
+        <w:br/>
+        <w:t xml:space="preserve">  sheet.getRange(first, W, data.length, 1).setWrap(true);</w:t>
+        <w:br/>
+        <w:t>}</w:t>
+        <w:br/>
+        <w:br/>
+        <w:t>function writeDetails_(sheet, cfg, result) {</w:t>
+        <w:br/>
+        <w:t xml:space="preserve">  var W = DETAILS_HEADERS.length;</w:t>
+        <w:br/>
+        <w:t xml:space="preserve">  var P = cfg.params;</w:t>
+        <w:br/>
+        <w:t xml:space="preserve">  resetOutput_(sheet);</w:t>
+        <w:br/>
+        <w:t xml:space="preserve">  var rows = [</w:t>
+        <w:br/>
+        <w:t xml:space="preserve">    fitRow_([SHEET_DETAILS], W),</w:t>
+        <w:br/>
+        <w:t xml:space="preserve">    fitRow_(['Техника расчёта для проверки. В ячейках — формулы: щёлкните по числу, чтобы увидеть, откуда оно берётся. ' +</w:t>
+        <w:br/>
+        <w:t xml:space="preserve">      'Режим сглаживания: «' + P.mode + '», профиль применяется к «' + P.profileTarget + '»; ФСО+МЗК — «' + P.fsoMode + '».'], W),</w:t>
+        <w:br/>
+        <w:t xml:space="preserve">    fitRow_(DETAILS_HEADERS, W)</w:t>
+        <w:br/>
+        <w:t xml:space="preserve">  ];</w:t>
+        <w:br/>
+        <w:t xml:space="preserve">  var first = DETAILS_HEADER_ROW + 1;</w:t>
+        <w:br/>
+        <w:t xml:space="preserve">  var detailCount = result.rows.length;</w:t>
+        <w:br/>
+        <w:t xml:space="preserve">  // Блок сверки сверхлимита идёт после строк расчёта: пустая строка, заголовок блока, шапка, строки ЖК</w:t>
+        <w:br/>
+        <w:t xml:space="preserve">  var olTitleRow = first + detailCount + 1;</w:t>
+        <w:br/>
+        <w:t xml:space="preserve">  var olHeaderRow = olTitleRow + 1;</w:t>
+        <w:br/>
+        <w:t xml:space="preserve">  var olRowByObj = {};</w:t>
+        <w:br/>
+        <w:t xml:space="preserve">  result.overlimit.forEach(function (a, k) { olRowByObj[a.obj.name] = olHeaderRow + 1 + k; });</w:t>
+        <w:br/>
+        <w:t xml:space="preserve">  var formulaRows = [];</w:t>
+        <w:br/>
+        <w:br/>
+        <w:t xml:space="preserve">  result.rows.forEach(function (c, k) {</w:t>
+        <w:br/>
+        <w:t xml:space="preserve">    var r = first + k;</w:t>
+        <w:br/>
+        <w:t xml:space="preserve">    var values = [</w:t>
+        <w:br/>
+        <w:t xml:space="preserve">      c.month, c.objName, blank_(c.olFact), blank_(c.olSurcharge), blank_(c.olNoMeter), blank_(c.olAdd), blank_(c.base),</w:t>
+        <w:br/>
+        <w:t xml:space="preserve">      blank_(c.norm), c.normSrc, blank_(c.fsoMzk), blank_(c.tCommon), blank_(c.boiler), blank_(c.priceBase),</w:t>
+        <w:br/>
+        <w:t xml:space="preserve">      blank_(c.price), blank_(c.restGkal), blank_(c.tNo), blank_(c.tSpch),</w:t>
+        <w:br/>
+        <w:t xml:space="preserve">      c.tNo === null ? '' : round_((c.boilerTotal || 0) + c.tNo, P.digitsArea),</w:t>
+        <w:br/>
+        <w:t xml:space="preserve">      blank_(c.charged), blank_(c.diff), blank_(c.tol), c.status</w:t>
+        <w:br/>
+        <w:t xml:space="preserve">    ];</w:t>
+        <w:br/>
+        <w:t xml:space="preserve">    var f = detailFormulas_(c, cfg, r);</w:t>
+        <w:br/>
+        <w:t xml:space="preserve">    if (f) {</w:t>
+        <w:br/>
+        <w:t xml:space="preserve">      // Колонки F…U — формулами (пишутся отдельно через setFormulas), остальные — значениями</w:t>
+        <w:br/>
+        <w:t xml:space="preserve">      for (var j = DETAIL_FORMULA_FIRST_COL - 1; j &lt;= DETAIL_FORMULA_LAST_COL - 1; j++) values[j] = '';</w:t>
+        <w:br/>
+        <w:t xml:space="preserve">      formulaRows.push(f.slice(DETAIL_FORMULA_FIRST_COL - 1, DETAIL_FORMULA_LAST_COL).map(asFormula_));</w:t>
+        <w:br/>
+        <w:t xml:space="preserve">    } else {</w:t>
+        <w:br/>
+        <w:t xml:space="preserve">      formulaRows.push(null);</w:t>
         <w:br/>
         <w:t xml:space="preserve">    }</w:t>
         <w:br/>
-        <w:t xml:space="preserve">    var noMeterAmount = c.restGkal * c.priceBase + addNo;</w:t>
-        <w:br/>
-        <w:t xml:space="preserve">    if (denom &gt; 0) {</w:t>
-        <w:br/>
-        <w:t xml:space="preserve">      c.tNo = round_(noMeterAmount / denom, dA);</w:t>
-        <w:br/>
-        <w:t xml:space="preserve">    } else if (Math.abs(noMeterAmount) &gt; P.tol) {</w:t>
-        <w:br/>
-        <w:t xml:space="preserve">      c.errors.push('остаток Гкал некому распределить: нет площади без счётчиков и СПЧ');</w:t>
-        <w:br/>
-        <w:t xml:space="preserve">      return;</w:t>
-        <w:br/>
-        <w:t xml:space="preserve">    } else {</w:t>
-        <w:br/>
-        <w:t xml:space="preserve">      c.tNo = 0;</w:t>
-        <w:br/>
-        <w:t xml:space="preserve">    }</w:t>
+        <w:t xml:space="preserve">    rows.push(fitRow_(values, W));</w:t>
+        <w:br/>
+        <w:t xml:space="preserve">  });</w:t>
+        <w:br/>
+        <w:t xml:space="preserve">  rows.push(fitRow_([], W));</w:t>
+        <w:br/>
+        <w:t xml:space="preserve">  rows.push(fitRow_(['СВЕРКА СВЕРХЛИМИТА ЗА СЕЗОН'], W));</w:t>
+        <w:br/>
+        <w:t xml:space="preserve">  rows.push(fitRow_(['ЖК', 'План на сезон, грн', 'Факт в счетах, грн', 'Сумма к разнесению, грн', 'Разнесено всего, грн']</w:t>
+        <w:br/>
+        <w:t xml:space="preserve">    .concat(SEASON_MONTHS).concat(['Март введён (сезон закрыт)', 'Надбавка к цене Гкал на сезон, грн/Гкал',</w:t>
+        <w:br/>
+        <w:t xml:space="preserve">      'Профиль применён к', 'Примечание']), W));</w:t>
+        <w:br/>
+        <w:t xml:space="preserve">  result.overlimit.forEach(function (a) {</w:t>
+        <w:br/>
+        <w:t xml:space="preserve">    var note = [];</w:t>
+        <w:br/>
+        <w:t xml:space="preserve">    if (a.estimated) note.push('невведённые месяцы оценены по профилю — добавки уточнятся с новыми счетами');</w:t>
+        <w:br/>
+        <w:t xml:space="preserve">    if (a.fallback) note.push('квитанцию посчитать нельзя (нет площадей / норматива), профиль взят по базе');</w:t>
+        <w:br/>
+        <w:t xml:space="preserve">    if (a.trueUp) note.push('март доведён до факта сезона');</w:t>
+        <w:br/>
+        <w:t xml:space="preserve">    if (!a.entered) note.push('нет введённых месяцев');</w:t>
+        <w:br/>
+        <w:t xml:space="preserve">    var r = olRowByObj[a.obj.name];</w:t>
+        <w:br/>
+        <w:t xml:space="preserve">    rows.push(fitRow_([a.obj.name, a.plan, a.factTotal, a.seasonAmount, a.allocated]</w:t>
+        <w:br/>
+        <w:t xml:space="preserve">      .concat(a.adds.map(blank_)).concat([a.complete ? 'Да' : 'Нет', blank_(a.flatSurcharge), a.target || '',</w:t>
+        <w:br/>
+        <w:t xml:space="preserve">        note.join('; ')]), W));</w:t>
+        <w:br/>
+        <w:t xml:space="preserve">  });</w:t>
+        <w:br/>
+        <w:t xml:space="preserve">  var lastRow = rows.length;</w:t>
+        <w:br/>
+        <w:t xml:space="preserve">  rows.push(fitRow_([], W));</w:t>
+        <w:br/>
+        <w:t xml:space="preserve">  var legendRow = rows.length + 1;</w:t>
+        <w:br/>
+        <w:t xml:space="preserve">  rows.push(fitRow_(['КАК СЧИТАЕТСЯ'], W));</w:t>
+        <w:br/>
+        <w:t xml:space="preserve">  detailLegend_(P).forEach(function (line) { rows.push(fitRow_(line, W)); });</w:t>
+        <w:br/>
+        <w:br/>
+        <w:t xml:space="preserve">  sheet.getRange(1, 1, rows.length, W).setValues(rows);</w:t>
+        <w:br/>
+        <w:t xml:space="preserve">  // Формулы пишем через setFormulas: так Google читает их в английском синтаксисе (запятые, точка)</w:t>
+        <w:br/>
+        <w:t xml:space="preserve">  // при любой локали таблицы. Через setValues формула разбиралась бы по правилам локали и ломалась.</w:t>
+        <w:br/>
+        <w:t xml:space="preserve">  formulaRows.forEach(function (fr, k) {</w:t>
+        <w:br/>
+        <w:t xml:space="preserve">    if (fr) sheet.getRange(first + k, DETAIL_FORMULA_FIRST_COL, 1, fr.length).setFormulas([fr]);</w:t>
+        <w:br/>
+        <w:t xml:space="preserve">  });</w:t>
+        <w:br/>
+        <w:t xml:space="preserve">  formatOutputHeader_(sheet, DETAILS_HEADER_ROW, W);</w:t>
+        <w:br/>
+        <w:br/>
+        <w:t xml:space="preserve">  if (detailCount) {</w:t>
+        <w:br/>
+        <w:t xml:space="preserve">    sheet.getRange(first, 3, detailCount, 1).setNumberFormat('#,##0.00');</w:t>
+        <w:br/>
+        <w:t xml:space="preserve">    sheet.getRange(first, 4, detailCount, 1).setNumberFormat('#,##0.00');</w:t>
+        <w:br/>
+        <w:t xml:space="preserve">    sheet.getRange(first, 5, detailCount, 3).setNumberFormat('#,##0.00');</w:t>
+        <w:br/>
+        <w:t xml:space="preserve">    sheet.getRange(first, 8, detailCount, 1).setNumberFormat('#,##0.0000');</w:t>
+        <w:br/>
+        <w:t xml:space="preserve">    sheet.getRange(first, 10, detailCount, 1).setNumberFormat('#,##0.00');</w:t>
+        <w:br/>
+        <w:t xml:space="preserve">    sheet.getRange(first, 11, detailCount, 2).setNumberFormat('0.0000');</w:t>
+        <w:br/>
+        <w:t xml:space="preserve">    sheet.getRange(first, 13, detailCount, 2).setNumberFormat('#,##0.00');</w:t>
+        <w:br/>
+        <w:t xml:space="preserve">    sheet.getRange(first, 15, detailCount, 1).setNumberFormat('#,##0.0000');</w:t>
+        <w:br/>
+        <w:t xml:space="preserve">    sheet.getRange(first, 16, detailCount, 3).setNumberFormat('0.00');</w:t>
+        <w:br/>
+        <w:t xml:space="preserve">    sheet.getRange(first, 19, detailCount, 3).setNumberFormat('#,##0.00');</w:t>
+        <w:br/>
+        <w:t xml:space="preserve">    paintStatus_(sheet, first, result.rows, W);</w:t>
         <w:br/>
         <w:t xml:space="preserve">  }</w:t>
         <w:br/>
-        <w:t xml:space="preserve">  c.tSpch = round_(c.tNo * P.kSpch, dA);</w:t>
-        <w:br/>
-        <w:br/>
-        <w:t xml:space="preserve">  c.charged = (c.price || 0) * gkalMeter + c.tNo * no + c.tSpch * spch + (c.tCommon || 0) * total;</w:t>
-        <w:br/>
-        <w:t xml:space="preserve">  c.diff = c.charged - c.base;</w:t>
-        <w:br/>
-        <w:t xml:space="preserve">  c.tol = P.tol + 0.5 * Math.pow(10, -dA) * ((common ? total : 0) + no + spch) + 0.5 * Math.pow(10, -dP) * gkalMeter;</w:t>
-        <w:br/>
-        <w:t xml:space="preserve">  if (Math.abs(c.diff) &gt; c.tol) {</w:t>
-        <w:br/>
-        <w:t xml:space="preserve">    c.errors.push('расхождение ' + fmt_(c.diff, 2) + ' грн больше допуска ' + fmt_(c.tol, 2) + ' грн');</w:t>
+        <w:t xml:space="preserve">  sheet.getRange(olTitleRow, 1).setFontWeight('bold').setFontSize(11);</w:t>
+        <w:br/>
+        <w:t xml:space="preserve">  sheet.getRange(olHeaderRow, 1, 1, 14).setFontWeight('bold').setBackground(COLOR_HEADER_BG).setWrap(true);</w:t>
+        <w:br/>
+        <w:t xml:space="preserve">  if (result.overlimit.length) {</w:t>
+        <w:br/>
+        <w:t xml:space="preserve">    sheet.getRange(olHeaderRow + 1, 2, result.overlimit.length, 9).setNumberFormat('#,##0.00');</w:t>
+        <w:br/>
+        <w:t xml:space="preserve">    sheet.getRange(olHeaderRow + 1, 12, result.overlimit.length, 1).setNumberFormat('#,##0.00');</w:t>
         <w:br/>
         <w:t xml:space="preserve">  }</w:t>
         <w:br/>
+        <w:t xml:space="preserve">  sheet.getRange(legendRow, 1).setFontWeight('bold').setFontSize(11);</w:t>
+        <w:br/>
+        <w:t xml:space="preserve">  sheet.getRange(legendRow + 1, 1, rows.length - legendRow, 1).setFontWeight('bold');</w:t>
+        <w:br/>
+        <w:t xml:space="preserve">  sheet.setColumnWidths(1, W, 115);</w:t>
+        <w:br/>
+        <w:t xml:space="preserve">  sheet.setColumnWidth(W, 360);</w:t>
+        <w:br/>
         <w:t>}</w:t>
         <w:br/>
         <w:br/>
-        <w:t>// ---------- Запись результатов ----------</w:t>
-        <w:br/>
-        <w:br/>
-        <w:t>function writeReport_(sheet, cfg, result) {</w:t>
-        <w:br/>
-        <w:t xml:space="preserve">  var W = REPORT_HEADERS.length;</w:t>
+        <w:t>/**</w:t>
+        <w:br/>
+        <w:t xml:space="preserve"> * Разделитель аргументов в формулах для локали таблицы: в русской, украинской и других локалях</w:t>
+        <w:br/>
+        <w:t xml:space="preserve"> * с десятичной запятой Google ждёт «;», в английской — «,».</w:t>
+        <w:br/>
+        <w:t xml:space="preserve"> */</w:t>
+        <w:br/>
+        <w:t>function formulaSeparator_(ss) {</w:t>
+        <w:br/>
+        <w:t xml:space="preserve">  var locale = String(ss.getSpreadsheetLocale() || '').toLowerCase();</w:t>
+        <w:br/>
+        <w:t xml:space="preserve">  var dotLocales = ['en', 'ja', 'zh', 'ko', 'th', 'he', 'iw', 'hi', 'ms', 'fil', 'ga', 'sw', 'ur', 'bn', 'ta', 'te'];</w:t>
+        <w:br/>
+        <w:t xml:space="preserve">  var lang = locale.split(/[_-]/)[0];</w:t>
+        <w:br/>
+        <w:t xml:space="preserve">  return dotLocales.indexOf(lang) &gt;= 0 ? ',' : ';';</w:t>
+        <w:br/>
+        <w:t>}</w:t>
+        <w:br/>
+        <w:br/>
+        <w:t>/** Значение ячейки как формула для setFormulas: текст → ="текст", число → =число. */</w:t>
+        <w:br/>
+        <w:t>function asFormula_(v) {</w:t>
+        <w:br/>
+        <w:t xml:space="preserve">  if (v === '' || v === null || v === undefined) return '';</w:t>
+        <w:br/>
+        <w:t xml:space="preserve">  if (typeof v === 'number') return '=' + v;</w:t>
+        <w:br/>
+        <w:t xml:space="preserve">  var s = String(v);</w:t>
+        <w:br/>
+        <w:t xml:space="preserve">  if (s.charAt(0) === '=') return s;</w:t>
+        <w:br/>
+        <w:t xml:space="preserve">  return '="' + s.replace(/"/g, '""') + '"';</w:t>
+        <w:br/>
+        <w:t>}</w:t>
+        <w:br/>
+        <w:br/>
+        <w:t>/** Ссылка на ячейку значения параметра на листе НАСТРОЙКИ, или null. */</w:t>
+        <w:br/>
+        <w:t>function settingRef_(cfg, key) {</w:t>
+        <w:br/>
+        <w:t xml:space="preserve">  var r = cfg.paramRow &amp;&amp; cfg.paramRow[key];</w:t>
+        <w:br/>
+        <w:t xml:space="preserve">  return r ? "'" + SHEET_SETTINGS + "'!$B$" + r : null;</w:t>
+        <w:br/>
+        <w:t>}</w:t>
+        <w:br/>
+        <w:br/>
+        <w:t>/**</w:t>
+        <w:br/>
+        <w:t xml:space="preserve"> * Строка ДЕТАЛЕЙ формулами: ссылки на ВВОД, НАСТРОЙКИ, смету и блок сверки сверхлимита.</w:t>
+        <w:br/>
+        <w:t xml:space="preserve"> * Для строк с ошибкой и когда адреса настроек неизвестны возвращает null — тогда пишутся числа.</w:t>
+        <w:br/>
+        <w:t xml:space="preserve"> */</w:t>
+        <w:br/>
+        <w:t>function detailFormulas_(c, cfg, r) {</w:t>
+        <w:br/>
+        <w:t xml:space="preserve">  if (c.errors.length || c.tNo === null) return null;</w:t>
+        <w:br/>
+        <w:t xml:space="preserve">  if (c.obj.type !== TYPE_AREA &amp;&amp; !(c.norm &gt; 0)) return null; // месяц без газа — числами</w:t>
+        <w:br/>
+        <w:t xml:space="preserve">  var keys = ['kcal', 'fso', 'mzk', 'kSpch', 'digitsArea', 'digitsPrice', 'tol'];</w:t>
+        <w:br/>
+        <w:t xml:space="preserve">  var S = {};</w:t>
+        <w:br/>
+        <w:t xml:space="preserve">  for (var k = 0; k &lt; keys.length; k++) {</w:t>
+        <w:br/>
+        <w:t xml:space="preserve">    S[keys[k]] = settingRef_(cfg, keys[k]);</w:t>
+        <w:br/>
+        <w:t xml:space="preserve">    if (!S[keys[k]]) return null;</w:t>
+        <w:br/>
+        <w:t xml:space="preserve">  }</w:t>
         <w:br/>
         <w:t xml:space="preserve">  var P = cfg.params;</w:t>
         <w:br/>
-        <w:t xml:space="preserve">  resetOutput_(sheet);</w:t>
-        <w:br/>
-        <w:t xml:space="preserve">  var info = 'Пересчитано ' + Utilities.formatDate(new Date(), Session.getScriptTimeZone(), 'dd.MM.yyyy HH:mm') +</w:t>
-        <w:br/>
-        <w:t xml:space="preserve">    '. ФСО ' + fmt_(P.fso * 100, 1) + '% + МЗК ' + fmt_(P.mzk * 100, 1) + '% ' +</w:t>
-        <w:br/>
-        <w:t xml:space="preserve">    (P.fsoMode === FSO_COMMON ? 'включены в «Содержание котельной» (на все м²)' :</w:t>
-        <w:br/>
-        <w:t xml:space="preserve">      'включены в газовые тарифы пропорционально газу; «Содержание котельной» = смета') + '. Коэф. СПЧ ' + P.kSpch + '; сглаживание сверхлимита — «' + P.mode + '».';</w:t>
-        <w:br/>
-        <w:t xml:space="preserve">  var rows = [fitRow_([SHEET_REPORT + ': ТАРИФЫ НА ОТОПЛЕНИЕ'], W), fitRow_([info], W), fitRow_(REPORT_HEADERS, W)];</w:t>
-        <w:br/>
-        <w:t xml:space="preserve">  sheet.getRange(1, 1, rows.length, W).setValues(rows);</w:t>
-        <w:br/>
-        <w:t xml:space="preserve">  formatOutputHeader_(sheet, REPORT_HEADER_ROW, W);</w:t>
-        <w:br/>
-        <w:br/>
-        <w:t xml:space="preserve">  var data = result.rows.map(function (c) {</w:t>
-        <w:br/>
-        <w:t xml:space="preserve">    return fitRow_([</w:t>
-        <w:br/>
-        <w:t xml:space="preserve">      c.month, c.receipt, c.objName, blank_(c.bill), blank_(c.boilerTotal), blank_(c.price),</w:t>
-        <w:br/>
-        <w:t xml:space="preserve">      blank_(c.tNo), blank_(c.tSpch), blank_(c.charged), blank_(c.diff), c.status</w:t>
-        <w:br/>
-        <w:t xml:space="preserve">    ], W);</w:t>
-        <w:br/>
-        <w:t xml:space="preserve">  });</w:t>
-        <w:br/>
-        <w:t xml:space="preserve">  if (!data.length) return;</w:t>
-        <w:br/>
-        <w:t xml:space="preserve">  var first = REPORT_HEADER_ROW + 1;</w:t>
-        <w:br/>
-        <w:t xml:space="preserve">  var range = sheet.getRange(first, 1, data.length, W);</w:t>
-        <w:br/>
-        <w:t xml:space="preserve">  range.setValues(data);</w:t>
-        <w:br/>
-        <w:t xml:space="preserve">  sheet.getRange(first, 4, data.length, 1).setNumberFormat('#,##0.00');</w:t>
-        <w:br/>
-        <w:t xml:space="preserve">  sheet.getRange(first, 5, data.length, 4).setNumberFormat('0.00');</w:t>
-        <w:br/>
-        <w:t xml:space="preserve">  sheet.getRange(first, 9, data.length, 2).setNumberFormat('#,##0.00');</w:t>
-        <w:br/>
-        <w:t xml:space="preserve">  paintStatus_(sheet, first, result.rows, W);</w:t>
-        <w:br/>
-        <w:t xml:space="preserve">  sheet.setColumnWidths(1, 3, 110);</w:t>
-        <w:br/>
-        <w:t xml:space="preserve">  sheet.setColumnWidths(4, W - 4, 130);</w:t>
-        <w:br/>
-        <w:t xml:space="preserve">  sheet.setColumnWidth(W, 360);</w:t>
-        <w:br/>
-        <w:t xml:space="preserve">  sheet.getRange(first, W, data.length, 1).setWrap(true);</w:t>
+        <w:t xml:space="preserve">  var obj = c.obj;</w:t>
+        <w:br/>
+        <w:t xml:space="preserve">  var common = P.fsoMode === FSO_COMMON;</w:t>
+        <w:br/>
+        <w:t xml:space="preserve">  var sep = cfg.formulaSep || ','; // разделитель аргументов: «;» для локалей с десятичной запятой</w:t>
+        <w:br/>
+        <w:t xml:space="preserve">  var V = function (idx) { return "N('" + SHEET_INPUT + "'!" + indexToCol_(idx + 1) + c.rowNum + ')'; };</w:t>
+        <w:br/>
+        <w:t xml:space="preserve">  var share = '(1-' + S.fso + '-' + S.mzk + ')';</w:t>
+        <w:br/>
+        <w:t xml:space="preserve">  var gMul = common ? share + '*' : ''; // доля базы, идущая в газ</w:t>
+        <w:br/>
+        <w:t xml:space="preserve">  var billNoOl = "(N('" + SHEET_INPUT + "'!C" + c.rowNum + ')-C' + r + ')';</w:t>
+        <w:br/>
+        <w:t xml:space="preserve">  var denom = '(' + V(IN.AREA_NO) + '+' + S.kSpch + '*' + V(IN.AREA_SPCH) + ')';</w:t>
+        <w:br/>
+        <w:t xml:space="preserve">  var src = "='" + obj.sheetName.replace(/'/g, "''") + "'!" + indexToCol_(obj.novColIndex + c.monthIdx) + obj.rowValue;</w:t>
+        <w:br/>
+        <w:t xml:space="preserve">  var isArea = obj.type === TYPE_AREA;</w:t>
+        <w:br/>
+        <w:br/>
+        <w:t xml:space="preserve">  var norm = '';</w:t>
+        <w:br/>
+        <w:t xml:space="preserve">  if (c.gas &gt; 0) norm = '=' + V(IN.GAS) + '*' + S.kcal;</w:t>
+        <w:br/>
+        <w:t xml:space="preserve">  else if (c.gkalHouse &gt; 0) norm = '=' + V(IN.GKAL_HOUSE);</w:t>
+        <w:br/>
+        <w:br/>
+        <w:t xml:space="preserve">  var olAdd = isArea ? '=E' + r : '=N(D' + r + ')*' + V(IN.GKAL_METER) + '+E' + r;</w:t>
+        <w:br/>
+        <w:t xml:space="preserve">  if (common) olAdd = '=(' + olAdd.substring(1) + ')/' + share;</w:t>
+        <w:br/>
+        <w:br/>
+        <w:t xml:space="preserve">  var priceBase = '';</w:t>
+        <w:br/>
+        <w:t xml:space="preserve">  var price = '';</w:t>
+        <w:br/>
+        <w:t xml:space="preserve">  var rest = '';</w:t>
+        <w:br/>
+        <w:t xml:space="preserve">  var tNo;</w:t>
+        <w:br/>
+        <w:t xml:space="preserve">  if (isArea) {</w:t>
+        <w:br/>
+        <w:t xml:space="preserve">    tNo = '=ROUND((' + gMul + billNoOl + '+E' + r + ')/' + denom + sep + S.digitsArea + ')';</w:t>
+        <w:br/>
+        <w:t xml:space="preserve">  } else {</w:t>
+        <w:br/>
+        <w:t xml:space="preserve">    priceBase = '=' + gMul + billNoOl + '/(' + V(IN.GKAL_METER) + '+O' + r + ')';</w:t>
+        <w:br/>
+        <w:t xml:space="preserve">    price = '=ROUND(M' + r + '+N(D' + r + ')' + sep + S.digitsPrice + ')';</w:t>
+        <w:br/>
+        <w:t xml:space="preserve">    // Если счётчики показали больше индивидуальной части норматива — по среднему потреблению квартир со счётчиками</w:t>
+        <w:br/>
+        <w:t xml:space="preserve">    var restRaw = 'H' + r + '*' + share + '-' + V(IN.GKAL_METER);</w:t>
+        <w:br/>
+        <w:t xml:space="preserve">    rest = '=IF(' + restRaw + '&lt;0' + sep + V(IN.GKAL_METER) + '/' + V(IN.AREA_METER) + '*' + denom + sep + restRaw + ')';</w:t>
+        <w:br/>
+        <w:t xml:space="preserve">    tNo = (c.areaNo || 0) + P.kSpch * (c.areaSpch || 0) &gt; 0</w:t>
+        <w:br/>
+        <w:t xml:space="preserve">      ? '=ROUND((O' + r + '*M' + r + '+E' + r + ')/' + denom + sep + S.digitsArea + ')'</w:t>
+        <w:br/>
+        <w:t xml:space="preserve">      : 0;</w:t>
+        <w:br/>
+        <w:t xml:space="preserve">  }</w:t>
+        <w:br/>
+        <w:t xml:space="preserve">  var tCommon = common ? '=ROUND(J' + r + '/' + V(IN.AREA_TOTAL) + sep + S.digitsArea + ')' : '';</w:t>
+        <w:br/>
+        <w:t xml:space="preserve">  var totalTerm = common ? '+N(K' + r + ')*' + V(IN.AREA_TOTAL) : '';</w:t>
+        <w:br/>
+        <w:t xml:space="preserve">  var tolArea = common ? V(IN.AREA_TOTAL) + '+' : '';</w:t>
+        <w:br/>
+        <w:t xml:space="preserve">  return [</w:t>
+        <w:br/>
+        <w:t xml:space="preserve">    c.month,                                                            // A</w:t>
+        <w:br/>
+        <w:t xml:space="preserve">    c.objName,                                                          // B</w:t>
+        <w:br/>
+        <w:t xml:space="preserve">    '=' + V(IN.OL),                                                     // C сверхлимит факт</w:t>
+        <w:br/>
+        <w:t xml:space="preserve">    blank_(c.olSurcharge),                                              // D надбавка, грн/Гкал (из расчёта)</w:t>
+        <w:br/>
+        <w:t xml:space="preserve">    blank_(c.olNoMeter),                                                // E на квартиры без счётчиков (из расчёта)</w:t>
+        <w:br/>
+        <w:t xml:space="preserve">    olAdd,                                                              // F отнесённый сверхлимит</w:t>
+        <w:br/>
+        <w:t xml:space="preserve">    "=N('" + SHEET_INPUT + "'!C" + c.rowNum + ')-C' + r + '+F' + r,    // G база</w:t>
+        <w:br/>
+        <w:t xml:space="preserve">    norm,                                                               // H норматив</w:t>
+        <w:br/>
+        <w:t xml:space="preserve">    c.normSrc,                                                          // I</w:t>
+        <w:br/>
+        <w:t xml:space="preserve">    '=G' + r + '*(' + S.fso + '+' + S.mzk + ')',                        // J ФСО+МЗК, грн</w:t>
+        <w:br/>
+        <w:t xml:space="preserve">    tCommon,                                                            // K ФСО+МЗК, грн/м²</w:t>
+        <w:br/>
+        <w:t xml:space="preserve">    src,                                                                // L содержание из сметы</w:t>
+        <w:br/>
+        <w:t xml:space="preserve">    priceBase,                                                          // M цена Гкал без надбавки</w:t>
+        <w:br/>
+        <w:t xml:space="preserve">    price,                                                              // N цена Гкал</w:t>
+        <w:br/>
+        <w:t xml:space="preserve">    rest,                                                               // O остаток Гкал</w:t>
+        <w:br/>
+        <w:t xml:space="preserve">    tNo,                                                                // P тариф без счётчика</w:t>
+        <w:br/>
+        <w:t xml:space="preserve">    '=ROUND(P' + r + '*' + S.kSpch + sep + S.digitsArea + ')',          // Q тариф СПЧ</w:t>
+        <w:br/>
+        <w:t xml:space="preserve">    '=ROUND(L' + r + '+N(K' + r + ')' + sep + S.digitsArea + ')+P' + r, // R квитанция без счётчика</w:t>
+        <w:br/>
+        <w:t xml:space="preserve">    '=N(N' + r + ')*' + V(IN.GKAL_METER) + '+P' + r + '*' + V(IN.AREA_NO) + '+Q' + r + '*' + V(IN.AREA_SPCH) + totalTerm, // S</w:t>
+        <w:br/>
+        <w:t xml:space="preserve">    '=S' + r + '-G' + r,                                                // T расхождение</w:t>
+        <w:br/>
+        <w:t xml:space="preserve">    '=' + S.tol + '+(1/2)*10^(-' + S.digitsArea + ')*(' + tolArea + V(IN.AREA_NO) + '+' + V(IN.AREA_SPCH) + ')+(1/2)*10^(-' +</w:t>
+        <w:br/>
+        <w:t xml:space="preserve">      S.digitsPrice + ')*' + V(IN.GKAL_METER),                          // U допуск</w:t>
+        <w:br/>
+        <w:t xml:space="preserve">    c.status                                                            // V</w:t>
+        <w:br/>
+        <w:t xml:space="preserve">  ];</w:t>
         <w:br/>
         <w:t>}</w:t>
         <w:br/>
         <w:br/>
-        <w:t>function writeDetails_(sheet, cfg, result) {</w:t>
-        <w:br/>
-        <w:t xml:space="preserve">  var W = DETAILS_HEADERS.length;</w:t>
-        <w:br/>
-        <w:t xml:space="preserve">  var P = cfg.params;</w:t>
-        <w:br/>
-        <w:t xml:space="preserve">  resetOutput_(sheet);</w:t>
-        <w:br/>
-        <w:t xml:space="preserve">  var rows = [</w:t>
-        <w:br/>
-        <w:t xml:space="preserve">    fitRow_([SHEET_DETAILS], W),</w:t>
-        <w:br/>
-        <w:t xml:space="preserve">    fitRow_(['Техника расчёта для проверки. В ячейках — формулы: щёлкните по числу, чтобы увидеть, откуда оно берётся. ' +</w:t>
-        <w:br/>
-        <w:t xml:space="preserve">      'Режим сглаживания: «' + P.mode + '», профиль применяется к «' + P.profileTarget + '»; ФСО+МЗК — «' + P.fsoMode + '».'], W),</w:t>
-        <w:br/>
-        <w:t xml:space="preserve">    fitRow_(DETAILS_HEADERS, W)</w:t>
+        <w:t>/** Пояснения к колонкам ДЕТАЛЕЙ словами. */</w:t>
+        <w:br/>
+        <w:t>function detailLegend_(P) {</w:t>
+        <w:br/>
+        <w:t xml:space="preserve">  var common = P.fsoMode === FSO_COMMON;</w:t>
+        <w:br/>
+        <w:t xml:space="preserve">  var g = common ? ' × (1 − ФСО − МЗК)' : '';</w:t>
+        <w:br/>
+        <w:t xml:space="preserve">  return [</w:t>
+        <w:br/>
+        <w:t xml:space="preserve">    ['Сверхлимит факт', 'из ВВОДа, колонка «в т.ч. сверхлимит в счёте»'],</w:t>
+        <w:br/>
+        <w:t xml:space="preserve">    ['Надбавка к цене Гкал', 'сверхлимит сезона' + g + ' ÷ все индивидуальные Гкал сезона — одинаковая во всех месяцах ' +</w:t>
+        <w:br/>
+        <w:t xml:space="preserve">      '(в режиме «базе распределения» — добавка месяца ÷ индивидуальные Гкал месяца)'],</w:t>
+        <w:br/>
+        <w:t xml:space="preserve">    ['Сверхлимит на квартиры без счётчиков', 'надбавка × остаток Гкал за сезон, разложенный по месяцам так, чтобы квитанция ' +</w:t>
+        <w:br/>
+        <w:t xml:space="preserve">      'без счётчика шла по весам профиля'],</w:t>
+        <w:br/>
+        <w:t xml:space="preserve">    ['Сверхлимит отнесённый', '(Надбавка × Гкал по квартирным счётчикам + Сверхлимит на квартиры без счётчиков)' +</w:t>
+        <w:br/>
+        <w:t xml:space="preserve">      (common ? ' ÷ (1 − ФСО − МЗК)' : '')],</w:t>
+        <w:br/>
+        <w:t xml:space="preserve">    ['База', 'Счёт поставщика − Сверхлимит факт + Сверхлимит отнесённый'],</w:t>
+        <w:br/>
+        <w:t xml:space="preserve">    ['Норматив, Гкал', 'Объём газа × коэффициент калорийности (для Гавайев — Гкал по общедомовому счётчику)'],</w:t>
+        <w:br/>
+        <w:t xml:space="preserve">    ['ФСО+МЗК, грн', 'База × (ФСО + МЗК)'],</w:t>
+        <w:br/>
+        <w:t xml:space="preserve">    ['ФСО+МЗК, грн/м²', common ? 'ФСО+МЗК, грн ÷ Площадь итого — прибавляется к содержанию котельной' :</w:t>
+        <w:br/>
+        <w:t xml:space="preserve">      'не считается: ФСО+МЗК входит в газовые тарифы пропорционально газу'],</w:t>
+        <w:br/>
+        <w:t xml:space="preserve">    ['Содержание из сметы', 'сезонный лист ЖК, строка «Содержание котельной», колонка месяца'],</w:t>
+        <w:br/>
+        <w:t xml:space="preserve">    ['Цена Гкал без надбавки', '(Счёт − Сверхлимит факт)' + g + ' ÷ (Гкал по квартирным счётчикам + Остаток Гкал)'],</w:t>
+        <w:br/>
+        <w:t xml:space="preserve">    ['Цена 1 Гкал', 'Цена Гкал без надбавки + Надбавка к цене Гкал — платят квартиры со счётчиками за свои Гкал'],</w:t>
+        <w:br/>
+        <w:t xml:space="preserve">    ['Остаток Гкал', 'Норматив × (1 − ФСО − МЗК) − Гкал по квартирным счётчикам; если получается меньше 0 (счётчики ' +</w:t>
+        <w:br/>
+        <w:t xml:space="preserve">      'показали больше норматива) — Гкал по счётчикам ÷ Площадь со счётчиками × (Площадь без счётчиков + коэф. СПЧ × Площадь СПЧ)'],</w:t>
+        <w:br/>
+        <w:t xml:space="preserve">    ['Тариф без счётчика', '(Остаток Гкал × Цена Гкал без надбавки + Сверхлимит на квартиры без счётчиков) ÷ ' +</w:t>
+        <w:br/>
+        <w:t xml:space="preserve">      '(Площадь без счётчиков + коэф. СПЧ × Площадь СПЧ); для учёта по м²: ((Счёт − Сверхлимит факт)' + g +</w:t>
+        <w:br/>
+        <w:t xml:space="preserve">      ' + Сверхлимит на квартиры без счётчиков) ÷ (Площадь без счётчиков + коэф. СПЧ × Площадь СПЧ)'],</w:t>
+        <w:br/>
+        <w:t xml:space="preserve">    ['Тариф СПЧ', 'Тариф без счётчика × коэф. СПЧ'],</w:t>
+        <w:br/>
+        <w:t xml:space="preserve">    ['Квитанция без счётчика', 'Содержание котельной (+ ФСО+МЗК, грн/м²) + Тариф без счётчика — идёт по весам профиля'],</w:t>
+        <w:br/>
+        <w:t xml:space="preserve">    ['Начислено', 'Цена Гкал × Гкал по счётчикам + Тариф без счётчика × Площадь без счётчиков + Тариф СПЧ × Площадь СПЧ' +</w:t>
+        <w:br/>
+        <w:t xml:space="preserve">      (common ? ' + ФСО+МЗК грн/м² × Площадь итого' : '')],</w:t>
+        <w:br/>
+        <w:t xml:space="preserve">    ['Расхождение', 'Начислено − База (только округление тарифов до копеек)'],</w:t>
+        <w:br/>
+        <w:t xml:space="preserve">    ['Допуск', 'Допустимое расхождение из НАСТРОЕК + пол-копейки на каждый м² и Гкал']</w:t>
         <w:br/>
         <w:t xml:space="preserve">  ];</w:t>
         <w:br/>
-        <w:t xml:space="preserve">  var first = DETAILS_HEADER_ROW + 1;</w:t>
-        <w:br/>
-        <w:t xml:space="preserve">  var detailCount = result.rows.length;</w:t>
-        <w:br/>
-        <w:t xml:space="preserve">  // Блок сверки сверхлимита идёт после строк расчёта: пустая строка, заголовок блока, шапка, строки ЖК</w:t>
-        <w:br/>
-        <w:t xml:space="preserve">  var olTitleRow = first + detailCount + 1;</w:t>
-        <w:br/>
-        <w:t xml:space="preserve">  var olHeaderRow = olTitleRow + 1;</w:t>
-        <w:br/>
-        <w:t xml:space="preserve">  var olRowByObj = {};</w:t>
-        <w:br/>
-        <w:t xml:space="preserve">  result.overlimit.forEach(function (a, k) { olRowByObj[a.obj.name] = olHeaderRow + 1 + k; });</w:t>
-        <w:br/>
-        <w:t xml:space="preserve">  var formulaRows = [];</w:t>
-        <w:br/>
-        <w:br/>
-        <w:t xml:space="preserve">  result.rows.forEach(function (c, k) {</w:t>
-        <w:br/>
-        <w:t xml:space="preserve">    var r = first + k;</w:t>
-        <w:br/>
-        <w:t xml:space="preserve">    var values = [</w:t>
-        <w:br/>
-        <w:t xml:space="preserve">      c.month, c.objName, blank_(c.olFact), blank_(c.olSurcharge), blank_(c.olNoMeter), blank_(c.olAdd), blank_(c.base),</w:t>
-        <w:br/>
-        <w:t xml:space="preserve">      blank_(c.norm), c.normSrc, blank_(c.fsoMzk), blank_(c.tCommon), blank_(c.boiler), blank_(c.priceBase),</w:t>
-        <w:br/>
-        <w:t xml:space="preserve">      blank_(c.price), blank_(c.restGkal), blank_(c.tNo), blank_(c.tSpch),</w:t>
-        <w:br/>
-        <w:t xml:space="preserve">      c.tNo === null ? '' : round_((c.boilerTotal || 0) + c.tNo, P.digitsArea),</w:t>
-        <w:br/>
-        <w:t xml:space="preserve">      blank_(c.charged), blank_(c.diff), blank_(c.tol), c.status</w:t>
-        <w:br/>
-        <w:t xml:space="preserve">    ];</w:t>
-        <w:br/>
-        <w:t xml:space="preserve">    var f = detailFormulas_(c, cfg, r);</w:t>
-        <w:br/>
-        <w:t xml:space="preserve">    if (f) {</w:t>
-        <w:br/>
-        <w:t xml:space="preserve">      // Колонки F…U — формулами (пишутся отдельно через setFormulas), остальные — значениями</w:t>
-        <w:br/>
-        <w:t xml:space="preserve">      for (var j = DETAIL_FORMULA_FIRST_COL - 1; j &lt;= DETAIL_FORMULA_LAST_COL - 1; j++) values[j] = '';</w:t>
-        <w:br/>
-        <w:t xml:space="preserve">      formulaRows.push(f.slice(DETAIL_FORMULA_FIRST_COL - 1, DETAIL_FORMULA_LAST_COL).map(asFormula_));</w:t>
-        <w:br/>
-        <w:t xml:space="preserve">    } else {</w:t>
-        <w:br/>
-        <w:t xml:space="preserve">      formulaRows.push(null);</w:t>
-        <w:br/>
-        <w:t xml:space="preserve">    }</w:t>
-        <w:br/>
-        <w:t xml:space="preserve">    rows.push(fitRow_(values, W));</w:t>
-        <w:br/>
-        <w:t xml:space="preserve">  });</w:t>
-        <w:br/>
-        <w:t xml:space="preserve">  rows.push(fitRow_([], W));</w:t>
-        <w:br/>
-        <w:t xml:space="preserve">  rows.push(fitRow_(['СВЕРКА СВЕРХЛИМИТА ЗА СЕЗОН'], W));</w:t>
-        <w:br/>
-        <w:t xml:space="preserve">  rows.push(fitRow_(['ЖК', 'План на сезон, грн', 'Факт в счетах, грн', 'Сумма к разнесению, грн', 'Разнесено всего, грн']</w:t>
-        <w:br/>
-        <w:t xml:space="preserve">    .concat(SEASON_MONTHS).concat(['Март введён (сезон закрыт)', 'Надбавка к цене Гкал на сезон, грн/Гкал',</w:t>
-        <w:br/>
-        <w:t xml:space="preserve">      'Профиль применён к', 'Примечание']), W));</w:t>
-        <w:br/>
-        <w:t xml:space="preserve">  result.overlimit.forEach(function (a) {</w:t>
-        <w:br/>
-        <w:t xml:space="preserve">    var note = [];</w:t>
-        <w:br/>
-        <w:t xml:space="preserve">    if (a.estimated) note.push('невведённые месяцы оценены по профилю — добавки уточнятся с новыми счетами');</w:t>
-        <w:br/>
-        <w:t xml:space="preserve">    if (a.fallback) note.push('квитанцию посчитать нельзя (нет площадей / норматива), профиль взят по базе');</w:t>
-        <w:br/>
-        <w:t xml:space="preserve">    if (a.trueUp) note.push('март доведён до факта сезона');</w:t>
-        <w:br/>
-        <w:t xml:space="preserve">    if (!a.entered) note.push('нет введённых месяцев');</w:t>
-        <w:br/>
-        <w:t xml:space="preserve">    var r = olRowByObj[a.obj.name];</w:t>
-        <w:br/>
-        <w:t xml:space="preserve">    rows.push(fitRow_([a.obj.name, a.plan, a.factTotal, a.seasonAmount, a.allocated]</w:t>
-        <w:br/>
-        <w:t xml:space="preserve">      .concat(a.adds.map(blank_)).concat([a.complete ? 'Да' : 'Нет', blank_(a.flatSurcharge), a.target || '',</w:t>
-        <w:br/>
-        <w:t xml:space="preserve">        note.join('; ')]), W));</w:t>
-        <w:br/>
-        <w:t xml:space="preserve">  });</w:t>
-        <w:br/>
-        <w:t xml:space="preserve">  var lastRow = rows.length;</w:t>
-        <w:br/>
-        <w:t xml:space="preserve">  rows.push(fitRow_([], W));</w:t>
-        <w:br/>
-        <w:t xml:space="preserve">  var legendRow = rows.length + 1;</w:t>
-        <w:br/>
-        <w:t xml:space="preserve">  rows.push(fitRow_(['КАК СЧИТАЕТСЯ'], W));</w:t>
-        <w:br/>
-        <w:t xml:space="preserve">  detailLegend_(P).forEach(function (line) { rows.push(fitRow_(line, W)); });</w:t>
-        <w:br/>
-        <w:br/>
-        <w:t xml:space="preserve">  sheet.getRange(1, 1, rows.length, W).setValues(rows);</w:t>
-        <w:br/>
-        <w:t xml:space="preserve">  // Формулы пишем через setFormulas: так Google читает их в английском синтаксисе (запятые, точка)</w:t>
-        <w:br/>
-        <w:t xml:space="preserve">  // при любой локали таблицы. Через setValues формула разбиралась бы по правилам локали и ломалась.</w:t>
-        <w:br/>
-        <w:t xml:space="preserve">  formulaRows.forEach(function (fr, k) {</w:t>
-        <w:br/>
-        <w:t xml:space="preserve">    if (fr) sheet.getRange(first + k, DETAIL_FORMULA_FIRST_COL, 1, fr.length).setFormulas([fr]);</w:t>
-        <w:br/>
-        <w:t xml:space="preserve">  });</w:t>
-        <w:br/>
-        <w:t xml:space="preserve">  formatOutputHeader_(sheet, DETAILS_HEADER_ROW, W);</w:t>
-        <w:br/>
-        <w:br/>
-        <w:t xml:space="preserve">  if (detailCount) {</w:t>
-        <w:br/>
-        <w:t xml:space="preserve">    sheet.getRange(first, 3, detailCount, 1).setNumberFormat('#,##0.00');</w:t>
-        <w:br/>
-        <w:t xml:space="preserve">    sheet.getRange(first, 4, detailCount, 1).setNumberFormat('#,##0.00');</w:t>
-        <w:br/>
-        <w:t xml:space="preserve">    sheet.getRange(first, 5, detailCount, 3).setNumberFormat('#,##0.00');</w:t>
-        <w:br/>
-        <w:t xml:space="preserve">    sheet.getRange(first, 8, detailCount, 1).setNumberFormat('#,##0.0000');</w:t>
-        <w:br/>
-        <w:t xml:space="preserve">    sheet.getRange(first, 10, detailCount, 1).setNumberFormat('#,##0.00');</w:t>
-        <w:br/>
-        <w:t xml:space="preserve">    sheet.getRange(first, 11, detailCount, 2).setNumberFormat('0.0000');</w:t>
-        <w:br/>
-        <w:t xml:space="preserve">    sheet.getRange(first, 13, detailCount, 2).setNumberFormat('#,##0.00');</w:t>
-        <w:br/>
-        <w:t xml:space="preserve">    sheet.getRange(first, 15, detailCount, 1).setNumberFormat('#,##0.0000');</w:t>
-        <w:br/>
-        <w:t xml:space="preserve">    sheet.getRange(first, 16, detailCount, 3).setNumberFormat('0.00');</w:t>
-        <w:br/>
-        <w:t xml:space="preserve">    sheet.getRange(first, 19, detailCount, 3).setNumberFormat('#,##0.00');</w:t>
-        <w:br/>
-        <w:t xml:space="preserve">    paintStatus_(sheet, first, result.rows, W);</w:t>
-        <w:br/>
-        <w:t xml:space="preserve">  }</w:t>
-        <w:br/>
-        <w:t xml:space="preserve">  sheet.getRange(olTitleRow, 1).setFontWeight('bold').setFontSize(11);</w:t>
-        <w:br/>
-        <w:t xml:space="preserve">  sheet.getRange(olHeaderRow, 1, 1, 14).setFontWeight('bold').setBackground(COLOR_HEADER_BG).setWrap(true);</w:t>
-        <w:br/>
-        <w:t xml:space="preserve">  if (result.overlimit.length) {</w:t>
-        <w:br/>
-        <w:t xml:space="preserve">    sheet.getRange(olHeaderRow + 1, 2, result.overlimit.length, 9).setNumberFormat('#,##0.00');</w:t>
-        <w:br/>
-        <w:t xml:space="preserve">    sheet.getRange(olHeaderRow + 1, 12, result.overlimit.length, 1).setNumberFormat('#,##0.00');</w:t>
-        <w:br/>
-        <w:t xml:space="preserve">  }</w:t>
-        <w:br/>
-        <w:t xml:space="preserve">  sheet.getRange(legendRow, 1).setFontWeight('bold').setFontSize(11);</w:t>
-        <w:br/>
-        <w:t xml:space="preserve">  sheet.getRange(legendRow + 1, 1, rows.length - legendRow, 1).setFontWeight('bold');</w:t>
-        <w:br/>
-        <w:t xml:space="preserve">  sheet.setColumnWidths(1, W, 115);</w:t>
-        <w:br/>
-        <w:t xml:space="preserve">  sheet.setColumnWidth(W, 360);</w:t>
-        <w:br/>
         <w:t>}</w:t>
         <w:br/>
         <w:br/>
-        <w:t>/**</w:t>
-        <w:br/>
-        <w:t xml:space="preserve"> * Разделитель аргументов в формулах для локали таблицы: в русской, украинской и других локалях</w:t>
-        <w:br/>
-        <w:t xml:space="preserve"> * с десятичной запятой Google ждёт «;», в английской — «,».</w:t>
-        <w:br/>
-        <w:t xml:space="preserve"> */</w:t>
-        <w:br/>
-        <w:t>function formulaSeparator_(ss) {</w:t>
-        <w:br/>
-        <w:t xml:space="preserve">  var locale = String(ss.getSpreadsheetLocale() || '').toLowerCase();</w:t>
-        <w:br/>
-        <w:t xml:space="preserve">  var dotLocales = ['en', 'ja', 'zh', 'ko', 'th', 'he', 'iw', 'hi', 'ms', 'fil', 'ga', 'sw', 'ur', 'bn', 'ta', 'te'];</w:t>
-        <w:br/>
-        <w:t xml:space="preserve">  var lang = locale.split(/[_-]/)[0];</w:t>
-        <w:br/>
-        <w:t xml:space="preserve">  return dotLocales.indexOf(lang) &gt;= 0 ? ',' : ';';</w:t>
+        <w:t>function resetOutput_(sheet) {</w:t>
+        <w:br/>
+        <w:t xml:space="preserve">  sheet.clear();</w:t>
+        <w:br/>
+        <w:t xml:space="preserve">  sheet.clearConditionalFormatRules();</w:t>
+        <w:br/>
+        <w:t xml:space="preserve">  var dv = sheet.getDataRange();</w:t>
+        <w:br/>
+        <w:t xml:space="preserve">  dv.clearDataValidations();</w:t>
         <w:br/>
         <w:t>}</w:t>
         <w:br/>
         <w:br/>
-        <w:t>/** Значение ячейки как формула для setFormulas: текст → ="текст", число → =число. */</w:t>
-        <w:br/>
-        <w:t>function asFormula_(v) {</w:t>
-        <w:br/>
-        <w:t xml:space="preserve">  if (v === '' || v === null || v === undefined) return '';</w:t>
-        <w:br/>
-        <w:t xml:space="preserve">  if (typeof v === 'number') return '=' + v;</w:t>
-        <w:br/>
-        <w:t xml:space="preserve">  var s = String(v);</w:t>
-        <w:br/>
-        <w:t xml:space="preserve">  if (s.charAt(0) === '=') return s;</w:t>
-        <w:br/>
-        <w:t xml:space="preserve">  return '="' + s.replace(/"/g, '""') + '"';</w:t>
-        <w:br/>
-        <w:t>}</w:t>
-        <w:br/>
-        <w:br/>
-        <w:t>/** Ссылка на ячейку значения параметра на листе НАСТРОЙКИ, или null. */</w:t>
-        <w:br/>
-        <w:t>function settingRef_(cfg, key) {</w:t>
-        <w:br/>
-        <w:t xml:space="preserve">  var r = cfg.paramRow &amp;&amp; cfg.paramRow[key];</w:t>
-        <w:br/>
-        <w:t xml:space="preserve">  return r ? "'" + SHEET_SETTINGS + "'!$B$" + r : null;</w:t>
-        <w:br/>
-        <w:t>}</w:t>
-        <w:br/>
-        <w:br/>
-        <w:t>/**</w:t>
-        <w:br/>
-        <w:t xml:space="preserve"> * Строка ДЕТАЛЕЙ формулами: ссылки на ВВОД, НАСТРОЙКИ, смету и блок сверки сверхлимита.</w:t>
-        <w:br/>
-        <w:t xml:space="preserve"> * Для строк с ошибкой и когда адреса настроек неизвестны возвращает null — тогда пишутся числа.</w:t>
-        <w:br/>
-        <w:t xml:space="preserve"> */</w:t>
-        <w:br/>
-        <w:t>function detailFormulas_(c, cfg, r) {</w:t>
-        <w:br/>
-        <w:t xml:space="preserve">  if (c.errors.length || c.tNo === null) return null;</w:t>
-        <w:br/>
-        <w:t xml:space="preserve">  var keys = ['kcal', 'fso', 'mzk', 'kSpch', 'digitsArea', 'digitsPrice', 'tol'];</w:t>
-        <w:br/>
-        <w:t xml:space="preserve">  var S = {};</w:t>
-        <w:br/>
-        <w:t xml:space="preserve">  for (var k = 0; k &lt; keys.length; k++) {</w:t>
-        <w:br/>
-        <w:t xml:space="preserve">    S[keys[k]] = settingRef_(cfg, keys[k]);</w:t>
-        <w:br/>
-        <w:t xml:space="preserve">    if (!S[keys[k]]) return null;</w:t>
-        <w:br/>
-        <w:t xml:space="preserve">  }</w:t>
-        <w:br/>
-        <w:t xml:space="preserve">  var P = cfg.params;</w:t>
-        <w:br/>
-        <w:t xml:space="preserve">  var obj = c.obj;</w:t>
-        <w:br/>
-        <w:t xml:space="preserve">  var common = P.fsoMode === FSO_COMMON;</w:t>
-        <w:br/>
-        <w:t xml:space="preserve">  var sep = cfg.formulaSep || ','; // разделитель аргументов: «;» для локалей с десятичной запятой</w:t>
-        <w:br/>
-        <w:t xml:space="preserve">  var V = function (idx) { return "N('" + SHEET_INPUT + "'!" + indexToCol_(idx + 1) + c.rowNum + ')'; };</w:t>
-        <w:br/>
-        <w:t xml:space="preserve">  var share = '(1-' + S.fso + '-' + S.mzk + ')';</w:t>
-        <w:br/>
-        <w:t xml:space="preserve">  var gMul = common ? share + '*' : ''; // доля базы, идущая в газ</w:t>
-        <w:br/>
-        <w:t xml:space="preserve">  var billNoOl = "(N('" + SHEET_INPUT + "'!C" + c.rowNum + ')-C' + r + ')';</w:t>
-        <w:br/>
-        <w:t xml:space="preserve">  var denom = '(' + V(IN.AREA_NO) + '+' + S.kSpch + '*' + V(IN.AREA_SPCH) + ')';</w:t>
-        <w:br/>
-        <w:t xml:space="preserve">  var src = "='" + obj.sheetName.replace(/'/g, "''") + "'!" + indexToCol_(obj.novColIndex + c.monthIdx) + obj.rowValue;</w:t>
-        <w:br/>
-        <w:t xml:space="preserve">  var isArea = obj.type === TYPE_AREA;</w:t>
-        <w:br/>
-        <w:br/>
-        <w:t xml:space="preserve">  var norm = '';</w:t>
-        <w:br/>
-        <w:t xml:space="preserve">  if (c.gas &gt; 0) norm = '=' + V(IN.GAS) + '*' + S.kcal;</w:t>
-        <w:br/>
-        <w:t xml:space="preserve">  else if (c.gkalHouse &gt; 0) norm = '=' + V(IN.GKAL_HOUSE);</w:t>
-        <w:br/>
-        <w:br/>
-        <w:t xml:space="preserve">  var olAdd = isArea ? '=E' + r : '=N(D' + r + ')*' + V(IN.GKAL_METER) + '+E' + r;</w:t>
-        <w:br/>
-        <w:t xml:space="preserve">  if (common) olAdd = '=(' + olAdd.substring(1) + ')/' + share;</w:t>
-        <w:br/>
-        <w:br/>
-        <w:t xml:space="preserve">  var priceBase = '';</w:t>
-        <w:br/>
-        <w:t xml:space="preserve">  var price = '';</w:t>
-        <w:br/>
-        <w:t xml:space="preserve">  var rest = '';</w:t>
-        <w:br/>
-        <w:t xml:space="preserve">  var tNo;</w:t>
-        <w:br/>
-        <w:t xml:space="preserve">  if (isArea) {</w:t>
-        <w:br/>
-        <w:t xml:space="preserve">    tNo = '=ROUND((' + gMul + billNoOl + '+E' + r + ')/' + denom + sep + S.digitsArea + ')';</w:t>
-        <w:br/>
-        <w:t xml:space="preserve">  } else {</w:t>
-        <w:br/>
-        <w:t xml:space="preserve">    priceBase = '=' + gMul + billNoOl + '/(H' + r + '*' + share + ')';</w:t>
-        <w:br/>
-        <w:t xml:space="preserve">    price = '=ROUND(M' + r + '+N(D' + r + ')' + sep + S.digitsPrice + ')';</w:t>
-        <w:br/>
-        <w:t xml:space="preserve">    rest = '=H' + r + '*' + share + '-' + V(IN.GKAL_METER);</w:t>
-        <w:br/>
-        <w:t xml:space="preserve">    tNo = (c.areaNo || 0) + P.kSpch * (c.areaSpch || 0) &gt; 0</w:t>
-        <w:br/>
-        <w:t xml:space="preserve">      ? '=ROUND((O' + r + '*M' + r + '+E' + r + ')/' + denom + sep + S.digitsArea + ')'</w:t>
-        <w:br/>
-        <w:t xml:space="preserve">      : 0;</w:t>
-        <w:br/>
-        <w:t xml:space="preserve">  }</w:t>
-        <w:br/>
-        <w:t xml:space="preserve">  var tCommon = common ? '=ROUND(J' + r + '/' + V(IN.AREA_TOTAL) + sep + S.digitsArea + ')' : '';</w:t>
-        <w:br/>
-        <w:t xml:space="preserve">  var totalTerm = common ? '+N(K' + r + ')*' + V(IN.AREA_TOTAL) : '';</w:t>
-        <w:br/>
-        <w:t xml:space="preserve">  var tolArea = common ? V(IN.AREA_TOTAL) + '+' : '';</w:t>
-        <w:br/>
-        <w:t xml:space="preserve">  return [</w:t>
-        <w:br/>
-        <w:t xml:space="preserve">    c.month,                                                            // A</w:t>
-        <w:br/>
-        <w:t xml:space="preserve">    c.objName,                                                          // B</w:t>
-        <w:br/>
-        <w:t xml:space="preserve">    '=' + V(IN.OL),                                                     // C сверхлимит факт</w:t>
-        <w:br/>
-        <w:t xml:space="preserve">    blank_(c.olSurcharge),                                              // D надбавка, грн/Гкал (из расчёта)</w:t>
-        <w:br/>
-        <w:t xml:space="preserve">    blank_(c.olNoMeter),                                                // E на квартиры без счётчиков (из расчёта)</w:t>
-        <w:br/>
-        <w:t xml:space="preserve">    olAdd,                                                              // F отнесённый сверхлимит</w:t>
-        <w:br/>
-        <w:t xml:space="preserve">    "=N('" + SHEET_INPUT + "'!C" + c.rowNum + ')-C' + r + '+F' + r,    // G база</w:t>
-        <w:br/>
-        <w:t xml:space="preserve">    norm,                                                               // H норматив</w:t>
-        <w:br/>
-        <w:t xml:space="preserve">    c.normSrc,                                                          // I</w:t>
-        <w:br/>
-        <w:t xml:space="preserve">    '=G' + r + '*(' + S.fso + '+' + S.mzk + ')',                        // J ФСО+МЗК, грн</w:t>
-        <w:br/>
-        <w:t xml:space="preserve">    tCommon,                                                            // K ФСО+МЗК, грн/м²</w:t>
-        <w:br/>
-        <w:t xml:space="preserve">    src,                                                                // L содержание из сметы</w:t>
-        <w:br/>
-        <w:t xml:space="preserve">    priceBase,                                                          // M цена Гкал без надбавки</w:t>
-        <w:br/>
-        <w:t xml:space="preserve">    price,                                                              // N цена Гкал</w:t>
-        <w:br/>
-        <w:t xml:space="preserve">    rest,                                                               // O остаток Гкал</w:t>
-        <w:br/>
-        <w:t xml:space="preserve">    tNo,                                                                // P тариф без счётчика</w:t>
-        <w:br/>
-        <w:t xml:space="preserve">    '=ROUND(P' + r + '*' + S.kSpch + sep + S.digitsArea + ')',          // Q тариф СПЧ</w:t>
-        <w:br/>
-        <w:t xml:space="preserve">    '=ROUND(L' + r + '+N(K' + r + ')' + sep + S.digitsArea + ')+P' + r, // R квитанция без счётчика</w:t>
-        <w:br/>
-        <w:t xml:space="preserve">    '=N(N' + r + ')*' + V(IN.GKAL_METER) + '+P' + r + '*' + V(IN.AREA_NO) + '+Q' + r + '*' + V(IN.AREA_SPCH) + totalTerm, // S</w:t>
-        <w:br/>
-        <w:t xml:space="preserve">    '=S' + r + '-G' + r,                                                // T расхождение</w:t>
-        <w:br/>
-        <w:t xml:space="preserve">    '=' + S.tol + '+(1/2)*10^(-' + S.digitsArea + ')*(' + tolArea + V(IN.AREA_NO) + '+' + V(IN.AREA_SPCH) + ')+(1/2)*10^(-' +</w:t>
-        <w:br/>
-        <w:t xml:space="preserve">      S.digitsPrice + ')*' + V(IN.GKAL_METER),                          // U допуск</w:t>
-        <w:br/>
-        <w:t xml:space="preserve">    c.status                                                            // V</w:t>
-        <w:br/>
-        <w:t xml:space="preserve">  ];</w:t>
-        <w:br/>
-        <w:t>}</w:t>
-        <w:br/>
-        <w:br/>
-        <w:t>/** Пояснения к колонкам ДЕТАЛЕЙ словами. */</w:t>
-        <w:br/>
-        <w:t>function detailLegend_(P) {</w:t>
-        <w:br/>
-        <w:t xml:space="preserve">  var common = P.fsoMode === FSO_COMMON;</w:t>
-        <w:br/>
-        <w:t xml:space="preserve">  var g = common ? ' × (1 − ФСО − МЗК)' : '';</w:t>
-        <w:br/>
-        <w:t xml:space="preserve">  return [</w:t>
-        <w:br/>
-        <w:t xml:space="preserve">    ['Сверхлимит факт', 'из ВВОДа, колонка «в т.ч. сверхлимит в счёте»'],</w:t>
-        <w:br/>
-        <w:t xml:space="preserve">    ['Надбавка к цене Гкал', 'сверхлимит сезона' + g + ' ÷ все индивидуальные Гкал сезона — одинаковая во всех месяцах ' +</w:t>
-        <w:br/>
-        <w:t xml:space="preserve">      '(в режиме «базе распределения» — добавка месяца ÷ индивидуальные Гкал месяца)'],</w:t>
-        <w:br/>
-        <w:t xml:space="preserve">    ['Сверхлимит на квартиры без счётчиков', 'надбавка × остаток Гкал за сезон, разложенный по месяцам так, чтобы квитанция ' +</w:t>
-        <w:br/>
-        <w:t xml:space="preserve">      'без счётчика шла по весам профиля'],</w:t>
-        <w:br/>
-        <w:t xml:space="preserve">    ['Сверхлимит отнесённый', '(Надбавка × Гкал по квартирным счётчикам + Сверхлимит на квартиры без счётчиков)' +</w:t>
-        <w:br/>
-        <w:t xml:space="preserve">      (common ? ' ÷ (1 − ФСО − МЗК)' : '')],</w:t>
-        <w:br/>
-        <w:t xml:space="preserve">    ['База', 'Счёт поставщика − Сверхлимит факт + Сверхлимит отнесённый'],</w:t>
-        <w:br/>
-        <w:t xml:space="preserve">    ['Норматив, Гкал', 'Объём газа × коэффициент калорийности (для Гавайев — Гкал по общедомовому счётчику)'],</w:t>
-        <w:br/>
-        <w:t xml:space="preserve">    ['ФСО+МЗК, грн', 'База × (ФСО + МЗК)'],</w:t>
-        <w:br/>
-        <w:t xml:space="preserve">    ['ФСО+МЗК, грн/м²', common ? 'ФСО+МЗК, грн ÷ Площадь итого — прибавляется к содержанию котельной' :</w:t>
-        <w:br/>
-        <w:t xml:space="preserve">      'не считается: ФСО+МЗК входит в газовые тарифы пропорционально газу'],</w:t>
-        <w:br/>
-        <w:t xml:space="preserve">    ['Содержание из сметы', 'сезонный лист ЖК, строка «Содержание котельной», колонка месяца'],</w:t>
-        <w:br/>
-        <w:t xml:space="preserve">    ['Цена Гкал без надбавки', '(Счёт − Сверхлимит факт)' + g + ' ÷ (Норматив × (1 − ФСО − МЗК))'],</w:t>
-        <w:br/>
-        <w:t xml:space="preserve">    ['Цена 1 Гкал', 'Цена Гкал без надбавки + Надбавка к цене Гкал — платят квартиры со счётчиками за свои Гкал'],</w:t>
-        <w:br/>
-        <w:t xml:space="preserve">    ['Остаток Гкал', 'Норматив × (1 − ФСО − МЗК) − Гкал по квартирным счётчикам'],</w:t>
-        <w:br/>
-        <w:t xml:space="preserve">    ['Тариф без счётчика', '(Остаток Гкал × Цена Гкал без надбавки + Сверхлимит на квартиры без счётчиков) ÷ ' +</w:t>
-        <w:br/>
-        <w:t xml:space="preserve">      '(Площадь без счётчиков + коэф. СПЧ × Площадь СПЧ); для учёта по м²: ((Счёт − Сверхлимит факт)' + g +</w:t>
-        <w:br/>
-        <w:t xml:space="preserve">      ' + Сверхлимит на квартиры без счётчиков) ÷ (Площадь без счётчиков + коэф. СПЧ × Площадь СПЧ)'],</w:t>
-        <w:br/>
-        <w:t xml:space="preserve">    ['Тариф СПЧ', 'Тариф без счётчика × коэф. СПЧ'],</w:t>
-        <w:br/>
-        <w:t xml:space="preserve">    ['Квитанция без счётчика', 'Содержание котельной (+ ФСО+МЗК, грн/м²) + Тариф без счётчика — идёт по весам профиля'],</w:t>
-        <w:br/>
-        <w:t xml:space="preserve">    ['Начислено', 'Цена Гкал × Гкал по счётчикам + Тариф без счётчика × Площадь без счётчиков + Тариф СПЧ × Площадь СПЧ' +</w:t>
-        <w:br/>
-        <w:t xml:space="preserve">      (common ? ' + ФСО+МЗК грн/м² × Площадь итого' : '')],</w:t>
-        <w:br/>
-        <w:t xml:space="preserve">    ['Расхождение', 'Начислено − База (только округление тарифов до копеек)'],</w:t>
-        <w:br/>
-        <w:t xml:space="preserve">    ['Допуск', 'Допустимое расхождение из НАСТРОЕК + пол-копейки на каждый м² и Гкал']</w:t>
-        <w:br/>
-        <w:t xml:space="preserve">  ];</w:t>
-        <w:br/>
-        <w:t>}</w:t>
-        <w:br/>
-        <w:br/>
-        <w:t>function resetOutput_(sheet) {</w:t>
-        <w:br/>
-        <w:t xml:space="preserve">  sheet.clear();</w:t>
-        <w:br/>
-        <w:t xml:space="preserve">  sheet.clearConditionalFormatRules();</w:t>
-        <w:br/>
-        <w:t xml:space="preserve">  var dv = sheet.getDataRange();</w:t>
-        <w:br/>
-        <w:t xml:space="preserve">  dv.clearDataValidations();</w:t>
-        <w:br/>
-        <w:t>}</w:t>
-        <w:br/>
-        <w:br/>
         <w:t>function paintStatus_(sheet, firstRow, calcRows, W) {</w:t>
         <w:br/>
         <w:t xml:space="preserve">  var bgs = [];</w:t>
@@ -2863,15 +2987,17 @@
         <w:br/>
         <w:t xml:space="preserve">    var bad = c.errors.length &gt; 0;</w:t>
         <w:br/>
+        <w:t xml:space="preserve">    var warn = !bad &amp;&amp; c.warnings &amp;&amp; c.warnings.length &gt; 0;</w:t>
+        <w:br/>
         <w:t xml:space="preserve">    var bgRow = [];</w:t>
         <w:br/>
         <w:t xml:space="preserve">    var fontRow = [];</w:t>
         <w:br/>
         <w:t xml:space="preserve">    for (var i = 0; i &lt; W; i++) {</w:t>
         <w:br/>
-        <w:t xml:space="preserve">      bgRow.push(bad ? COLOR_ERROR_BG : '#ffffff');</w:t>
-        <w:br/>
-        <w:t xml:space="preserve">      fontRow.push(bad &amp;&amp; i === W - 1 ? COLOR_ERROR_FONT : (i === W - 1 ? '#38761d' : '#000000'));</w:t>
+        <w:t xml:space="preserve">      bgRow.push(bad ? COLOR_ERROR_BG : (warn &amp;&amp; i === W - 1 ? COLOR_WARN_BG : '#ffffff'));</w:t>
+        <w:br/>
+        <w:t xml:space="preserve">      fontRow.push(i !== W - 1 ? '#000000' : (bad ? COLOR_ERROR_FONT : (warn ? COLOR_WARN_FONT : '#38761d')));</w:t>
         <w:br/>
         <w:t xml:space="preserve">    }</w:t>
         <w:br/>

</xml_diff>